<commit_message>
docs: agrega el pantallazo de la interfaz de MLflow
Tercer y ultimo soporte que pedia el enunciado: la IP de la maquina visible
dentro de la interfaz de MLflow, no solo en la consola de AWS.

La captura entra como Figura 7 con un recorte de la barra de direcciones al
pie, porque a 6,2 pulgadas la URL completa queda ilegible y es justamente lo
que hay que poder leer. Se ve 3.224.107.117:5000, la misma IP publica de la
Figura 6.

La vista deja ademas el volumen de trabajo a la vista: el experimento
readmision-diabetes acumula 101 corridas de las dos familias, con
comparacion_balanceo y escenarios_bosque del bosque aleatorio, V5_final_prueba
de la regresion y la rejilla V6_rejilla_elasticnet desplegada en sus corridas
anidadas.

El reporte queda en nueve paginas de las diez permitidas.
</commit_message>
<xml_diff>
--- a/docs/entregas/Entrega-2-reporte.docx
+++ b/docs/entregas/Entrega-2-reporte.docx
@@ -4524,7 +4524,7 @@
     </w:p>
     <w:bookmarkEnd w:id="32"/>
     <w:bookmarkEnd w:id="33"/>
-    <w:bookmarkStart w:id="44" w:name="X6504ff5f78b3be7ab194d4ab13686aea2ba8194"/>
+    <w:bookmarkStart w:id="50" w:name="X6504ff5f78b3be7ab194d4ab13686aea2ba8194"/>
     <w:p>
       <w:pPr>
         <w:pStyle w:val="Heading1"/>
@@ -5024,7 +5024,306 @@
         <w:t xml:space="preserve">publica 3.224.107.117, la Elastic IP asociada y el usuario de la cuenta.</w:t>
       </w:r>
     </w:p>
-    <w:bookmarkEnd w:id="44"/>
+    <w:p>
+      <w:pPr>
+        <w:pStyle w:val="BodyText"/>
+      </w:pPr>
+      <w:r>
+        <w:drawing>
+          <wp:inline>
+            <wp:extent cx="5334000" cy="3017996"/>
+            <wp:effectExtent b="0" l="0" r="0" t="0"/>
+            <wp:docPr descr="" title="" id="45" name="Picture"/>
+            <a:graphic>
+              <a:graphicData uri="http://schemas.openxmlformats.org/drawingml/2006/picture">
+                <pic:pic>
+                  <pic:nvPicPr>
+                    <pic:cNvPr descr="figuras/entrega-2-mlflow-ui.png" id="46" name="Picture"/>
+                    <pic:cNvPicPr>
+                      <a:picLocks noChangeArrowheads="1" noChangeAspect="1"/>
+                    </pic:cNvPicPr>
+                  </pic:nvPicPr>
+                  <pic:blipFill>
+                    <a:blip r:embed="rId44"/>
+                    <a:stretch>
+                      <a:fillRect/>
+                    </a:stretch>
+                  </pic:blipFill>
+                  <pic:spPr bwMode="auto">
+                    <a:xfrm>
+                      <a:off x="0" y="0"/>
+                      <a:ext cx="5334000" cy="3017996"/>
+                    </a:xfrm>
+                    <a:prstGeom prst="rect">
+                      <a:avLst/>
+                    </a:prstGeom>
+                    <a:noFill/>
+                    <a:ln w="9525">
+                      <a:noFill/>
+                      <a:headEnd/>
+                      <a:tailEnd/>
+                    </a:ln>
+                  </pic:spPr>
+                </pic:pic>
+              </a:graphicData>
+            </a:graphic>
+          </wp:inline>
+        </w:drawing>
+      </w:r>
+    </w:p>
+    <w:p>
+      <w:pPr>
+        <w:pStyle w:val="BodyText"/>
+      </w:pPr>
+      <w:r>
+        <w:drawing>
+          <wp:inline>
+            <wp:extent cx="5334000" cy="132343"/>
+            <wp:effectExtent b="0" l="0" r="0" t="0"/>
+            <wp:docPr descr="" title="" id="48" name="Picture"/>
+            <a:graphic>
+              <a:graphicData uri="http://schemas.openxmlformats.org/drawingml/2006/picture">
+                <pic:pic>
+                  <pic:nvPicPr>
+                    <pic:cNvPr descr="figuras/entrega-2-mlflow-url.png" id="49" name="Picture"/>
+                    <pic:cNvPicPr>
+                      <a:picLocks noChangeArrowheads="1" noChangeAspect="1"/>
+                    </pic:cNvPicPr>
+                  </pic:nvPicPr>
+                  <pic:blipFill>
+                    <a:blip r:embed="rId47"/>
+                    <a:stretch>
+                      <a:fillRect/>
+                    </a:stretch>
+                  </pic:blipFill>
+                  <pic:spPr bwMode="auto">
+                    <a:xfrm>
+                      <a:off x="0" y="0"/>
+                      <a:ext cx="5334000" cy="132343"/>
+                    </a:xfrm>
+                    <a:prstGeom prst="rect">
+                      <a:avLst/>
+                    </a:prstGeom>
+                    <a:noFill/>
+                    <a:ln w="9525">
+                      <a:noFill/>
+                      <a:headEnd/>
+                      <a:tailEnd/>
+                    </a:ln>
+                  </pic:spPr>
+                </pic:pic>
+              </a:graphicData>
+            </a:graphic>
+          </wp:inline>
+        </w:drawing>
+      </w:r>
+    </w:p>
+    <w:p>
+      <w:pPr>
+        <w:pStyle w:val="BodyText"/>
+      </w:pPr>
+      <w:r>
+        <w:rPr>
+          <w:b/>
+          <w:bCs/>
+          <w:lang w:val="es"/>
+        </w:rPr>
+        <w:t xml:space="preserve">Figura 7.</w:t>
+      </w:r>
+      <w:r>
+        <w:rPr>
+          <w:lang w:val="es"/>
+        </w:rPr>
+        <w:t xml:space="preserve"> </w:t>
+      </w:r>
+      <w:r>
+        <w:rPr>
+          <w:lang w:val="es"/>
+        </w:rPr>
+        <w:t xml:space="preserve">Interfaz de MLflow servida desde la EC2, con detalle de la barra de</w:t>
+      </w:r>
+      <w:r>
+        <w:rPr>
+          <w:lang w:val="es"/>
+        </w:rPr>
+        <w:t xml:space="preserve"> </w:t>
+      </w:r>
+      <w:r>
+        <w:rPr>
+          <w:lang w:val="es"/>
+        </w:rPr>
+        <w:t xml:space="preserve">direcciones:</w:t>
+      </w:r>
+      <w:r>
+        <w:rPr>
+          <w:lang w:val="es"/>
+        </w:rPr>
+        <w:t xml:space="preserve"> </w:t>
+      </w:r>
+      <w:r>
+        <w:rPr>
+          <w:rStyle w:val="VerbatimChar"/>
+          <w:lang w:val="es"/>
+        </w:rPr>
+        <w:t xml:space="preserve">3.224.107.117:5000</w:t>
+      </w:r>
+      <w:r>
+        <w:rPr>
+          <w:lang w:val="es"/>
+        </w:rPr>
+        <w:t xml:space="preserve">, la misma IP publica de la Figura 6. El</w:t>
+      </w:r>
+      <w:r>
+        <w:rPr>
+          <w:lang w:val="es"/>
+        </w:rPr>
+        <w:t xml:space="preserve"> </w:t>
+      </w:r>
+      <w:r>
+        <w:rPr>
+          <w:lang w:val="es"/>
+        </w:rPr>
+        <w:t xml:space="preserve">experimento</w:t>
+      </w:r>
+      <w:r>
+        <w:rPr>
+          <w:lang w:val="es"/>
+        </w:rPr>
+        <w:t xml:space="preserve"> </w:t>
+      </w:r>
+      <w:r>
+        <w:rPr>
+          <w:rStyle w:val="VerbatimChar"/>
+          <w:lang w:val="es"/>
+        </w:rPr>
+        <w:t xml:space="preserve">readmision-diabetes</w:t>
+      </w:r>
+      <w:r>
+        <w:rPr>
+          <w:lang w:val="es"/>
+        </w:rPr>
+        <w:t xml:space="preserve"> </w:t>
+      </w:r>
+      <w:r>
+        <w:rPr>
+          <w:lang w:val="es"/>
+        </w:rPr>
+        <w:t xml:space="preserve">acumula 101 corridas de las dos familias:</w:t>
+      </w:r>
+      <w:r>
+        <w:rPr>
+          <w:lang w:val="es"/>
+        </w:rPr>
+        <w:t xml:space="preserve"> </w:t>
+      </w:r>
+      <w:r>
+        <w:rPr>
+          <w:rStyle w:val="VerbatimChar"/>
+          <w:lang w:val="es"/>
+        </w:rPr>
+        <w:t xml:space="preserve">comparacion_balanceo</w:t>
+      </w:r>
+      <w:r>
+        <w:rPr>
+          <w:lang w:val="es"/>
+        </w:rPr>
+        <w:t xml:space="preserve"> </w:t>
+      </w:r>
+      <w:r>
+        <w:rPr>
+          <w:lang w:val="es"/>
+        </w:rPr>
+        <w:t xml:space="preserve">y</w:t>
+      </w:r>
+      <w:r>
+        <w:rPr>
+          <w:lang w:val="es"/>
+        </w:rPr>
+        <w:t xml:space="preserve"> </w:t>
+      </w:r>
+      <w:r>
+        <w:rPr>
+          <w:rStyle w:val="VerbatimChar"/>
+          <w:lang w:val="es"/>
+        </w:rPr>
+        <w:t xml:space="preserve">escenarios_bosque</w:t>
+      </w:r>
+      <w:r>
+        <w:rPr>
+          <w:lang w:val="es"/>
+        </w:rPr>
+        <w:t xml:space="preserve"> </w:t>
+      </w:r>
+      <w:r>
+        <w:rPr>
+          <w:lang w:val="es"/>
+        </w:rPr>
+        <w:t xml:space="preserve">del bosque aleatorio,</w:t>
+      </w:r>
+      <w:r>
+        <w:rPr>
+          <w:lang w:val="es"/>
+        </w:rPr>
+        <w:t xml:space="preserve"> </w:t>
+      </w:r>
+      <w:r>
+        <w:rPr>
+          <w:rStyle w:val="VerbatimChar"/>
+          <w:lang w:val="es"/>
+        </w:rPr>
+        <w:t xml:space="preserve">V5_final_prueba</w:t>
+      </w:r>
+      <w:r>
+        <w:rPr>
+          <w:lang w:val="es"/>
+        </w:rPr>
+        <w:t xml:space="preserve"> </w:t>
+      </w:r>
+      <w:r>
+        <w:rPr>
+          <w:lang w:val="es"/>
+        </w:rPr>
+        <w:t xml:space="preserve">de la regresion y la rejilla</w:t>
+      </w:r>
+      <w:r>
+        <w:rPr>
+          <w:lang w:val="es"/>
+        </w:rPr>
+        <w:t xml:space="preserve"> </w:t>
+      </w:r>
+      <w:r>
+        <w:rPr>
+          <w:rStyle w:val="VerbatimChar"/>
+          <w:lang w:val="es"/>
+        </w:rPr>
+        <w:t xml:space="preserve">V6_rejilla_elasticnet</w:t>
+      </w:r>
+      <w:r>
+        <w:rPr>
+          <w:lang w:val="es"/>
+        </w:rPr>
+        <w:t xml:space="preserve"> </w:t>
+      </w:r>
+      <w:r>
+        <w:rPr>
+          <w:lang w:val="es"/>
+        </w:rPr>
+        <w:t xml:space="preserve">con sus</w:t>
+      </w:r>
+      <w:r>
+        <w:rPr>
+          <w:lang w:val="es"/>
+        </w:rPr>
+        <w:t xml:space="preserve"> </w:t>
+      </w:r>
+      <w:r>
+        <w:rPr>
+          <w:lang w:val="es"/>
+        </w:rPr>
+        <w:t xml:space="preserve">75 combinaciones como corridas anidadas.</w:t>
+      </w:r>
+    </w:p>
+    <w:bookmarkEnd w:id="50"/>
     <w:sectPr>
       <w:footnotePr>
         <w:numRestart w:val="eachSect"/>

</xml_diff>

<commit_message>
docs: unifica el reporte de trabajo en equipo dentro del reporte
El reporte de trabajo en equipo pasa a ser la seccion 6 del documento, como en
los reportes de ejemplo del curso, en vez de entregarse como archivo aparte.

El enunciado lo lista como entregable propio con tope de una pagina, asi que
las dos lecturas son defendibles. Con esta, el documento entero queda en diez
paginas y la seccion 6 arranca y termina en la decima, dentro del corte que se
califica.

El markdown sigue en dos archivos: el reporte y el de trabajo en equipo, que
ahora abre con el encabezado de seccion 6 y numera sus subsecciones 6.1 a 6.3.
Pandoc los concatena al exportar, de modo que no hay contenido duplicado en el
repositorio.

Se retira Entrega-2-trabajo-en-equipo.docx: su contenido vive dentro del
reporte.

Generacion:

    pandoc entrega-2-reporte.md entrega-2-trabajo-en-equipo.md \
      -o Entrega-2-reporte.docx --reference-doc=plantilla-reporte.docx \
      --resource-path=.
</commit_message>
<xml_diff>
--- a/docs/entregas/Entrega-2-reporte.docx
+++ b/docs/entregas/Entrega-2-reporte.docx
@@ -5324,6 +5324,1051 @@
       </w:r>
     </w:p>
     <w:bookmarkEnd w:id="50"/>
+    <w:bookmarkStart w:id="54" w:name="reporte-de-trabajo-en-equipo"/>
+    <w:p>
+      <w:pPr>
+        <w:pStyle w:val="Heading1"/>
+      </w:pPr>
+      <w:r>
+        <w:rPr>
+          <w:lang w:val="es"/>
+        </w:rPr>
+        <w:t xml:space="preserve">6. Reporte de trabajo en equipo</w:t>
+      </w:r>
+    </w:p>
+    <w:bookmarkStart w:id="51" w:name="como-nos-organizamos"/>
+    <w:p>
+      <w:pPr>
+        <w:pStyle w:val="Heading2"/>
+      </w:pPr>
+      <w:r>
+        <w:rPr>
+          <w:lang w:val="es"/>
+        </w:rPr>
+        <w:t xml:space="preserve">6.1 Como nos organizamos</w:t>
+      </w:r>
+    </w:p>
+    <w:p>
+      <w:pPr>
+        <w:pStyle w:val="FirstParagraph"/>
+      </w:pPr>
+      <w:r>
+        <w:rPr>
+          <w:lang w:val="es"/>
+        </w:rPr>
+        <w:t xml:space="preserve">El trabajo se reparte por</w:t>
+      </w:r>
+      <w:r>
+        <w:rPr>
+          <w:lang w:val="es"/>
+        </w:rPr>
+        <w:t xml:space="preserve"> </w:t>
+      </w:r>
+      <w:r>
+        <w:rPr>
+          <w:b/>
+          <w:bCs/>
+          <w:lang w:val="es"/>
+        </w:rPr>
+        <w:t xml:space="preserve">item de trabajo</w:t>
+      </w:r>
+      <w:r>
+        <w:rPr>
+          <w:lang w:val="es"/>
+        </w:rPr>
+        <w:t xml:space="preserve">, no por persona: cada item vive en</w:t>
+      </w:r>
+      <w:r>
+        <w:rPr>
+          <w:lang w:val="es"/>
+        </w:rPr>
+        <w:t xml:space="preserve"> </w:t>
+      </w:r>
+      <w:r>
+        <w:rPr>
+          <w:lang w:val="es"/>
+        </w:rPr>
+        <w:t xml:space="preserve">su propia rama</w:t>
+      </w:r>
+      <w:r>
+        <w:rPr>
+          <w:lang w:val="es"/>
+        </w:rPr>
+        <w:t xml:space="preserve"> </w:t>
+      </w:r>
+      <w:r>
+        <w:rPr>
+          <w:rStyle w:val="VerbatimChar"/>
+          <w:lang w:val="es"/>
+        </w:rPr>
+        <w:t xml:space="preserve">feature/*</w:t>
+      </w:r>
+      <w:r>
+        <w:rPr>
+          <w:lang w:val="es"/>
+        </w:rPr>
+        <w:t xml:space="preserve">, sale de</w:t>
+      </w:r>
+      <w:r>
+        <w:rPr>
+          <w:lang w:val="es"/>
+        </w:rPr>
+        <w:t xml:space="preserve"> </w:t>
+      </w:r>
+      <w:r>
+        <w:rPr>
+          <w:rStyle w:val="VerbatimChar"/>
+          <w:lang w:val="es"/>
+        </w:rPr>
+        <w:t xml:space="preserve">develop</w:t>
+      </w:r>
+      <w:r>
+        <w:rPr>
+          <w:lang w:val="es"/>
+        </w:rPr>
+        <w:t xml:space="preserve"> </w:t>
+      </w:r>
+      <w:r>
+        <w:rPr>
+          <w:lang w:val="es"/>
+        </w:rPr>
+        <w:t xml:space="preserve">y vuelve a</w:t>
+      </w:r>
+      <w:r>
+        <w:rPr>
+          <w:lang w:val="es"/>
+        </w:rPr>
+        <w:t xml:space="preserve"> </w:t>
+      </w:r>
+      <w:r>
+        <w:rPr>
+          <w:rStyle w:val="VerbatimChar"/>
+          <w:lang w:val="es"/>
+        </w:rPr>
+        <w:t xml:space="preserve">develop</w:t>
+      </w:r>
+      <w:r>
+        <w:rPr>
+          <w:lang w:val="es"/>
+        </w:rPr>
+        <w:t xml:space="preserve"> </w:t>
+      </w:r>
+      <w:r>
+        <w:rPr>
+          <w:lang w:val="es"/>
+        </w:rPr>
+        <w:t xml:space="preserve">mediante un</w:t>
+      </w:r>
+      <w:r>
+        <w:rPr>
+          <w:lang w:val="es"/>
+        </w:rPr>
+        <w:t xml:space="preserve"> </w:t>
+      </w:r>
+      <w:r>
+        <w:rPr>
+          <w:lang w:val="es"/>
+        </w:rPr>
+        <w:t xml:space="preserve">pull request con revision de al menos un companero. Los merges conservan el</w:t>
+      </w:r>
+      <w:r>
+        <w:rPr>
+          <w:lang w:val="es"/>
+        </w:rPr>
+        <w:t xml:space="preserve"> </w:t>
+      </w:r>
+      <w:r>
+        <w:rPr>
+          <w:lang w:val="es"/>
+        </w:rPr>
+        <w:t xml:space="preserve">historial completo, sin</w:t>
+      </w:r>
+      <w:r>
+        <w:rPr>
+          <w:lang w:val="es"/>
+        </w:rPr>
+        <w:t xml:space="preserve"> </w:t>
+      </w:r>
+      <w:r>
+        <w:rPr>
+          <w:i/>
+          <w:iCs/>
+          <w:lang w:val="es"/>
+        </w:rPr>
+        <w:t xml:space="preserve">squash</w:t>
+      </w:r>
+      <w:r>
+        <w:rPr>
+          <w:lang w:val="es"/>
+        </w:rPr>
+        <w:t xml:space="preserve"> </w:t>
+      </w:r>
+      <w:r>
+        <w:rPr>
+          <w:lang w:val="es"/>
+        </w:rPr>
+        <w:t xml:space="preserve">ni</w:t>
+      </w:r>
+      <w:r>
+        <w:rPr>
+          <w:lang w:val="es"/>
+        </w:rPr>
+        <w:t xml:space="preserve"> </w:t>
+      </w:r>
+      <w:r>
+        <w:rPr>
+          <w:i/>
+          <w:iCs/>
+          <w:lang w:val="es"/>
+        </w:rPr>
+        <w:t xml:space="preserve">rebase</w:t>
+      </w:r>
+      <w:r>
+        <w:rPr>
+          <w:lang w:val="es"/>
+        </w:rPr>
+        <w:t xml:space="preserve"> </w:t>
+      </w:r>
+      <w:r>
+        <w:rPr>
+          <w:lang w:val="es"/>
+        </w:rPr>
+        <w:t xml:space="preserve">que colapsen la autoria, de modo</w:t>
+      </w:r>
+      <w:r>
+        <w:rPr>
+          <w:lang w:val="es"/>
+        </w:rPr>
+        <w:t xml:space="preserve"> </w:t>
+      </w:r>
+      <w:r>
+        <w:rPr>
+          <w:lang w:val="es"/>
+        </w:rPr>
+        <w:t xml:space="preserve">que el aporte de cada integrante queda verificable en el repositorio.</w:t>
+      </w:r>
+      <w:r>
+        <w:rPr>
+          <w:lang w:val="es"/>
+        </w:rPr>
+        <w:t xml:space="preserve"> </w:t>
+      </w:r>
+      <w:r>
+        <w:rPr>
+          <w:rStyle w:val="VerbatimChar"/>
+          <w:lang w:val="es"/>
+        </w:rPr>
+        <w:t xml:space="preserve">main</w:t>
+      </w:r>
+      <w:r>
+        <w:rPr>
+          <w:lang w:val="es"/>
+        </w:rPr>
+        <w:t xml:space="preserve"> </w:t>
+      </w:r>
+      <w:r>
+        <w:rPr>
+          <w:lang w:val="es"/>
+        </w:rPr>
+        <w:t xml:space="preserve">conserva unicamente los estados integrados de la entrega. Entre el 14 de agosto</w:t>
+      </w:r>
+      <w:r>
+        <w:rPr>
+          <w:lang w:val="es"/>
+        </w:rPr>
+        <w:t xml:space="preserve"> </w:t>
+      </w:r>
+      <w:r>
+        <w:rPr>
+          <w:lang w:val="es"/>
+        </w:rPr>
+        <w:t xml:space="preserve">y el 6 de septiembre se abrieron 18 pull requests entre los dos repositorios, de</w:t>
+      </w:r>
+      <w:r>
+        <w:rPr>
+          <w:lang w:val="es"/>
+        </w:rPr>
+        <w:t xml:space="preserve"> </w:t>
+      </w:r>
+      <w:r>
+        <w:rPr>
+          <w:lang w:val="es"/>
+        </w:rPr>
+        <w:t xml:space="preserve">los cuales 17 se integraron.</w:t>
+      </w:r>
+    </w:p>
+    <w:p>
+      <w:pPr>
+        <w:pStyle w:val="BodyText"/>
+      </w:pPr>
+      <w:r>
+        <w:rPr>
+          <w:lang w:val="es"/>
+        </w:rPr>
+        <w:t xml:space="preserve">La revision interna se hace sobre el pull request antes de integrar: la del</w:t>
+      </w:r>
+      <w:r>
+        <w:rPr>
+          <w:lang w:val="es"/>
+        </w:rPr>
+        <w:t xml:space="preserve"> </w:t>
+      </w:r>
+      <w:r>
+        <w:rPr>
+          <w:lang w:val="es"/>
+        </w:rPr>
+        <w:t xml:space="preserve">modelo de regresion logistica identifico un archivo que no compilaba, un umbral</w:t>
+      </w:r>
+      <w:r>
+        <w:rPr>
+          <w:lang w:val="es"/>
+        </w:rPr>
+        <w:t xml:space="preserve"> </w:t>
+      </w:r>
+      <w:r>
+        <w:rPr>
+          <w:lang w:val="es"/>
+        </w:rPr>
+        <w:t xml:space="preserve">calibrado sobre un modelo distinto al final y una dependencia de orden de</w:t>
+      </w:r>
+      <w:r>
+        <w:rPr>
+          <w:lang w:val="es"/>
+        </w:rPr>
+        <w:t xml:space="preserve"> </w:t>
+      </w:r>
+      <w:r>
+        <w:rPr>
+          <w:lang w:val="es"/>
+        </w:rPr>
+        <w:t xml:space="preserve">ejecucion no documentada; los tres se corrigieron antes del merge.</w:t>
+      </w:r>
+    </w:p>
+    <w:bookmarkEnd w:id="51"/>
+    <w:bookmarkStart w:id="52" w:name="quien-hizo-que"/>
+    <w:p>
+      <w:pPr>
+        <w:pStyle w:val="Heading2"/>
+      </w:pPr>
+      <w:r>
+        <w:rPr>
+          <w:lang w:val="es"/>
+        </w:rPr>
+        <w:t xml:space="preserve">6.2 Quien hizo que</w:t>
+      </w:r>
+    </w:p>
+    <w:p>
+      <w:pPr>
+        <w:pStyle w:val="FirstParagraph"/>
+      </w:pPr>
+      <w:r>
+        <w:rPr>
+          <w:b/>
+          <w:bCs/>
+          <w:lang w:val="es"/>
+        </w:rPr>
+        <w:t xml:space="preserve">Camilo Rodriguez</w:t>
+      </w:r>
+      <w:r>
+        <w:rPr>
+          <w:lang w:val="es"/>
+        </w:rPr>
+        <w:t xml:space="preserve"> </w:t>
+      </w:r>
+      <w:r>
+        <w:rPr>
+          <w:lang w:val="es"/>
+        </w:rPr>
+        <w:t xml:space="preserve">— Modelo de regresion logistica. Preparacion de</w:t>
+      </w:r>
+      <w:r>
+        <w:rPr>
+          <w:lang w:val="es"/>
+        </w:rPr>
+        <w:t xml:space="preserve"> </w:t>
+      </w:r>
+      <w:r>
+        <w:rPr>
+          <w:lang w:val="es"/>
+        </w:rPr>
+        <w:t xml:space="preserve">caracteristicas, agrupacion de diagnosticos ICD-9, particion por paciente y las</w:t>
+      </w:r>
+      <w:r>
+        <w:rPr>
+          <w:lang w:val="es"/>
+        </w:rPr>
+        <w:t xml:space="preserve"> </w:t>
+      </w:r>
+      <w:r>
+        <w:rPr>
+          <w:lang w:val="es"/>
+        </w:rPr>
+        <w:t xml:space="preserve">seis versiones del modelo: base, balanceo de clases, regularizacion, peso de la</w:t>
+      </w:r>
+      <w:r>
+        <w:rPr>
+          <w:lang w:val="es"/>
+        </w:rPr>
+        <w:t xml:space="preserve"> </w:t>
+      </w:r>
+      <w:r>
+        <w:rPr>
+          <w:lang w:val="es"/>
+        </w:rPr>
+        <w:t xml:space="preserve">clase positiva, ajuste de umbral y Elastic Net. Evaluacion con ROC-AUC, PR-AUC,</w:t>
+      </w:r>
+      <w:r>
+        <w:rPr>
+          <w:lang w:val="es"/>
+        </w:rPr>
+        <w:t xml:space="preserve"> </w:t>
+      </w:r>
+      <w:r>
+        <w:rPr>
+          <w:lang w:val="es"/>
+        </w:rPr>
+        <w:t xml:space="preserve">recall, F1/F2 y matriz de confusion, mas el analisis de priorizacion por</w:t>
+      </w:r>
+      <w:r>
+        <w:rPr>
+          <w:lang w:val="es"/>
+        </w:rPr>
+        <w:t xml:space="preserve"> </w:t>
+      </w:r>
+      <w:r>
+        <w:rPr>
+          <w:lang w:val="es"/>
+        </w:rPr>
+        <w:t xml:space="preserve">capacidad. Redacto las secciones de modelos y de conclusiones del reporte.</w:t>
+      </w:r>
+      <w:r>
+        <w:rPr>
+          <w:lang w:val="es"/>
+        </w:rPr>
+        <w:t xml:space="preserve"> </w:t>
+      </w:r>
+      <w:r>
+        <w:rPr>
+          <w:i/>
+          <w:iCs/>
+          <w:lang w:val="es"/>
+        </w:rPr>
+        <w:t xml:space="preserve">Evidencia: ramas</w:t>
+      </w:r>
+      <w:r>
+        <w:rPr>
+          <w:i/>
+          <w:iCs/>
+          <w:lang w:val="es"/>
+        </w:rPr>
+        <w:t xml:space="preserve"> </w:t>
+      </w:r>
+      <w:r>
+        <w:rPr>
+          <w:rStyle w:val="VerbatimChar"/>
+          <w:i/>
+          <w:iCs/>
+          <w:lang w:val="es"/>
+        </w:rPr>
+        <w:t xml:space="preserve">feature/camilo-validacion-entrega1</w:t>
+      </w:r>
+      <w:r>
+        <w:rPr>
+          <w:i/>
+          <w:iCs/>
+          <w:lang w:val="es"/>
+        </w:rPr>
+        <w:t xml:space="preserve"> </w:t>
+      </w:r>
+      <w:r>
+        <w:rPr>
+          <w:i/>
+          <w:iCs/>
+          <w:lang w:val="es"/>
+        </w:rPr>
+        <w:t xml:space="preserve">y</w:t>
+      </w:r>
+      <w:r>
+        <w:rPr>
+          <w:i/>
+          <w:iCs/>
+          <w:lang w:val="es"/>
+        </w:rPr>
+        <w:t xml:space="preserve"> </w:t>
+      </w:r>
+      <w:r>
+        <w:rPr>
+          <w:rStyle w:val="VerbatimChar"/>
+          <w:i/>
+          <w:iCs/>
+          <w:lang w:val="es"/>
+        </w:rPr>
+        <w:t xml:space="preserve">feature/camilo-regresion-entrega2</w:t>
+      </w:r>
+      <w:r>
+        <w:rPr>
+          <w:i/>
+          <w:iCs/>
+          <w:lang w:val="es"/>
+        </w:rPr>
+        <w:t xml:space="preserve">, pull requests #1 y #4.</w:t>
+      </w:r>
+    </w:p>
+    <w:p>
+      <w:pPr>
+        <w:pStyle w:val="BodyText"/>
+      </w:pPr>
+      <w:r>
+        <w:rPr>
+          <w:b/>
+          <w:bCs/>
+          <w:lang w:val="es"/>
+        </w:rPr>
+        <w:t xml:space="preserve">Leonardo Almanza</w:t>
+      </w:r>
+      <w:r>
+        <w:rPr>
+          <w:lang w:val="es"/>
+        </w:rPr>
+        <w:t xml:space="preserve"> </w:t>
+      </w:r>
+      <w:r>
+        <w:rPr>
+          <w:lang w:val="es"/>
+        </w:rPr>
+        <w:t xml:space="preserve">— Modelo de bosque aleatorio. Conjunto de modelamiento a</w:t>
+      </w:r>
+      <w:r>
+        <w:rPr>
+          <w:lang w:val="es"/>
+        </w:rPr>
+        <w:t xml:space="preserve"> </w:t>
+      </w:r>
+      <w:r>
+        <w:rPr>
+          <w:lang w:val="es"/>
+        </w:rPr>
+        <w:t xml:space="preserve">partir de las decisiones del EDA, particion y validacion cruzada agrupadas por</w:t>
+      </w:r>
+      <w:r>
+        <w:rPr>
+          <w:lang w:val="es"/>
+        </w:rPr>
+        <w:t xml:space="preserve"> </w:t>
+      </w:r>
+      <w:r>
+        <w:rPr>
+          <w:lang w:val="es"/>
+        </w:rPr>
+        <w:t xml:space="preserve">paciente, comparacion de siete tecnicas de desbalance, cuatro escenarios de</w:t>
+      </w:r>
+      <w:r>
+        <w:rPr>
+          <w:lang w:val="es"/>
+        </w:rPr>
+        <w:t xml:space="preserve"> </w:t>
+      </w:r>
+      <w:r>
+        <w:rPr>
+          <w:lang w:val="es"/>
+        </w:rPr>
+        <w:t xml:space="preserve">hiperparametros del arbol, seleccion de caracteristicas por importancia de</w:t>
+      </w:r>
+      <w:r>
+        <w:rPr>
+          <w:lang w:val="es"/>
+        </w:rPr>
+        <w:t xml:space="preserve"> </w:t>
+      </w:r>
+      <w:r>
+        <w:rPr>
+          <w:lang w:val="es"/>
+        </w:rPr>
+        <w:t xml:space="preserve">permutacion y evaluacion con calibracion, en cuaderno ejecutado.</w:t>
+      </w:r>
+      <w:r>
+        <w:rPr>
+          <w:lang w:val="es"/>
+        </w:rPr>
+        <w:t xml:space="preserve"> </w:t>
+      </w:r>
+      <w:r>
+        <w:rPr>
+          <w:i/>
+          <w:iCs/>
+          <w:lang w:val="es"/>
+        </w:rPr>
+        <w:t xml:space="preserve">Evidencia: rama</w:t>
+      </w:r>
+      <w:r>
+        <w:rPr>
+          <w:i/>
+          <w:iCs/>
+          <w:lang w:val="es"/>
+        </w:rPr>
+        <w:t xml:space="preserve"> </w:t>
+      </w:r>
+      <w:r>
+        <w:rPr>
+          <w:rStyle w:val="VerbatimChar"/>
+          <w:i/>
+          <w:iCs/>
+          <w:lang w:val="es"/>
+        </w:rPr>
+        <w:t xml:space="preserve">features/trees-random-boost-la</w:t>
+      </w:r>
+      <w:r>
+        <w:rPr>
+          <w:i/>
+          <w:iCs/>
+          <w:lang w:val="es"/>
+        </w:rPr>
+        <w:t xml:space="preserve">, pull request #6.</w:t>
+      </w:r>
+    </w:p>
+    <w:p>
+      <w:pPr>
+        <w:pStyle w:val="BodyText"/>
+      </w:pPr>
+      <w:r>
+        <w:rPr>
+          <w:b/>
+          <w:bCs/>
+          <w:lang w:val="es"/>
+        </w:rPr>
+        <w:t xml:space="preserve">Rainer Solano</w:t>
+      </w:r>
+      <w:r>
+        <w:rPr>
+          <w:lang w:val="es"/>
+        </w:rPr>
+        <w:t xml:space="preserve"> </w:t>
+      </w:r>
+      <w:r>
+        <w:rPr>
+          <w:lang w:val="es"/>
+        </w:rPr>
+        <w:t xml:space="preserve">— Arquitectura de la solucion: documento</w:t>
+      </w:r>
+      <w:r>
+        <w:rPr>
+          <w:lang w:val="es"/>
+        </w:rPr>
+        <w:t xml:space="preserve"> </w:t>
+      </w:r>
+      <w:r>
+        <w:rPr>
+          <w:rStyle w:val="VerbatimChar"/>
+          <w:lang w:val="es"/>
+        </w:rPr>
+        <w:t xml:space="preserve">INFRA-V-0.0.1.md</w:t>
+      </w:r>
+      <w:r>
+        <w:rPr>
+          <w:lang w:val="es"/>
+        </w:rPr>
+        <w:t xml:space="preserve"> </w:t>
+      </w:r>
+      <w:r>
+        <w:rPr>
+          <w:lang w:val="es"/>
+        </w:rPr>
+        <w:t xml:space="preserve">con la propuesta de infraestructura y los diagramas de desarrollo y produccion.</w:t>
+      </w:r>
+      <w:r>
+        <w:rPr>
+          <w:lang w:val="es"/>
+        </w:rPr>
+        <w:t xml:space="preserve"> </w:t>
+      </w:r>
+      <w:r>
+        <w:rPr>
+          <w:lang w:val="es"/>
+        </w:rPr>
+        <w:t xml:space="preserve">Arquitectura de software del tablero: estructura modular de vistas, componentes</w:t>
+      </w:r>
+      <w:r>
+        <w:rPr>
+          <w:lang w:val="es"/>
+        </w:rPr>
+        <w:t xml:space="preserve"> </w:t>
+      </w:r>
+      <w:r>
+        <w:rPr>
+          <w:lang w:val="es"/>
+        </w:rPr>
+        <w:t xml:space="preserve">y servicios, diseno del CSS, traduccion de la maqueta HTML a Streamlit y</w:t>
+      </w:r>
+      <w:r>
+        <w:rPr>
+          <w:lang w:val="es"/>
+        </w:rPr>
+        <w:t xml:space="preserve"> </w:t>
+      </w:r>
+      <w:r>
+        <w:rPr>
+          <w:lang w:val="es"/>
+        </w:rPr>
+        <w:t xml:space="preserve">despliegue en Railway para validacion inicial. Redacto la seccion del tablero</w:t>
+      </w:r>
+      <w:r>
+        <w:rPr>
+          <w:lang w:val="es"/>
+        </w:rPr>
+        <w:t xml:space="preserve"> </w:t>
+      </w:r>
+      <w:r>
+        <w:rPr>
+          <w:lang w:val="es"/>
+        </w:rPr>
+        <w:t xml:space="preserve">del reporte.</w:t>
+      </w:r>
+      <w:r>
+        <w:rPr>
+          <w:lang w:val="es"/>
+        </w:rPr>
+        <w:t xml:space="preserve"> </w:t>
+      </w:r>
+      <w:r>
+        <w:rPr>
+          <w:i/>
+          <w:iCs/>
+          <w:lang w:val="es"/>
+        </w:rPr>
+        <w:t xml:space="preserve">Evidencia: rama</w:t>
+      </w:r>
+      <w:r>
+        <w:rPr>
+          <w:i/>
+          <w:iCs/>
+          <w:lang w:val="es"/>
+        </w:rPr>
+        <w:t xml:space="preserve"> </w:t>
+      </w:r>
+      <w:r>
+        <w:rPr>
+          <w:rStyle w:val="VerbatimChar"/>
+          <w:i/>
+          <w:iCs/>
+          <w:lang w:val="es"/>
+        </w:rPr>
+        <w:t xml:space="preserve">feature/infra-delivery-baseline-arq</w:t>
+      </w:r>
+      <w:r>
+        <w:rPr>
+          <w:i/>
+          <w:iCs/>
+          <w:lang w:val="es"/>
+        </w:rPr>
+        <w:t xml:space="preserve">, pull requests #3 y #10 en</w:t>
+      </w:r>
+      <w:r>
+        <w:rPr>
+          <w:i/>
+          <w:iCs/>
+          <w:lang w:val="es"/>
+        </w:rPr>
+        <w:t xml:space="preserve"> </w:t>
+      </w:r>
+      <w:r>
+        <w:rPr>
+          <w:rStyle w:val="VerbatimChar"/>
+          <w:i/>
+          <w:iCs/>
+          <w:lang w:val="es"/>
+        </w:rPr>
+        <w:t xml:space="preserve">-api</w:t>
+      </w:r>
+      <w:r>
+        <w:rPr>
+          <w:i/>
+          <w:iCs/>
+          <w:lang w:val="es"/>
+        </w:rPr>
+        <w:t xml:space="preserve"> </w:t>
+      </w:r>
+      <w:r>
+        <w:rPr>
+          <w:i/>
+          <w:iCs/>
+          <w:lang w:val="es"/>
+        </w:rPr>
+        <w:t xml:space="preserve">y pull request #1 en</w:t>
+      </w:r>
+      <w:r>
+        <w:rPr>
+          <w:i/>
+          <w:iCs/>
+          <w:lang w:val="es"/>
+        </w:rPr>
+        <w:t xml:space="preserve"> </w:t>
+      </w:r>
+      <w:r>
+        <w:rPr>
+          <w:rStyle w:val="VerbatimChar"/>
+          <w:i/>
+          <w:iCs/>
+          <w:lang w:val="es"/>
+        </w:rPr>
+        <w:t xml:space="preserve">-ui</w:t>
+      </w:r>
+      <w:r>
+        <w:rPr>
+          <w:i/>
+          <w:iCs/>
+          <w:lang w:val="es"/>
+        </w:rPr>
+        <w:t xml:space="preserve">.</w:t>
+      </w:r>
+    </w:p>
+    <w:p>
+      <w:pPr>
+        <w:pStyle w:val="BodyText"/>
+      </w:pPr>
+      <w:r>
+        <w:rPr>
+          <w:b/>
+          <w:bCs/>
+          <w:lang w:val="es"/>
+        </w:rPr>
+        <w:t xml:space="preserve">Katerine Arias</w:t>
+      </w:r>
+      <w:r>
+        <w:rPr>
+          <w:lang w:val="es"/>
+        </w:rPr>
+        <w:t xml:space="preserve"> </w:t>
+      </w:r>
+      <w:r>
+        <w:rPr>
+          <w:lang w:val="es"/>
+        </w:rPr>
+        <w:t xml:space="preserve">— Infraestructura de seguimiento de experimentos y coordinacion</w:t>
+      </w:r>
+      <w:r>
+        <w:rPr>
+          <w:lang w:val="es"/>
+        </w:rPr>
+        <w:t xml:space="preserve"> </w:t>
+      </w:r>
+      <w:r>
+        <w:rPr>
+          <w:lang w:val="es"/>
+        </w:rPr>
+        <w:t xml:space="preserve">de las entregas. Servidor de MLflow sobre AWS EC2 con autenticacion, apagado</w:t>
+      </w:r>
+      <w:r>
+        <w:rPr>
+          <w:lang w:val="es"/>
+        </w:rPr>
+        <w:t xml:space="preserve"> </w:t>
+      </w:r>
+      <w:r>
+        <w:rPr>
+          <w:lang w:val="es"/>
+        </w:rPr>
+        <w:t xml:space="preserve">automatico por inactividad y control de costo; usuarios de acceso para el equipo;</w:t>
+      </w:r>
+      <w:r>
+        <w:rPr>
+          <w:lang w:val="es"/>
+        </w:rPr>
+        <w:t xml:space="preserve"> </w:t>
+      </w:r>
+      <w:r>
+        <w:rPr>
+          <w:lang w:val="es"/>
+        </w:rPr>
+        <w:t xml:space="preserve">registro de los experimentos de regresion logistica; figuras del reporte desde</w:t>
+      </w:r>
+      <w:r>
+        <w:rPr>
+          <w:lang w:val="es"/>
+        </w:rPr>
+        <w:t xml:space="preserve"> </w:t>
+      </w:r>
+      <w:r>
+        <w:rPr>
+          <w:lang w:val="es"/>
+        </w:rPr>
+        <w:t xml:space="preserve">MLflow; separacion del repositorio en codigo y tablero. Consolidacion del reporte.</w:t>
+      </w:r>
+      <w:r>
+        <w:rPr>
+          <w:lang w:val="es"/>
+        </w:rPr>
+        <w:t xml:space="preserve"> </w:t>
+      </w:r>
+      <w:r>
+        <w:rPr>
+          <w:i/>
+          <w:iCs/>
+          <w:lang w:val="es"/>
+        </w:rPr>
+        <w:t xml:space="preserve">Evidencia: ramas</w:t>
+      </w:r>
+      <w:r>
+        <w:rPr>
+          <w:i/>
+          <w:iCs/>
+          <w:lang w:val="es"/>
+        </w:rPr>
+        <w:t xml:space="preserve"> </w:t>
+      </w:r>
+      <w:r>
+        <w:rPr>
+          <w:rStyle w:val="VerbatimChar"/>
+          <w:i/>
+          <w:iCs/>
+          <w:lang w:val="es"/>
+        </w:rPr>
+        <w:t xml:space="preserve">feature/infra-mlflow-ec2</w:t>
+      </w:r>
+      <w:r>
+        <w:rPr>
+          <w:i/>
+          <w:iCs/>
+          <w:lang w:val="es"/>
+        </w:rPr>
+        <w:t xml:space="preserve">,</w:t>
+      </w:r>
+      <w:r>
+        <w:rPr>
+          <w:i/>
+          <w:iCs/>
+          <w:lang w:val="es"/>
+        </w:rPr>
+        <w:t xml:space="preserve"> </w:t>
+      </w:r>
+      <w:r>
+        <w:rPr>
+          <w:rStyle w:val="VerbatimChar"/>
+          <w:i/>
+          <w:iCs/>
+          <w:lang w:val="es"/>
+        </w:rPr>
+        <w:t xml:space="preserve">feature/mlflow-experimentos</w:t>
+      </w:r>
+      <w:r>
+        <w:rPr>
+          <w:i/>
+          <w:iCs/>
+          <w:lang w:val="es"/>
+        </w:rPr>
+        <w:t xml:space="preserve">,</w:t>
+      </w:r>
+      <w:r>
+        <w:rPr>
+          <w:i/>
+          <w:iCs/>
+          <w:lang w:val="es"/>
+        </w:rPr>
+        <w:t xml:space="preserve"> </w:t>
+      </w:r>
+      <w:r>
+        <w:rPr>
+          <w:rStyle w:val="VerbatimChar"/>
+          <w:i/>
+          <w:iCs/>
+          <w:lang w:val="es"/>
+        </w:rPr>
+        <w:t xml:space="preserve">feature/reporte-entrega-2</w:t>
+      </w:r>
+      <w:r>
+        <w:rPr>
+          <w:i/>
+          <w:iCs/>
+          <w:lang w:val="es"/>
+        </w:rPr>
+        <w:t xml:space="preserve">, pull requests #5, #7 y #8.</w:t>
+      </w:r>
+    </w:p>
+    <w:bookmarkEnd w:id="52"/>
+    <w:bookmarkStart w:id="53" w:name="como-discutimos-los-resultados"/>
+    <w:p>
+      <w:pPr>
+        <w:pStyle w:val="Heading2"/>
+      </w:pPr>
+      <w:r>
+        <w:rPr>
+          <w:lang w:val="es"/>
+        </w:rPr>
+        <w:t xml:space="preserve">6.3 Como discutimos los resultados</w:t>
+      </w:r>
+    </w:p>
+    <w:p>
+      <w:pPr>
+        <w:pStyle w:val="FirstParagraph"/>
+      </w:pPr>
+      <w:r>
+        <w:rPr>
+          <w:lang w:val="es"/>
+        </w:rPr>
+        <w:t xml:space="preserve">Las dos familias de modelos se desarrollaron en paralelo y por separado, y</w:t>
+      </w:r>
+      <w:r>
+        <w:rPr>
+          <w:lang w:val="es"/>
+        </w:rPr>
+        <w:t xml:space="preserve"> </w:t>
+      </w:r>
+      <w:r>
+        <w:rPr>
+          <w:lang w:val="es"/>
+        </w:rPr>
+        <w:t xml:space="preserve">llegaron de forma independiente a la misma conclusion: ninguna tecnica de</w:t>
+      </w:r>
+      <w:r>
+        <w:rPr>
+          <w:lang w:val="es"/>
+        </w:rPr>
+        <w:t xml:space="preserve"> </w:t>
+      </w:r>
+      <w:r>
+        <w:rPr>
+          <w:lang w:val="es"/>
+        </w:rPr>
+        <w:t xml:space="preserve">balanceo ni ajuste de hiperparametros mejora la separacion entre clases; todas</w:t>
+      </w:r>
+      <w:r>
+        <w:rPr>
+          <w:lang w:val="es"/>
+        </w:rPr>
+        <w:t xml:space="preserve"> </w:t>
+      </w:r>
+      <w:r>
+        <w:rPr>
+          <w:lang w:val="es"/>
+        </w:rPr>
+        <w:t xml:space="preserve">reubican el punto de operacion sobre la misma curva. Que dos personas lo</w:t>
+      </w:r>
+      <w:r>
+        <w:rPr>
+          <w:lang w:val="es"/>
+        </w:rPr>
+        <w:t xml:space="preserve"> </w:t>
+      </w:r>
+      <w:r>
+        <w:rPr>
+          <w:lang w:val="es"/>
+        </w:rPr>
+        <w:t xml:space="preserve">encontraran por caminos distintos le da mas peso al hallazgo que si fuera</w:t>
+      </w:r>
+      <w:r>
+        <w:rPr>
+          <w:lang w:val="es"/>
+        </w:rPr>
+        <w:t xml:space="preserve"> </w:t>
+      </w:r>
+      <w:r>
+        <w:rPr>
+          <w:lang w:val="es"/>
+        </w:rPr>
+        <w:t xml:space="preserve">resultado de un solo experimento.</w:t>
+      </w:r>
+    </w:p>
+    <w:bookmarkEnd w:id="53"/>
+    <w:bookmarkEnd w:id="54"/>
     <w:sectPr>
       <w:footnotePr>
         <w:numRestart w:val="eachSect"/>

</xml_diff>

<commit_message>
docs: agrega las fuentes de modelos y tablero, y separa el trabajo en equipo
El enunciado de la Entrega 2 pide como entregables las fuentes de los modelos
desarrollados y las del tablero. El reporte solo enlazaba los repositorios, sin
indicar donde vive cada pieza: se agregan las secciones 5.1 y 5.2 con la ruta
de cada modulo en los dos repositorios.

Tambien pide dejar la maquina de EC2 con MLflow detenida y no terminada. Se
deja constancia del estado en docs/soportes/ec2-mlflow-detenida.txt y se cita
en el pie de la Figura 6.

Con esas secciones el documento unificado pasaba a 11 paginas y la segunda
mitad del reporte de trabajo en equipo quedaba fuera del limite calificable.
Se separa en su propio documento, como los lista el enunciado: reporte de 10
paginas y trabajo en equipo de 1.
</commit_message>
<xml_diff>
--- a/docs/entregas/Entrega-2-reporte.docx
+++ b/docs/entregas/Entrega-2-reporte.docx
@@ -4524,7 +4524,7 @@
     </w:p>
     <w:bookmarkEnd w:id="32"/>
     <w:bookmarkEnd w:id="33"/>
-    <w:bookmarkStart w:id="50" w:name="X6504ff5f78b3be7ab194d4ab13686aea2ba8194"/>
+    <w:bookmarkStart w:id="53" w:name="Xab65d49d92a4c2f732c896b26a18bd0c75c5038"/>
     <w:p>
       <w:pPr>
         <w:pStyle w:val="Heading1"/>
@@ -4533,7 +4533,7 @@
         <w:rPr>
           <w:lang w:val="es"/>
         </w:rPr>
-        <w:t xml:space="preserve">5. Repositorios y soporte de los experimentos</w:t>
+        <w:t xml:space="preserve">5. Fuentes, repositorios y soporte de los experimentos</w:t>
       </w:r>
     </w:p>
     <w:p>
@@ -4580,7 +4580,111 @@
         <w:rPr>
           <w:lang w:val="es"/>
         </w:rPr>
-        <w:t xml:space="preserve">puede hablar con la API por HTTP.</w:t>
+        <w:t xml:space="preserve">puede hablar con la API por HTTP. El historial de commits de cada integrante se</w:t>
+      </w:r>
+      <w:r>
+        <w:rPr>
+          <w:lang w:val="es"/>
+        </w:rPr>
+        <w:t xml:space="preserve"> </w:t>
+      </w:r>
+      <w:r>
+        <w:rPr>
+          <w:lang w:val="es"/>
+        </w:rPr>
+        <w:t xml:space="preserve">consulta en</w:t>
+      </w:r>
+      <w:r>
+        <w:rPr>
+          <w:lang w:val="es"/>
+        </w:rPr>
+        <w:t xml:space="preserve"> </w:t>
+      </w:r>
+      <w:hyperlink r:id="rId34">
+        <w:r>
+          <w:rPr>
+            <w:rStyle w:val="Hyperlink"/>
+            <w:lang w:val="es"/>
+          </w:rPr>
+          <w:t xml:space="preserve">el repositorio principal</w:t>
+        </w:r>
+      </w:hyperlink>
+      <w:r>
+        <w:rPr>
+          <w:lang w:val="es"/>
+        </w:rPr>
+        <w:t xml:space="preserve"> </w:t>
+      </w:r>
+      <w:r>
+        <w:rPr>
+          <w:lang w:val="es"/>
+        </w:rPr>
+        <w:t xml:space="preserve">y en</w:t>
+      </w:r>
+      <w:r>
+        <w:rPr>
+          <w:lang w:val="es"/>
+        </w:rPr>
+        <w:t xml:space="preserve"> </w:t>
+      </w:r>
+      <w:hyperlink r:id="rId35">
+        <w:r>
+          <w:rPr>
+            <w:rStyle w:val="Hyperlink"/>
+            <w:lang w:val="es"/>
+          </w:rPr>
+          <w:t xml:space="preserve">el del tablero</w:t>
+        </w:r>
+      </w:hyperlink>
+      <w:r>
+        <w:rPr>
+          <w:lang w:val="es"/>
+        </w:rPr>
+        <w:t xml:space="preserve">.</w:t>
+      </w:r>
+    </w:p>
+    <w:bookmarkStart w:id="37" w:name="fuentes-de-los-modelos-desarrollados"/>
+    <w:p>
+      <w:pPr>
+        <w:pStyle w:val="Heading2"/>
+      </w:pPr>
+      <w:r>
+        <w:rPr>
+          <w:lang w:val="es"/>
+        </w:rPr>
+        <w:t xml:space="preserve">5.1 Fuentes de los modelos desarrollados</w:t>
+      </w:r>
+    </w:p>
+    <w:p>
+      <w:pPr>
+        <w:pStyle w:val="FirstParagraph"/>
+      </w:pPr>
+      <w:r>
+        <w:rPr>
+          <w:lang w:val="es"/>
+        </w:rPr>
+        <w:t xml:space="preserve">En</w:t>
+      </w:r>
+      <w:r>
+        <w:rPr>
+          <w:lang w:val="es"/>
+        </w:rPr>
+        <w:t xml:space="preserve"> </w:t>
+      </w:r>
+      <w:hyperlink r:id="rId36">
+        <w:r>
+          <w:rPr>
+            <w:rStyle w:val="Hyperlink"/>
+            <w:lang w:val="es"/>
+          </w:rPr>
+          <w:t xml:space="preserve">maia-pds-microproyecto-api</w:t>
+        </w:r>
+      </w:hyperlink>
+      <w:r>
+        <w:rPr>
+          <w:lang w:val="es"/>
+        </w:rPr>
+        <w:t xml:space="preserve">:</w:t>
       </w:r>
     </w:p>
     <w:tbl>
@@ -4608,7 +4712,7 @@
               <w:rPr>
                 <w:lang w:val="es"/>
               </w:rPr>
-              <w:t xml:space="preserve">Repositorio</w:t>
+              <w:t xml:space="preserve">Ruta</w:t>
             </w:r>
           </w:p>
         </w:tc>
@@ -4634,28 +4738,26 @@
             <w:pPr>
               <w:pStyle w:val="Compact"/>
             </w:pPr>
-            <w:hyperlink r:id="rId34">
-              <w:r>
-                <w:rPr>
-                  <w:rStyle w:val="Hyperlink"/>
-                  <w:lang w:val="es"/>
-                </w:rPr>
-                <w:t xml:space="preserve">maia-pds-microproyecto-api</w:t>
-              </w:r>
-            </w:hyperlink>
-          </w:p>
-        </w:tc>
-        <w:tc>
-          <w:tcPr/>
-          <w:p>
-            <w:pPr>
-              <w:pStyle w:val="Compact"/>
-            </w:pPr>
-            <w:r>
-              <w:rPr>
-                <w:lang w:val="es"/>
-              </w:rPr>
-              <w:t xml:space="preserve">Datos versionados con DVC, pipelines de procesamiento y entrenamiento, experimentos de MLflow, modelos y la API que los sirve</w:t>
+            <w:r>
+              <w:rPr>
+                <w:rStyle w:val="VerbatimChar"/>
+                <w:lang w:val="es"/>
+              </w:rPr>
+              <w:t xml:space="preserve">src/features/</w:t>
+            </w:r>
+          </w:p>
+        </w:tc>
+        <w:tc>
+          <w:tcPr/>
+          <w:p>
+            <w:pPr>
+              <w:pStyle w:val="Compact"/>
+            </w:pPr>
+            <w:r>
+              <w:rPr>
+                <w:lang w:val="es"/>
+              </w:rPr>
+              <w:t xml:space="preserve">Base analitica y matriz de diseno</w:t>
             </w:r>
           </w:p>
         </w:tc>
@@ -4667,95 +4769,712 @@
             <w:pPr>
               <w:pStyle w:val="Compact"/>
             </w:pPr>
-            <w:hyperlink r:id="rId35">
-              <w:r>
-                <w:rPr>
-                  <w:rStyle w:val="Hyperlink"/>
-                  <w:lang w:val="es"/>
-                </w:rPr>
-                <w:t xml:space="preserve">maia-pds-microproyecto-ui</w:t>
-              </w:r>
-            </w:hyperlink>
-          </w:p>
-        </w:tc>
-        <w:tc>
-          <w:tcPr/>
-          <w:p>
-            <w:pPr>
-              <w:pStyle w:val="Compact"/>
-            </w:pPr>
-            <w:r>
-              <w:rPr>
-                <w:lang w:val="es"/>
-              </w:rPr>
-              <w:t xml:space="preserve">Fuentes del tablero y sus artefactos de despliegue</w:t>
+            <w:r>
+              <w:rPr>
+                <w:rStyle w:val="VerbatimChar"/>
+                <w:lang w:val="es"/>
+              </w:rPr>
+              <w:t xml:space="preserve">src/models/particion.py</w:t>
+            </w:r>
+          </w:p>
+        </w:tc>
+        <w:tc>
+          <w:tcPr/>
+          <w:p>
+            <w:pPr>
+              <w:pStyle w:val="Compact"/>
+            </w:pPr>
+            <w:r>
+              <w:rPr>
+                <w:lang w:val="es"/>
+              </w:rPr>
+              <w:t xml:space="preserve">Particion por paciente, sin pacientes compartidos entre conjuntos</w:t>
+            </w:r>
+          </w:p>
+        </w:tc>
+      </w:tr>
+      <w:tr>
+        <w:tc>
+          <w:tcPr/>
+          <w:p>
+            <w:pPr>
+              <w:pStyle w:val="Compact"/>
+            </w:pPr>
+            <w:r>
+              <w:rPr>
+                <w:rStyle w:val="VerbatimChar"/>
+                <w:lang w:val="es"/>
+              </w:rPr>
+              <w:t xml:space="preserve">src/models/regresion_logistica.py</w:t>
+            </w:r>
+            <w:r>
+              <w:rPr>
+                <w:lang w:val="es"/>
+              </w:rPr>
+              <w:t xml:space="preserve">,</w:t>
+            </w:r>
+            <w:r>
+              <w:rPr>
+                <w:lang w:val="es"/>
+              </w:rPr>
+              <w:t xml:space="preserve"> </w:t>
+            </w:r>
+            <w:r>
+              <w:rPr>
+                <w:rStyle w:val="VerbatimChar"/>
+                <w:lang w:val="es"/>
+              </w:rPr>
+              <w:t xml:space="preserve">busqueda.py</w:t>
+            </w:r>
+            <w:r>
+              <w:rPr>
+                <w:lang w:val="es"/>
+              </w:rPr>
+              <w:t xml:space="preserve">,</w:t>
+            </w:r>
+            <w:r>
+              <w:rPr>
+                <w:lang w:val="es"/>
+              </w:rPr>
+              <w:t xml:space="preserve"> </w:t>
+            </w:r>
+            <w:r>
+              <w:rPr>
+                <w:rStyle w:val="VerbatimChar"/>
+                <w:lang w:val="es"/>
+              </w:rPr>
+              <w:t xml:space="preserve">regresion_v6.py</w:t>
+            </w:r>
+            <w:r>
+              <w:rPr>
+                <w:lang w:val="es"/>
+              </w:rPr>
+              <w:t xml:space="preserve">,</w:t>
+            </w:r>
+            <w:r>
+              <w:rPr>
+                <w:lang w:val="es"/>
+              </w:rPr>
+              <w:t xml:space="preserve"> </w:t>
+            </w:r>
+            <w:r>
+              <w:rPr>
+                <w:rStyle w:val="VerbatimChar"/>
+                <w:lang w:val="es"/>
+              </w:rPr>
+              <w:t xml:space="preserve">optimizar_recall.py</w:t>
+            </w:r>
+          </w:p>
+        </w:tc>
+        <w:tc>
+          <w:tcPr/>
+          <w:p>
+            <w:pPr>
+              <w:pStyle w:val="Compact"/>
+            </w:pPr>
+            <w:r>
+              <w:rPr>
+                <w:lang w:val="es"/>
+              </w:rPr>
+              <w:t xml:space="preserve">Versiones V1 a V6 de la regresion, rejillas de hiperparametros y ajuste de umbral</w:t>
+            </w:r>
+          </w:p>
+        </w:tc>
+      </w:tr>
+      <w:tr>
+        <w:tc>
+          <w:tcPr/>
+          <w:p>
+            <w:pPr>
+              <w:pStyle w:val="Compact"/>
+            </w:pPr>
+            <w:r>
+              <w:rPr>
+                <w:rStyle w:val="VerbatimChar"/>
+                <w:lang w:val="es"/>
+              </w:rPr>
+              <w:t xml:space="preserve">src/models/escenarios.py</w:t>
+            </w:r>
+            <w:r>
+              <w:rPr>
+                <w:lang w:val="es"/>
+              </w:rPr>
+              <w:t xml:space="preserve">,</w:t>
+            </w:r>
+            <w:r>
+              <w:rPr>
+                <w:lang w:val="es"/>
+              </w:rPr>
+              <w:t xml:space="preserve"> </w:t>
+            </w:r>
+            <w:r>
+              <w:rPr>
+                <w:rStyle w:val="VerbatimChar"/>
+                <w:lang w:val="es"/>
+              </w:rPr>
+              <w:t xml:space="preserve">balanceo.py</w:t>
+            </w:r>
+          </w:p>
+        </w:tc>
+        <w:tc>
+          <w:tcPr/>
+          <w:p>
+            <w:pPr>
+              <w:pStyle w:val="Compact"/>
+            </w:pPr>
+            <w:r>
+              <w:rPr>
+                <w:lang w:val="es"/>
+              </w:rPr>
+              <w:t xml:space="preserve">Los cuatro escenarios del bosque aleatorio y las siete tecnicas de desbalance</w:t>
+            </w:r>
+          </w:p>
+        </w:tc>
+      </w:tr>
+      <w:tr>
+        <w:tc>
+          <w:tcPr/>
+          <w:p>
+            <w:pPr>
+              <w:pStyle w:val="Compact"/>
+            </w:pPr>
+            <w:r>
+              <w:rPr>
+                <w:rStyle w:val="VerbatimChar"/>
+                <w:lang w:val="es"/>
+              </w:rPr>
+              <w:t xml:space="preserve">src/models/metricas.py</w:t>
+            </w:r>
+            <w:r>
+              <w:rPr>
+                <w:lang w:val="es"/>
+              </w:rPr>
+              <w:t xml:space="preserve">,</w:t>
+            </w:r>
+            <w:r>
+              <w:rPr>
+                <w:lang w:val="es"/>
+              </w:rPr>
+              <w:t xml:space="preserve"> </w:t>
+            </w:r>
+            <w:r>
+              <w:rPr>
+                <w:rStyle w:val="VerbatimChar"/>
+                <w:lang w:val="es"/>
+              </w:rPr>
+              <w:t xml:space="preserve">evaluacion_priorizacion.py</w:t>
+            </w:r>
+          </w:p>
+        </w:tc>
+        <w:tc>
+          <w:tcPr/>
+          <w:p>
+            <w:pPr>
+              <w:pStyle w:val="Compact"/>
+            </w:pPr>
+            <w:r>
+              <w:rPr>
+                <w:lang w:val="es"/>
+              </w:rPr>
+              <w:t xml:space="preserve">Metricas comunes a las dos familias y analisis de lift por capacidad</w:t>
+            </w:r>
+          </w:p>
+        </w:tc>
+      </w:tr>
+      <w:tr>
+        <w:tc>
+          <w:tcPr/>
+          <w:p>
+            <w:pPr>
+              <w:pStyle w:val="Compact"/>
+            </w:pPr>
+            <w:r>
+              <w:rPr>
+                <w:rStyle w:val="VerbatimChar"/>
+                <w:lang w:val="es"/>
+              </w:rPr>
+              <w:t xml:space="preserve">src/models/experimentos_mlflow.py</w:t>
+            </w:r>
+          </w:p>
+        </w:tc>
+        <w:tc>
+          <w:tcPr/>
+          <w:p>
+            <w:pPr>
+              <w:pStyle w:val="Compact"/>
+            </w:pPr>
+            <w:r>
+              <w:rPr>
+                <w:lang w:val="es"/>
+              </w:rPr>
+              <w:t xml:space="preserve">Registro de corridas contra el servidor de MLflow en EC2</w:t>
+            </w:r>
+          </w:p>
+        </w:tc>
+      </w:tr>
+      <w:tr>
+        <w:tc>
+          <w:tcPr/>
+          <w:p>
+            <w:pPr>
+              <w:pStyle w:val="Compact"/>
+            </w:pPr>
+            <w:r>
+              <w:rPr>
+                <w:rStyle w:val="VerbatimChar"/>
+                <w:lang w:val="es"/>
+              </w:rPr>
+              <w:t xml:space="preserve">notebooks/modelos.ipynb</w:t>
+            </w:r>
+          </w:p>
+        </w:tc>
+        <w:tc>
+          <w:tcPr/>
+          <w:p>
+            <w:pPr>
+              <w:pStyle w:val="Compact"/>
+            </w:pPr>
+            <w:r>
+              <w:rPr>
+                <w:lang w:val="es"/>
+              </w:rPr>
+              <w:t xml:space="preserve">Cuaderno ejecutado del bosque aleatorio</w:t>
+            </w:r>
+          </w:p>
+        </w:tc>
+      </w:tr>
+      <w:tr>
+        <w:tc>
+          <w:tcPr/>
+          <w:p>
+            <w:pPr>
+              <w:pStyle w:val="Compact"/>
+            </w:pPr>
+            <w:r>
+              <w:rPr>
+                <w:rStyle w:val="VerbatimChar"/>
+                <w:lang w:val="es"/>
+              </w:rPr>
+              <w:t xml:space="preserve">docs/soportes/modelos/</w:t>
+            </w:r>
+          </w:p>
+        </w:tc>
+        <w:tc>
+          <w:tcPr/>
+          <w:p>
+            <w:pPr>
+              <w:pStyle w:val="Compact"/>
+            </w:pPr>
+            <w:r>
+              <w:rPr>
+                <w:lang w:val="es"/>
+              </w:rPr>
+              <w:t xml:space="preserve">Metricas de cada version en CSV</w:t>
             </w:r>
           </w:p>
         </w:tc>
       </w:tr>
     </w:tbl>
+    <w:bookmarkEnd w:id="37"/>
+    <w:bookmarkStart w:id="39" w:name="fuentes-del-tablero-desarrollado"/>
     <w:p>
       <w:pPr>
-        <w:pStyle w:val="BodyText"/>
-      </w:pPr>
-      <w:r>
-        <w:rPr>
-          <w:lang w:val="es"/>
-        </w:rPr>
-        <w:t xml:space="preserve">El historial de commits de cada integrante se consulta en</w:t>
-      </w:r>
-      <w:r>
-        <w:rPr>
-          <w:lang w:val="es"/>
-        </w:rPr>
-        <w:t xml:space="preserve"> </w:t>
-      </w:r>
-      <w:hyperlink r:id="rId36">
+        <w:pStyle w:val="Heading2"/>
+      </w:pPr>
+      <w:r>
+        <w:rPr>
+          <w:lang w:val="es"/>
+        </w:rPr>
+        <w:t xml:space="preserve">5.2 Fuentes del tablero desarrollado</w:t>
+      </w:r>
+    </w:p>
+    <w:p>
+      <w:pPr>
+        <w:pStyle w:val="FirstParagraph"/>
+      </w:pPr>
+      <w:r>
+        <w:rPr>
+          <w:lang w:val="es"/>
+        </w:rPr>
+        <w:t xml:space="preserve">En</w:t>
+      </w:r>
+      <w:r>
+        <w:rPr>
+          <w:lang w:val="es"/>
+        </w:rPr>
+        <w:t xml:space="preserve"> </w:t>
+      </w:r>
+      <w:hyperlink r:id="rId38">
         <w:r>
           <w:rPr>
             <w:rStyle w:val="Hyperlink"/>
             <w:lang w:val="es"/>
           </w:rPr>
-          <w:t xml:space="preserve">el repositorio principal</w:t>
+          <w:t xml:space="preserve">maia-pds-microproyecto-ui</w:t>
         </w:r>
       </w:hyperlink>
       <w:r>
         <w:rPr>
           <w:lang w:val="es"/>
         </w:rPr>
-        <w:t xml:space="preserve"> </w:t>
-      </w:r>
-      <w:r>
-        <w:rPr>
-          <w:lang w:val="es"/>
-        </w:rPr>
-        <w:t xml:space="preserve">y en</w:t>
-      </w:r>
-      <w:r>
-        <w:rPr>
-          <w:lang w:val="es"/>
-        </w:rPr>
-        <w:t xml:space="preserve"> </w:t>
-      </w:r>
-      <w:hyperlink r:id="rId37">
-        <w:r>
-          <w:rPr>
-            <w:rStyle w:val="Hyperlink"/>
-            <w:lang w:val="es"/>
-          </w:rPr>
-          <w:t xml:space="preserve">el del tablero</w:t>
-        </w:r>
-      </w:hyperlink>
-      <w:r>
-        <w:rPr>
-          <w:lang w:val="es"/>
-        </w:rPr>
-        <w:t xml:space="preserve">.</w:t>
+        <w:t xml:space="preserve">:</w:t>
+      </w:r>
+    </w:p>
+    <w:tbl>
+      <w:tblPr>
+        <w:tblStyle w:val="Table"/>
+        <w:tblW w:type="pct" w:w="5000"/>
+        <w:tblLayout w:type="fixed"/>
+        <w:tblLook w:firstRow="1" w:lastRow="0" w:firstColumn="0" w:lastColumn="0" w:noHBand="0" w:noVBand="0" w:val="0020"/>
+      </w:tblPr>
+      <w:tblGrid>
+        <w:gridCol w:w="3960"/>
+        <w:gridCol w:w="3960"/>
+      </w:tblGrid>
+      <w:tr>
+        <w:trPr>
+          <w:tblHeader w:val="on"/>
+        </w:trPr>
+        <w:tc>
+          <w:tcPr/>
+          <w:p>
+            <w:pPr>
+              <w:pStyle w:val="Compact"/>
+            </w:pPr>
+            <w:r>
+              <w:rPr>
+                <w:lang w:val="es"/>
+              </w:rPr>
+              <w:t xml:space="preserve">Ruta</w:t>
+            </w:r>
+          </w:p>
+        </w:tc>
+        <w:tc>
+          <w:tcPr/>
+          <w:p>
+            <w:pPr>
+              <w:pStyle w:val="Compact"/>
+            </w:pPr>
+            <w:r>
+              <w:rPr>
+                <w:lang w:val="es"/>
+              </w:rPr>
+              <w:t xml:space="preserve">Contenido</w:t>
+            </w:r>
+          </w:p>
+        </w:tc>
+      </w:tr>
+      <w:tr>
+        <w:tc>
+          <w:tcPr/>
+          <w:p>
+            <w:pPr>
+              <w:pStyle w:val="Compact"/>
+            </w:pPr>
+            <w:r>
+              <w:rPr>
+                <w:rStyle w:val="VerbatimChar"/>
+                <w:lang w:val="es"/>
+              </w:rPr>
+              <w:t xml:space="preserve">app.py</w:t>
+            </w:r>
+            <w:r>
+              <w:rPr>
+                <w:lang w:val="es"/>
+              </w:rPr>
+              <w:t xml:space="preserve">,</w:t>
+            </w:r>
+            <w:r>
+              <w:rPr>
+                <w:lang w:val="es"/>
+              </w:rPr>
+              <w:t xml:space="preserve"> </w:t>
+            </w:r>
+            <w:r>
+              <w:rPr>
+                <w:rStyle w:val="VerbatimChar"/>
+                <w:lang w:val="es"/>
+              </w:rPr>
+              <w:t xml:space="preserve">config/</w:t>
+            </w:r>
+          </w:p>
+        </w:tc>
+        <w:tc>
+          <w:tcPr/>
+          <w:p>
+            <w:pPr>
+              <w:pStyle w:val="Compact"/>
+            </w:pPr>
+            <w:r>
+              <w:rPr>
+                <w:lang w:val="es"/>
+              </w:rPr>
+              <w:t xml:space="preserve">Punto de entrada, navegacion y tema</w:t>
+            </w:r>
+          </w:p>
+        </w:tc>
+      </w:tr>
+      <w:tr>
+        <w:tc>
+          <w:tcPr/>
+          <w:p>
+            <w:pPr>
+              <w:pStyle w:val="Compact"/>
+            </w:pPr>
+            <w:r>
+              <w:rPr>
+                <w:rStyle w:val="VerbatimChar"/>
+                <w:lang w:val="es"/>
+              </w:rPr>
+              <w:t xml:space="preserve">views/</w:t>
+            </w:r>
+          </w:p>
+        </w:tc>
+        <w:tc>
+          <w:tcPr/>
+          <w:p>
+            <w:pPr>
+              <w:pStyle w:val="Compact"/>
+            </w:pPr>
+            <w:r>
+              <w:rPr>
+                <w:rStyle w:val="VerbatimChar"/>
+                <w:lang w:val="es"/>
+              </w:rPr>
+              <w:t xml:space="preserve">priorizacion.py</w:t>
+            </w:r>
+            <w:r>
+              <w:rPr>
+                <w:lang w:val="es"/>
+              </w:rPr>
+              <w:t xml:space="preserve">,</w:t>
+            </w:r>
+            <w:r>
+              <w:rPr>
+                <w:lang w:val="es"/>
+              </w:rPr>
+              <w:t xml:space="preserve"> </w:t>
+            </w:r>
+            <w:r>
+              <w:rPr>
+                <w:rStyle w:val="VerbatimChar"/>
+                <w:lang w:val="es"/>
+              </w:rPr>
+              <w:t xml:space="preserve">paciente.py</w:t>
+            </w:r>
+            <w:r>
+              <w:rPr>
+                <w:lang w:val="es"/>
+              </w:rPr>
+              <w:t xml:space="preserve"> </w:t>
+            </w:r>
+            <w:r>
+              <w:rPr>
+                <w:lang w:val="es"/>
+              </w:rPr>
+              <w:t xml:space="preserve">y</w:t>
+            </w:r>
+            <w:r>
+              <w:rPr>
+                <w:lang w:val="es"/>
+              </w:rPr>
+              <w:t xml:space="preserve"> </w:t>
+            </w:r>
+            <w:r>
+              <w:rPr>
+                <w:rStyle w:val="VerbatimChar"/>
+                <w:lang w:val="es"/>
+              </w:rPr>
+              <w:t xml:space="preserve">contexto.py</w:t>
+            </w:r>
+            <w:r>
+              <w:rPr>
+                <w:lang w:val="es"/>
+              </w:rPr>
+              <w:t xml:space="preserve">: una vista por pantalla de la maqueta</w:t>
+            </w:r>
+          </w:p>
+        </w:tc>
+      </w:tr>
+      <w:tr>
+        <w:tc>
+          <w:tcPr/>
+          <w:p>
+            <w:pPr>
+              <w:pStyle w:val="Compact"/>
+            </w:pPr>
+            <w:r>
+              <w:rPr>
+                <w:rStyle w:val="VerbatimChar"/>
+                <w:lang w:val="es"/>
+              </w:rPr>
+              <w:t xml:space="preserve">components/</w:t>
+            </w:r>
+          </w:p>
+        </w:tc>
+        <w:tc>
+          <w:tcPr/>
+          <w:p>
+            <w:pPr>
+              <w:pStyle w:val="Compact"/>
+            </w:pPr>
+            <w:r>
+              <w:rPr>
+                <w:lang w:val="es"/>
+              </w:rPr>
+              <w:t xml:space="preserve">Tarjetas de metrica, tabla de priorizacion, graficos y barra lateral</w:t>
+            </w:r>
+          </w:p>
+        </w:tc>
+      </w:tr>
+      <w:tr>
+        <w:tc>
+          <w:tcPr/>
+          <w:p>
+            <w:pPr>
+              <w:pStyle w:val="Compact"/>
+            </w:pPr>
+            <w:r>
+              <w:rPr>
+                <w:rStyle w:val="VerbatimChar"/>
+                <w:lang w:val="es"/>
+              </w:rPr>
+              <w:t xml:space="preserve">services/api.py</w:t>
+            </w:r>
+          </w:p>
+        </w:tc>
+        <w:tc>
+          <w:tcPr/>
+          <w:p>
+            <w:pPr>
+              <w:pStyle w:val="Compact"/>
+            </w:pPr>
+            <w:r>
+              <w:rPr>
+                <w:lang w:val="es"/>
+              </w:rPr>
+              <w:t xml:space="preserve">Unico punto de salida hacia la API; el tablero no importa el modelo</w:t>
+            </w:r>
+          </w:p>
+        </w:tc>
+      </w:tr>
+      <w:tr>
+        <w:tc>
+          <w:tcPr/>
+          <w:p>
+            <w:pPr>
+              <w:pStyle w:val="Compact"/>
+            </w:pPr>
+            <w:r>
+              <w:rPr>
+                <w:rStyle w:val="VerbatimChar"/>
+                <w:lang w:val="es"/>
+              </w:rPr>
+              <w:t xml:space="preserve">Dockerfile</w:t>
+            </w:r>
+            <w:r>
+              <w:rPr>
+                <w:lang w:val="es"/>
+              </w:rPr>
+              <w:t xml:space="preserve">,</w:t>
+            </w:r>
+            <w:r>
+              <w:rPr>
+                <w:lang w:val="es"/>
+              </w:rPr>
+              <w:t xml:space="preserve"> </w:t>
+            </w:r>
+            <w:r>
+              <w:rPr>
+                <w:rStyle w:val="VerbatimChar"/>
+                <w:lang w:val="es"/>
+              </w:rPr>
+              <w:t xml:space="preserve">railway.json</w:t>
+            </w:r>
+            <w:r>
+              <w:rPr>
+                <w:lang w:val="es"/>
+              </w:rPr>
+              <w:t xml:space="preserve">,</w:t>
+            </w:r>
+            <w:r>
+              <w:rPr>
+                <w:lang w:val="es"/>
+              </w:rPr>
+              <w:t xml:space="preserve"> </w:t>
+            </w:r>
+            <w:r>
+              <w:rPr>
+                <w:rStyle w:val="VerbatimChar"/>
+                <w:lang w:val="es"/>
+              </w:rPr>
+              <w:t xml:space="preserve">.streamlit/</w:t>
+            </w:r>
+          </w:p>
+        </w:tc>
+        <w:tc>
+          <w:tcPr/>
+          <w:p>
+            <w:pPr>
+              <w:pStyle w:val="Compact"/>
+            </w:pPr>
+            <w:r>
+              <w:rPr>
+                <w:lang w:val="es"/>
+              </w:rPr>
+              <w:t xml:space="preserve">Artefactos de despliegue</w:t>
+            </w:r>
+          </w:p>
+        </w:tc>
+      </w:tr>
+      <w:tr>
+        <w:tc>
+          <w:tcPr/>
+          <w:p>
+            <w:pPr>
+              <w:pStyle w:val="Compact"/>
+            </w:pPr>
+            <w:r>
+              <w:rPr>
+                <w:rStyle w:val="VerbatimChar"/>
+                <w:lang w:val="es"/>
+              </w:rPr>
+              <w:t xml:space="preserve">ux-ui/</w:t>
+            </w:r>
+          </w:p>
+        </w:tc>
+        <w:tc>
+          <w:tcPr/>
+          <w:p>
+            <w:pPr>
+              <w:pStyle w:val="Compact"/>
+            </w:pPr>
+            <w:r>
+              <w:rPr>
+                <w:lang w:val="es"/>
+              </w:rPr>
+              <w:t xml:space="preserve">Maqueta de la Entrega 1, contra la que se contrasta la implementacion</w:t>
+            </w:r>
+          </w:p>
+        </w:tc>
+      </w:tr>
+    </w:tbl>
+    <w:bookmarkEnd w:id="39"/>
+    <w:bookmarkStart w:id="52" w:name="experimentos-en-mlflow"/>
+    <w:p>
+      <w:pPr>
+        <w:pStyle w:val="Heading2"/>
+      </w:pPr>
+      <w:r>
+        <w:rPr>
+          <w:lang w:val="es"/>
+        </w:rPr>
+        <w:t xml:space="preserve">5.3 Experimentos en MLflow</w:t>
       </w:r>
     </w:p>
     <w:p>
       <w:pPr>
-        <w:pStyle w:val="BodyText"/>
+        <w:pStyle w:val="FirstParagraph"/>
       </w:pPr>
       <w:r>
         <w:rPr>
@@ -4809,18 +5528,18 @@
           <wp:inline>
             <wp:extent cx="5334000" cy="4759663"/>
             <wp:effectExtent b="0" l="0" r="0" t="0"/>
-            <wp:docPr descr="" title="" id="39" name="Picture"/>
+            <wp:docPr descr="" title="" id="41" name="Picture"/>
             <a:graphic>
               <a:graphicData uri="http://schemas.openxmlformats.org/drawingml/2006/picture">
                 <pic:pic>
                   <pic:nvPicPr>
-                    <pic:cNvPr descr="figuras/entrega-2-mlflow-ec2-ssh.png" id="40" name="Picture"/>
+                    <pic:cNvPr descr="figuras/entrega-2-mlflow-ec2-ssh.png" id="42" name="Picture"/>
                     <pic:cNvPicPr>
                       <a:picLocks noChangeArrowheads="1" noChangeAspect="1"/>
                     </pic:cNvPicPr>
                   </pic:nvPicPr>
                   <pic:blipFill>
-                    <a:blip r:embed="rId38"/>
+                    <a:blip r:embed="rId40"/>
                     <a:stretch>
                       <a:fillRect/>
                     </a:stretch>
@@ -4924,18 +5643,18 @@
           <wp:inline>
             <wp:extent cx="5334000" cy="2873040"/>
             <wp:effectExtent b="0" l="0" r="0" t="0"/>
-            <wp:docPr descr="" title="" id="42" name="Picture"/>
+            <wp:docPr descr="" title="" id="44" name="Picture"/>
             <a:graphic>
               <a:graphicData uri="http://schemas.openxmlformats.org/drawingml/2006/picture">
                 <pic:pic>
                   <pic:nvPicPr>
-                    <pic:cNvPr descr="figuras/entrega-2-mlflow-ec2-consola.png" id="43" name="Picture"/>
+                    <pic:cNvPr descr="figuras/entrega-2-mlflow-ec2-consola.png" id="45" name="Picture"/>
                     <pic:cNvPicPr>
                       <a:picLocks noChangeArrowheads="1" noChangeAspect="1"/>
                     </pic:cNvPicPr>
                   </pic:nvPicPr>
                   <pic:blipFill>
-                    <a:blip r:embed="rId41"/>
+                    <a:blip r:embed="rId43"/>
                     <a:stretch>
                       <a:fillRect/>
                     </a:stretch>
@@ -5021,7 +5740,70 @@
         <w:rPr>
           <w:lang w:val="es"/>
         </w:rPr>
-        <w:t xml:space="preserve">publica 3.224.107.117, la Elastic IP asociada y el usuario de la cuenta.</w:t>
+        <w:t xml:space="preserve">publica 3.224.107.117, la Elastic IP asociada y el usuario de la cuenta. Al</w:t>
+      </w:r>
+      <w:r>
+        <w:rPr>
+          <w:lang w:val="es"/>
+        </w:rPr>
+        <w:t xml:space="preserve"> </w:t>
+      </w:r>
+      <w:r>
+        <w:rPr>
+          <w:lang w:val="es"/>
+        </w:rPr>
+        <w:t xml:space="preserve">cierre de la entrega la instancia queda</w:t>
+      </w:r>
+      <w:r>
+        <w:rPr>
+          <w:lang w:val="es"/>
+        </w:rPr>
+        <w:t xml:space="preserve"> </w:t>
+      </w:r>
+      <w:r>
+        <w:rPr>
+          <w:b/>
+          <w:bCs/>
+          <w:lang w:val="es"/>
+        </w:rPr>
+        <w:t xml:space="preserve">detenida</w:t>
+      </w:r>
+      <w:r>
+        <w:rPr>
+          <w:lang w:val="es"/>
+        </w:rPr>
+        <w:t xml:space="preserve">, no terminada, para que</w:t>
+      </w:r>
+      <w:r>
+        <w:rPr>
+          <w:lang w:val="es"/>
+        </w:rPr>
+        <w:t xml:space="preserve"> </w:t>
+      </w:r>
+      <w:r>
+        <w:rPr>
+          <w:lang w:val="es"/>
+        </w:rPr>
+        <w:t xml:space="preserve">pueda verificarse despues; la constancia esta en</w:t>
+      </w:r>
+      <w:r>
+        <w:rPr>
+          <w:lang w:val="es"/>
+        </w:rPr>
+        <w:t xml:space="preserve"> </w:t>
+      </w:r>
+      <w:r>
+        <w:rPr>
+          <w:rStyle w:val="VerbatimChar"/>
+          <w:lang w:val="es"/>
+        </w:rPr>
+        <w:t xml:space="preserve">docs/soportes/ec2-mlflow-detenida.txt</w:t>
+      </w:r>
+      <w:r>
+        <w:rPr>
+          <w:lang w:val="es"/>
+        </w:rPr>
+        <w:t xml:space="preserve">.</w:t>
       </w:r>
     </w:p>
     <w:p>
@@ -5033,18 +5815,18 @@
           <wp:inline>
             <wp:extent cx="5334000" cy="3017996"/>
             <wp:effectExtent b="0" l="0" r="0" t="0"/>
-            <wp:docPr descr="" title="" id="45" name="Picture"/>
+            <wp:docPr descr="" title="" id="47" name="Picture"/>
             <a:graphic>
               <a:graphicData uri="http://schemas.openxmlformats.org/drawingml/2006/picture">
                 <pic:pic>
                   <pic:nvPicPr>
-                    <pic:cNvPr descr="figuras/entrega-2-mlflow-ui.png" id="46" name="Picture"/>
+                    <pic:cNvPr descr="figuras/entrega-2-mlflow-ui.png" id="48" name="Picture"/>
                     <pic:cNvPicPr>
                       <a:picLocks noChangeArrowheads="1" noChangeAspect="1"/>
                     </pic:cNvPicPr>
                   </pic:nvPicPr>
                   <pic:blipFill>
-                    <a:blip r:embed="rId44"/>
+                    <a:blip r:embed="rId46"/>
                     <a:stretch>
                       <a:fillRect/>
                     </a:stretch>
@@ -5080,18 +5862,18 @@
           <wp:inline>
             <wp:extent cx="5334000" cy="132343"/>
             <wp:effectExtent b="0" l="0" r="0" t="0"/>
-            <wp:docPr descr="" title="" id="48" name="Picture"/>
+            <wp:docPr descr="" title="" id="50" name="Picture"/>
             <a:graphic>
               <a:graphicData uri="http://schemas.openxmlformats.org/drawingml/2006/picture">
                 <pic:pic>
                   <pic:nvPicPr>
-                    <pic:cNvPr descr="figuras/entrega-2-mlflow-url.png" id="49" name="Picture"/>
+                    <pic:cNvPr descr="figuras/entrega-2-mlflow-url.png" id="51" name="Picture"/>
                     <pic:cNvPicPr>
                       <a:picLocks noChangeArrowheads="1" noChangeAspect="1"/>
                     </pic:cNvPicPr>
                   </pic:nvPicPr>
                   <pic:blipFill>
-                    <a:blip r:embed="rId47"/>
+                    <a:blip r:embed="rId49"/>
                     <a:stretch>
                       <a:fillRect/>
                     </a:stretch>
@@ -5323,1052 +6105,8 @@
         <w:t xml:space="preserve">75 combinaciones como corridas anidadas.</w:t>
       </w:r>
     </w:p>
-    <w:bookmarkEnd w:id="50"/>
-    <w:bookmarkStart w:id="54" w:name="reporte-de-trabajo-en-equipo"/>
-    <w:p>
-      <w:pPr>
-        <w:pStyle w:val="Heading1"/>
-      </w:pPr>
-      <w:r>
-        <w:rPr>
-          <w:lang w:val="es"/>
-        </w:rPr>
-        <w:t xml:space="preserve">6. Reporte de trabajo en equipo</w:t>
-      </w:r>
-    </w:p>
-    <w:bookmarkStart w:id="51" w:name="como-nos-organizamos"/>
-    <w:p>
-      <w:pPr>
-        <w:pStyle w:val="Heading2"/>
-      </w:pPr>
-      <w:r>
-        <w:rPr>
-          <w:lang w:val="es"/>
-        </w:rPr>
-        <w:t xml:space="preserve">6.1 Como nos organizamos</w:t>
-      </w:r>
-    </w:p>
-    <w:p>
-      <w:pPr>
-        <w:pStyle w:val="FirstParagraph"/>
-      </w:pPr>
-      <w:r>
-        <w:rPr>
-          <w:lang w:val="es"/>
-        </w:rPr>
-        <w:t xml:space="preserve">El trabajo se reparte por</w:t>
-      </w:r>
-      <w:r>
-        <w:rPr>
-          <w:lang w:val="es"/>
-        </w:rPr>
-        <w:t xml:space="preserve"> </w:t>
-      </w:r>
-      <w:r>
-        <w:rPr>
-          <w:b/>
-          <w:bCs/>
-          <w:lang w:val="es"/>
-        </w:rPr>
-        <w:t xml:space="preserve">item de trabajo</w:t>
-      </w:r>
-      <w:r>
-        <w:rPr>
-          <w:lang w:val="es"/>
-        </w:rPr>
-        <w:t xml:space="preserve">, no por persona: cada item vive en</w:t>
-      </w:r>
-      <w:r>
-        <w:rPr>
-          <w:lang w:val="es"/>
-        </w:rPr>
-        <w:t xml:space="preserve"> </w:t>
-      </w:r>
-      <w:r>
-        <w:rPr>
-          <w:lang w:val="es"/>
-        </w:rPr>
-        <w:t xml:space="preserve">su propia rama</w:t>
-      </w:r>
-      <w:r>
-        <w:rPr>
-          <w:lang w:val="es"/>
-        </w:rPr>
-        <w:t xml:space="preserve"> </w:t>
-      </w:r>
-      <w:r>
-        <w:rPr>
-          <w:rStyle w:val="VerbatimChar"/>
-          <w:lang w:val="es"/>
-        </w:rPr>
-        <w:t xml:space="preserve">feature/*</w:t>
-      </w:r>
-      <w:r>
-        <w:rPr>
-          <w:lang w:val="es"/>
-        </w:rPr>
-        <w:t xml:space="preserve">, sale de</w:t>
-      </w:r>
-      <w:r>
-        <w:rPr>
-          <w:lang w:val="es"/>
-        </w:rPr>
-        <w:t xml:space="preserve"> </w:t>
-      </w:r>
-      <w:r>
-        <w:rPr>
-          <w:rStyle w:val="VerbatimChar"/>
-          <w:lang w:val="es"/>
-        </w:rPr>
-        <w:t xml:space="preserve">develop</w:t>
-      </w:r>
-      <w:r>
-        <w:rPr>
-          <w:lang w:val="es"/>
-        </w:rPr>
-        <w:t xml:space="preserve"> </w:t>
-      </w:r>
-      <w:r>
-        <w:rPr>
-          <w:lang w:val="es"/>
-        </w:rPr>
-        <w:t xml:space="preserve">y vuelve a</w:t>
-      </w:r>
-      <w:r>
-        <w:rPr>
-          <w:lang w:val="es"/>
-        </w:rPr>
-        <w:t xml:space="preserve"> </w:t>
-      </w:r>
-      <w:r>
-        <w:rPr>
-          <w:rStyle w:val="VerbatimChar"/>
-          <w:lang w:val="es"/>
-        </w:rPr>
-        <w:t xml:space="preserve">develop</w:t>
-      </w:r>
-      <w:r>
-        <w:rPr>
-          <w:lang w:val="es"/>
-        </w:rPr>
-        <w:t xml:space="preserve"> </w:t>
-      </w:r>
-      <w:r>
-        <w:rPr>
-          <w:lang w:val="es"/>
-        </w:rPr>
-        <w:t xml:space="preserve">mediante un</w:t>
-      </w:r>
-      <w:r>
-        <w:rPr>
-          <w:lang w:val="es"/>
-        </w:rPr>
-        <w:t xml:space="preserve"> </w:t>
-      </w:r>
-      <w:r>
-        <w:rPr>
-          <w:lang w:val="es"/>
-        </w:rPr>
-        <w:t xml:space="preserve">pull request con revision de al menos un companero. Los merges conservan el</w:t>
-      </w:r>
-      <w:r>
-        <w:rPr>
-          <w:lang w:val="es"/>
-        </w:rPr>
-        <w:t xml:space="preserve"> </w:t>
-      </w:r>
-      <w:r>
-        <w:rPr>
-          <w:lang w:val="es"/>
-        </w:rPr>
-        <w:t xml:space="preserve">historial completo, sin</w:t>
-      </w:r>
-      <w:r>
-        <w:rPr>
-          <w:lang w:val="es"/>
-        </w:rPr>
-        <w:t xml:space="preserve"> </w:t>
-      </w:r>
-      <w:r>
-        <w:rPr>
-          <w:i/>
-          <w:iCs/>
-          <w:lang w:val="es"/>
-        </w:rPr>
-        <w:t xml:space="preserve">squash</w:t>
-      </w:r>
-      <w:r>
-        <w:rPr>
-          <w:lang w:val="es"/>
-        </w:rPr>
-        <w:t xml:space="preserve"> </w:t>
-      </w:r>
-      <w:r>
-        <w:rPr>
-          <w:lang w:val="es"/>
-        </w:rPr>
-        <w:t xml:space="preserve">ni</w:t>
-      </w:r>
-      <w:r>
-        <w:rPr>
-          <w:lang w:val="es"/>
-        </w:rPr>
-        <w:t xml:space="preserve"> </w:t>
-      </w:r>
-      <w:r>
-        <w:rPr>
-          <w:i/>
-          <w:iCs/>
-          <w:lang w:val="es"/>
-        </w:rPr>
-        <w:t xml:space="preserve">rebase</w:t>
-      </w:r>
-      <w:r>
-        <w:rPr>
-          <w:lang w:val="es"/>
-        </w:rPr>
-        <w:t xml:space="preserve"> </w:t>
-      </w:r>
-      <w:r>
-        <w:rPr>
-          <w:lang w:val="es"/>
-        </w:rPr>
-        <w:t xml:space="preserve">que colapsen la autoria, de modo</w:t>
-      </w:r>
-      <w:r>
-        <w:rPr>
-          <w:lang w:val="es"/>
-        </w:rPr>
-        <w:t xml:space="preserve"> </w:t>
-      </w:r>
-      <w:r>
-        <w:rPr>
-          <w:lang w:val="es"/>
-        </w:rPr>
-        <w:t xml:space="preserve">que el aporte de cada integrante queda verificable en el repositorio.</w:t>
-      </w:r>
-      <w:r>
-        <w:rPr>
-          <w:lang w:val="es"/>
-        </w:rPr>
-        <w:t xml:space="preserve"> </w:t>
-      </w:r>
-      <w:r>
-        <w:rPr>
-          <w:rStyle w:val="VerbatimChar"/>
-          <w:lang w:val="es"/>
-        </w:rPr>
-        <w:t xml:space="preserve">main</w:t>
-      </w:r>
-      <w:r>
-        <w:rPr>
-          <w:lang w:val="es"/>
-        </w:rPr>
-        <w:t xml:space="preserve"> </w:t>
-      </w:r>
-      <w:r>
-        <w:rPr>
-          <w:lang w:val="es"/>
-        </w:rPr>
-        <w:t xml:space="preserve">conserva unicamente los estados integrados de la entrega. Entre el 14 de agosto</w:t>
-      </w:r>
-      <w:r>
-        <w:rPr>
-          <w:lang w:val="es"/>
-        </w:rPr>
-        <w:t xml:space="preserve"> </w:t>
-      </w:r>
-      <w:r>
-        <w:rPr>
-          <w:lang w:val="es"/>
-        </w:rPr>
-        <w:t xml:space="preserve">y el 6 de septiembre se abrieron 18 pull requests entre los dos repositorios, de</w:t>
-      </w:r>
-      <w:r>
-        <w:rPr>
-          <w:lang w:val="es"/>
-        </w:rPr>
-        <w:t xml:space="preserve"> </w:t>
-      </w:r>
-      <w:r>
-        <w:rPr>
-          <w:lang w:val="es"/>
-        </w:rPr>
-        <w:t xml:space="preserve">los cuales 17 se integraron.</w:t>
-      </w:r>
-    </w:p>
-    <w:p>
-      <w:pPr>
-        <w:pStyle w:val="BodyText"/>
-      </w:pPr>
-      <w:r>
-        <w:rPr>
-          <w:lang w:val="es"/>
-        </w:rPr>
-        <w:t xml:space="preserve">La revision interna se hace sobre el pull request antes de integrar: la del</w:t>
-      </w:r>
-      <w:r>
-        <w:rPr>
-          <w:lang w:val="es"/>
-        </w:rPr>
-        <w:t xml:space="preserve"> </w:t>
-      </w:r>
-      <w:r>
-        <w:rPr>
-          <w:lang w:val="es"/>
-        </w:rPr>
-        <w:t xml:space="preserve">modelo de regresion logistica identifico un archivo que no compilaba, un umbral</w:t>
-      </w:r>
-      <w:r>
-        <w:rPr>
-          <w:lang w:val="es"/>
-        </w:rPr>
-        <w:t xml:space="preserve"> </w:t>
-      </w:r>
-      <w:r>
-        <w:rPr>
-          <w:lang w:val="es"/>
-        </w:rPr>
-        <w:t xml:space="preserve">calibrado sobre un modelo distinto al final y una dependencia de orden de</w:t>
-      </w:r>
-      <w:r>
-        <w:rPr>
-          <w:lang w:val="es"/>
-        </w:rPr>
-        <w:t xml:space="preserve"> </w:t>
-      </w:r>
-      <w:r>
-        <w:rPr>
-          <w:lang w:val="es"/>
-        </w:rPr>
-        <w:t xml:space="preserve">ejecucion no documentada; los tres se corrigieron antes del merge.</w:t>
-      </w:r>
-    </w:p>
-    <w:bookmarkEnd w:id="51"/>
-    <w:bookmarkStart w:id="52" w:name="quien-hizo-que"/>
-    <w:p>
-      <w:pPr>
-        <w:pStyle w:val="Heading2"/>
-      </w:pPr>
-      <w:r>
-        <w:rPr>
-          <w:lang w:val="es"/>
-        </w:rPr>
-        <w:t xml:space="preserve">6.2 Quien hizo que</w:t>
-      </w:r>
-    </w:p>
-    <w:p>
-      <w:pPr>
-        <w:pStyle w:val="FirstParagraph"/>
-      </w:pPr>
-      <w:r>
-        <w:rPr>
-          <w:b/>
-          <w:bCs/>
-          <w:lang w:val="es"/>
-        </w:rPr>
-        <w:t xml:space="preserve">Camilo Rodriguez</w:t>
-      </w:r>
-      <w:r>
-        <w:rPr>
-          <w:lang w:val="es"/>
-        </w:rPr>
-        <w:t xml:space="preserve"> </w:t>
-      </w:r>
-      <w:r>
-        <w:rPr>
-          <w:lang w:val="es"/>
-        </w:rPr>
-        <w:t xml:space="preserve">— Modelo de regresion logistica. Preparacion de</w:t>
-      </w:r>
-      <w:r>
-        <w:rPr>
-          <w:lang w:val="es"/>
-        </w:rPr>
-        <w:t xml:space="preserve"> </w:t>
-      </w:r>
-      <w:r>
-        <w:rPr>
-          <w:lang w:val="es"/>
-        </w:rPr>
-        <w:t xml:space="preserve">caracteristicas, agrupacion de diagnosticos ICD-9, particion por paciente y las</w:t>
-      </w:r>
-      <w:r>
-        <w:rPr>
-          <w:lang w:val="es"/>
-        </w:rPr>
-        <w:t xml:space="preserve"> </w:t>
-      </w:r>
-      <w:r>
-        <w:rPr>
-          <w:lang w:val="es"/>
-        </w:rPr>
-        <w:t xml:space="preserve">seis versiones del modelo: base, balanceo de clases, regularizacion, peso de la</w:t>
-      </w:r>
-      <w:r>
-        <w:rPr>
-          <w:lang w:val="es"/>
-        </w:rPr>
-        <w:t xml:space="preserve"> </w:t>
-      </w:r>
-      <w:r>
-        <w:rPr>
-          <w:lang w:val="es"/>
-        </w:rPr>
-        <w:t xml:space="preserve">clase positiva, ajuste de umbral y Elastic Net. Evaluacion con ROC-AUC, PR-AUC,</w:t>
-      </w:r>
-      <w:r>
-        <w:rPr>
-          <w:lang w:val="es"/>
-        </w:rPr>
-        <w:t xml:space="preserve"> </w:t>
-      </w:r>
-      <w:r>
-        <w:rPr>
-          <w:lang w:val="es"/>
-        </w:rPr>
-        <w:t xml:space="preserve">recall, F1/F2 y matriz de confusion, mas el analisis de priorizacion por</w:t>
-      </w:r>
-      <w:r>
-        <w:rPr>
-          <w:lang w:val="es"/>
-        </w:rPr>
-        <w:t xml:space="preserve"> </w:t>
-      </w:r>
-      <w:r>
-        <w:rPr>
-          <w:lang w:val="es"/>
-        </w:rPr>
-        <w:t xml:space="preserve">capacidad. Redacto las secciones de modelos y de conclusiones del reporte.</w:t>
-      </w:r>
-      <w:r>
-        <w:rPr>
-          <w:lang w:val="es"/>
-        </w:rPr>
-        <w:t xml:space="preserve"> </w:t>
-      </w:r>
-      <w:r>
-        <w:rPr>
-          <w:i/>
-          <w:iCs/>
-          <w:lang w:val="es"/>
-        </w:rPr>
-        <w:t xml:space="preserve">Evidencia: ramas</w:t>
-      </w:r>
-      <w:r>
-        <w:rPr>
-          <w:i/>
-          <w:iCs/>
-          <w:lang w:val="es"/>
-        </w:rPr>
-        <w:t xml:space="preserve"> </w:t>
-      </w:r>
-      <w:r>
-        <w:rPr>
-          <w:rStyle w:val="VerbatimChar"/>
-          <w:i/>
-          <w:iCs/>
-          <w:lang w:val="es"/>
-        </w:rPr>
-        <w:t xml:space="preserve">feature/camilo-validacion-entrega1</w:t>
-      </w:r>
-      <w:r>
-        <w:rPr>
-          <w:i/>
-          <w:iCs/>
-          <w:lang w:val="es"/>
-        </w:rPr>
-        <w:t xml:space="preserve"> </w:t>
-      </w:r>
-      <w:r>
-        <w:rPr>
-          <w:i/>
-          <w:iCs/>
-          <w:lang w:val="es"/>
-        </w:rPr>
-        <w:t xml:space="preserve">y</w:t>
-      </w:r>
-      <w:r>
-        <w:rPr>
-          <w:i/>
-          <w:iCs/>
-          <w:lang w:val="es"/>
-        </w:rPr>
-        <w:t xml:space="preserve"> </w:t>
-      </w:r>
-      <w:r>
-        <w:rPr>
-          <w:rStyle w:val="VerbatimChar"/>
-          <w:i/>
-          <w:iCs/>
-          <w:lang w:val="es"/>
-        </w:rPr>
-        <w:t xml:space="preserve">feature/camilo-regresion-entrega2</w:t>
-      </w:r>
-      <w:r>
-        <w:rPr>
-          <w:i/>
-          <w:iCs/>
-          <w:lang w:val="es"/>
-        </w:rPr>
-        <w:t xml:space="preserve">, pull requests #1 y #4.</w:t>
-      </w:r>
-    </w:p>
-    <w:p>
-      <w:pPr>
-        <w:pStyle w:val="BodyText"/>
-      </w:pPr>
-      <w:r>
-        <w:rPr>
-          <w:b/>
-          <w:bCs/>
-          <w:lang w:val="es"/>
-        </w:rPr>
-        <w:t xml:space="preserve">Leonardo Almanza</w:t>
-      </w:r>
-      <w:r>
-        <w:rPr>
-          <w:lang w:val="es"/>
-        </w:rPr>
-        <w:t xml:space="preserve"> </w:t>
-      </w:r>
-      <w:r>
-        <w:rPr>
-          <w:lang w:val="es"/>
-        </w:rPr>
-        <w:t xml:space="preserve">— Modelo de bosque aleatorio. Conjunto de modelamiento a</w:t>
-      </w:r>
-      <w:r>
-        <w:rPr>
-          <w:lang w:val="es"/>
-        </w:rPr>
-        <w:t xml:space="preserve"> </w:t>
-      </w:r>
-      <w:r>
-        <w:rPr>
-          <w:lang w:val="es"/>
-        </w:rPr>
-        <w:t xml:space="preserve">partir de las decisiones del EDA, particion y validacion cruzada agrupadas por</w:t>
-      </w:r>
-      <w:r>
-        <w:rPr>
-          <w:lang w:val="es"/>
-        </w:rPr>
-        <w:t xml:space="preserve"> </w:t>
-      </w:r>
-      <w:r>
-        <w:rPr>
-          <w:lang w:val="es"/>
-        </w:rPr>
-        <w:t xml:space="preserve">paciente, comparacion de siete tecnicas de desbalance, cuatro escenarios de</w:t>
-      </w:r>
-      <w:r>
-        <w:rPr>
-          <w:lang w:val="es"/>
-        </w:rPr>
-        <w:t xml:space="preserve"> </w:t>
-      </w:r>
-      <w:r>
-        <w:rPr>
-          <w:lang w:val="es"/>
-        </w:rPr>
-        <w:t xml:space="preserve">hiperparametros del arbol, seleccion de caracteristicas por importancia de</w:t>
-      </w:r>
-      <w:r>
-        <w:rPr>
-          <w:lang w:val="es"/>
-        </w:rPr>
-        <w:t xml:space="preserve"> </w:t>
-      </w:r>
-      <w:r>
-        <w:rPr>
-          <w:lang w:val="es"/>
-        </w:rPr>
-        <w:t xml:space="preserve">permutacion y evaluacion con calibracion, en cuaderno ejecutado.</w:t>
-      </w:r>
-      <w:r>
-        <w:rPr>
-          <w:lang w:val="es"/>
-        </w:rPr>
-        <w:t xml:space="preserve"> </w:t>
-      </w:r>
-      <w:r>
-        <w:rPr>
-          <w:i/>
-          <w:iCs/>
-          <w:lang w:val="es"/>
-        </w:rPr>
-        <w:t xml:space="preserve">Evidencia: rama</w:t>
-      </w:r>
-      <w:r>
-        <w:rPr>
-          <w:i/>
-          <w:iCs/>
-          <w:lang w:val="es"/>
-        </w:rPr>
-        <w:t xml:space="preserve"> </w:t>
-      </w:r>
-      <w:r>
-        <w:rPr>
-          <w:rStyle w:val="VerbatimChar"/>
-          <w:i/>
-          <w:iCs/>
-          <w:lang w:val="es"/>
-        </w:rPr>
-        <w:t xml:space="preserve">features/trees-random-boost-la</w:t>
-      </w:r>
-      <w:r>
-        <w:rPr>
-          <w:i/>
-          <w:iCs/>
-          <w:lang w:val="es"/>
-        </w:rPr>
-        <w:t xml:space="preserve">, pull request #6.</w:t>
-      </w:r>
-    </w:p>
-    <w:p>
-      <w:pPr>
-        <w:pStyle w:val="BodyText"/>
-      </w:pPr>
-      <w:r>
-        <w:rPr>
-          <w:b/>
-          <w:bCs/>
-          <w:lang w:val="es"/>
-        </w:rPr>
-        <w:t xml:space="preserve">Rainer Solano</w:t>
-      </w:r>
-      <w:r>
-        <w:rPr>
-          <w:lang w:val="es"/>
-        </w:rPr>
-        <w:t xml:space="preserve"> </w:t>
-      </w:r>
-      <w:r>
-        <w:rPr>
-          <w:lang w:val="es"/>
-        </w:rPr>
-        <w:t xml:space="preserve">— Arquitectura de la solucion: documento</w:t>
-      </w:r>
-      <w:r>
-        <w:rPr>
-          <w:lang w:val="es"/>
-        </w:rPr>
-        <w:t xml:space="preserve"> </w:t>
-      </w:r>
-      <w:r>
-        <w:rPr>
-          <w:rStyle w:val="VerbatimChar"/>
-          <w:lang w:val="es"/>
-        </w:rPr>
-        <w:t xml:space="preserve">INFRA-V-0.0.1.md</w:t>
-      </w:r>
-      <w:r>
-        <w:rPr>
-          <w:lang w:val="es"/>
-        </w:rPr>
-        <w:t xml:space="preserve"> </w:t>
-      </w:r>
-      <w:r>
-        <w:rPr>
-          <w:lang w:val="es"/>
-        </w:rPr>
-        <w:t xml:space="preserve">con la propuesta de infraestructura y los diagramas de desarrollo y produccion.</w:t>
-      </w:r>
-      <w:r>
-        <w:rPr>
-          <w:lang w:val="es"/>
-        </w:rPr>
-        <w:t xml:space="preserve"> </w:t>
-      </w:r>
-      <w:r>
-        <w:rPr>
-          <w:lang w:val="es"/>
-        </w:rPr>
-        <w:t xml:space="preserve">Arquitectura de software del tablero: estructura modular de vistas, componentes</w:t>
-      </w:r>
-      <w:r>
-        <w:rPr>
-          <w:lang w:val="es"/>
-        </w:rPr>
-        <w:t xml:space="preserve"> </w:t>
-      </w:r>
-      <w:r>
-        <w:rPr>
-          <w:lang w:val="es"/>
-        </w:rPr>
-        <w:t xml:space="preserve">y servicios, diseno del CSS, traduccion de la maqueta HTML a Streamlit y</w:t>
-      </w:r>
-      <w:r>
-        <w:rPr>
-          <w:lang w:val="es"/>
-        </w:rPr>
-        <w:t xml:space="preserve"> </w:t>
-      </w:r>
-      <w:r>
-        <w:rPr>
-          <w:lang w:val="es"/>
-        </w:rPr>
-        <w:t xml:space="preserve">despliegue en Railway para validacion inicial. Redacto la seccion del tablero</w:t>
-      </w:r>
-      <w:r>
-        <w:rPr>
-          <w:lang w:val="es"/>
-        </w:rPr>
-        <w:t xml:space="preserve"> </w:t>
-      </w:r>
-      <w:r>
-        <w:rPr>
-          <w:lang w:val="es"/>
-        </w:rPr>
-        <w:t xml:space="preserve">del reporte.</w:t>
-      </w:r>
-      <w:r>
-        <w:rPr>
-          <w:lang w:val="es"/>
-        </w:rPr>
-        <w:t xml:space="preserve"> </w:t>
-      </w:r>
-      <w:r>
-        <w:rPr>
-          <w:i/>
-          <w:iCs/>
-          <w:lang w:val="es"/>
-        </w:rPr>
-        <w:t xml:space="preserve">Evidencia: rama</w:t>
-      </w:r>
-      <w:r>
-        <w:rPr>
-          <w:i/>
-          <w:iCs/>
-          <w:lang w:val="es"/>
-        </w:rPr>
-        <w:t xml:space="preserve"> </w:t>
-      </w:r>
-      <w:r>
-        <w:rPr>
-          <w:rStyle w:val="VerbatimChar"/>
-          <w:i/>
-          <w:iCs/>
-          <w:lang w:val="es"/>
-        </w:rPr>
-        <w:t xml:space="preserve">feature/infra-delivery-baseline-arq</w:t>
-      </w:r>
-      <w:r>
-        <w:rPr>
-          <w:i/>
-          <w:iCs/>
-          <w:lang w:val="es"/>
-        </w:rPr>
-        <w:t xml:space="preserve">, pull requests #3 y #10 en</w:t>
-      </w:r>
-      <w:r>
-        <w:rPr>
-          <w:i/>
-          <w:iCs/>
-          <w:lang w:val="es"/>
-        </w:rPr>
-        <w:t xml:space="preserve"> </w:t>
-      </w:r>
-      <w:r>
-        <w:rPr>
-          <w:rStyle w:val="VerbatimChar"/>
-          <w:i/>
-          <w:iCs/>
-          <w:lang w:val="es"/>
-        </w:rPr>
-        <w:t xml:space="preserve">-api</w:t>
-      </w:r>
-      <w:r>
-        <w:rPr>
-          <w:i/>
-          <w:iCs/>
-          <w:lang w:val="es"/>
-        </w:rPr>
-        <w:t xml:space="preserve"> </w:t>
-      </w:r>
-      <w:r>
-        <w:rPr>
-          <w:i/>
-          <w:iCs/>
-          <w:lang w:val="es"/>
-        </w:rPr>
-        <w:t xml:space="preserve">y pull request #1 en</w:t>
-      </w:r>
-      <w:r>
-        <w:rPr>
-          <w:i/>
-          <w:iCs/>
-          <w:lang w:val="es"/>
-        </w:rPr>
-        <w:t xml:space="preserve"> </w:t>
-      </w:r>
-      <w:r>
-        <w:rPr>
-          <w:rStyle w:val="VerbatimChar"/>
-          <w:i/>
-          <w:iCs/>
-          <w:lang w:val="es"/>
-        </w:rPr>
-        <w:t xml:space="preserve">-ui</w:t>
-      </w:r>
-      <w:r>
-        <w:rPr>
-          <w:i/>
-          <w:iCs/>
-          <w:lang w:val="es"/>
-        </w:rPr>
-        <w:t xml:space="preserve">.</w:t>
-      </w:r>
-    </w:p>
-    <w:p>
-      <w:pPr>
-        <w:pStyle w:val="BodyText"/>
-      </w:pPr>
-      <w:r>
-        <w:rPr>
-          <w:b/>
-          <w:bCs/>
-          <w:lang w:val="es"/>
-        </w:rPr>
-        <w:t xml:space="preserve">Katerine Arias</w:t>
-      </w:r>
-      <w:r>
-        <w:rPr>
-          <w:lang w:val="es"/>
-        </w:rPr>
-        <w:t xml:space="preserve"> </w:t>
-      </w:r>
-      <w:r>
-        <w:rPr>
-          <w:lang w:val="es"/>
-        </w:rPr>
-        <w:t xml:space="preserve">— Infraestructura de seguimiento de experimentos y coordinacion</w:t>
-      </w:r>
-      <w:r>
-        <w:rPr>
-          <w:lang w:val="es"/>
-        </w:rPr>
-        <w:t xml:space="preserve"> </w:t>
-      </w:r>
-      <w:r>
-        <w:rPr>
-          <w:lang w:val="es"/>
-        </w:rPr>
-        <w:t xml:space="preserve">de las entregas. Servidor de MLflow sobre AWS EC2 con autenticacion, apagado</w:t>
-      </w:r>
-      <w:r>
-        <w:rPr>
-          <w:lang w:val="es"/>
-        </w:rPr>
-        <w:t xml:space="preserve"> </w:t>
-      </w:r>
-      <w:r>
-        <w:rPr>
-          <w:lang w:val="es"/>
-        </w:rPr>
-        <w:t xml:space="preserve">automatico por inactividad y control de costo; usuarios de acceso para el equipo;</w:t>
-      </w:r>
-      <w:r>
-        <w:rPr>
-          <w:lang w:val="es"/>
-        </w:rPr>
-        <w:t xml:space="preserve"> </w:t>
-      </w:r>
-      <w:r>
-        <w:rPr>
-          <w:lang w:val="es"/>
-        </w:rPr>
-        <w:t xml:space="preserve">registro de los experimentos de regresion logistica; figuras del reporte desde</w:t>
-      </w:r>
-      <w:r>
-        <w:rPr>
-          <w:lang w:val="es"/>
-        </w:rPr>
-        <w:t xml:space="preserve"> </w:t>
-      </w:r>
-      <w:r>
-        <w:rPr>
-          <w:lang w:val="es"/>
-        </w:rPr>
-        <w:t xml:space="preserve">MLflow; separacion del repositorio en codigo y tablero. Consolidacion del reporte.</w:t>
-      </w:r>
-      <w:r>
-        <w:rPr>
-          <w:lang w:val="es"/>
-        </w:rPr>
-        <w:t xml:space="preserve"> </w:t>
-      </w:r>
-      <w:r>
-        <w:rPr>
-          <w:i/>
-          <w:iCs/>
-          <w:lang w:val="es"/>
-        </w:rPr>
-        <w:t xml:space="preserve">Evidencia: ramas</w:t>
-      </w:r>
-      <w:r>
-        <w:rPr>
-          <w:i/>
-          <w:iCs/>
-          <w:lang w:val="es"/>
-        </w:rPr>
-        <w:t xml:space="preserve"> </w:t>
-      </w:r>
-      <w:r>
-        <w:rPr>
-          <w:rStyle w:val="VerbatimChar"/>
-          <w:i/>
-          <w:iCs/>
-          <w:lang w:val="es"/>
-        </w:rPr>
-        <w:t xml:space="preserve">feature/infra-mlflow-ec2</w:t>
-      </w:r>
-      <w:r>
-        <w:rPr>
-          <w:i/>
-          <w:iCs/>
-          <w:lang w:val="es"/>
-        </w:rPr>
-        <w:t xml:space="preserve">,</w:t>
-      </w:r>
-      <w:r>
-        <w:rPr>
-          <w:i/>
-          <w:iCs/>
-          <w:lang w:val="es"/>
-        </w:rPr>
-        <w:t xml:space="preserve"> </w:t>
-      </w:r>
-      <w:r>
-        <w:rPr>
-          <w:rStyle w:val="VerbatimChar"/>
-          <w:i/>
-          <w:iCs/>
-          <w:lang w:val="es"/>
-        </w:rPr>
-        <w:t xml:space="preserve">feature/mlflow-experimentos</w:t>
-      </w:r>
-      <w:r>
-        <w:rPr>
-          <w:i/>
-          <w:iCs/>
-          <w:lang w:val="es"/>
-        </w:rPr>
-        <w:t xml:space="preserve">,</w:t>
-      </w:r>
-      <w:r>
-        <w:rPr>
-          <w:i/>
-          <w:iCs/>
-          <w:lang w:val="es"/>
-        </w:rPr>
-        <w:t xml:space="preserve"> </w:t>
-      </w:r>
-      <w:r>
-        <w:rPr>
-          <w:rStyle w:val="VerbatimChar"/>
-          <w:i/>
-          <w:iCs/>
-          <w:lang w:val="es"/>
-        </w:rPr>
-        <w:t xml:space="preserve">feature/reporte-entrega-2</w:t>
-      </w:r>
-      <w:r>
-        <w:rPr>
-          <w:i/>
-          <w:iCs/>
-          <w:lang w:val="es"/>
-        </w:rPr>
-        <w:t xml:space="preserve">, pull requests #5, #7 y #8.</w:t>
-      </w:r>
-    </w:p>
     <w:bookmarkEnd w:id="52"/>
-    <w:bookmarkStart w:id="53" w:name="como-discutimos-los-resultados"/>
-    <w:p>
-      <w:pPr>
-        <w:pStyle w:val="Heading2"/>
-      </w:pPr>
-      <w:r>
-        <w:rPr>
-          <w:lang w:val="es"/>
-        </w:rPr>
-        <w:t xml:space="preserve">6.3 Como discutimos los resultados</w:t>
-      </w:r>
-    </w:p>
-    <w:p>
-      <w:pPr>
-        <w:pStyle w:val="FirstParagraph"/>
-      </w:pPr>
-      <w:r>
-        <w:rPr>
-          <w:lang w:val="es"/>
-        </w:rPr>
-        <w:t xml:space="preserve">Las dos familias de modelos se desarrollaron en paralelo y por separado, y</w:t>
-      </w:r>
-      <w:r>
-        <w:rPr>
-          <w:lang w:val="es"/>
-        </w:rPr>
-        <w:t xml:space="preserve"> </w:t>
-      </w:r>
-      <w:r>
-        <w:rPr>
-          <w:lang w:val="es"/>
-        </w:rPr>
-        <w:t xml:space="preserve">llegaron de forma independiente a la misma conclusion: ninguna tecnica de</w:t>
-      </w:r>
-      <w:r>
-        <w:rPr>
-          <w:lang w:val="es"/>
-        </w:rPr>
-        <w:t xml:space="preserve"> </w:t>
-      </w:r>
-      <w:r>
-        <w:rPr>
-          <w:lang w:val="es"/>
-        </w:rPr>
-        <w:t xml:space="preserve">balanceo ni ajuste de hiperparametros mejora la separacion entre clases; todas</w:t>
-      </w:r>
-      <w:r>
-        <w:rPr>
-          <w:lang w:val="es"/>
-        </w:rPr>
-        <w:t xml:space="preserve"> </w:t>
-      </w:r>
-      <w:r>
-        <w:rPr>
-          <w:lang w:val="es"/>
-        </w:rPr>
-        <w:t xml:space="preserve">reubican el punto de operacion sobre la misma curva. Que dos personas lo</w:t>
-      </w:r>
-      <w:r>
-        <w:rPr>
-          <w:lang w:val="es"/>
-        </w:rPr>
-        <w:t xml:space="preserve"> </w:t>
-      </w:r>
-      <w:r>
-        <w:rPr>
-          <w:lang w:val="es"/>
-        </w:rPr>
-        <w:t xml:space="preserve">encontraran por caminos distintos le da mas peso al hallazgo que si fuera</w:t>
-      </w:r>
-      <w:r>
-        <w:rPr>
-          <w:lang w:val="es"/>
-        </w:rPr>
-        <w:t xml:space="preserve"> </w:t>
-      </w:r>
-      <w:r>
-        <w:rPr>
-          <w:lang w:val="es"/>
-        </w:rPr>
-        <w:t xml:space="preserve">resultado de un solo experimento.</w:t>
-      </w:r>
-    </w:p>
     <w:bookmarkEnd w:id="53"/>
-    <w:bookmarkEnd w:id="54"/>
     <w:sectPr>
       <w:footnotePr>
         <w:numRestart w:val="eachSect"/>

</xml_diff>

<commit_message>
docs: recorta el cuerpo para que el trabajo en equipo quepa en las 10 paginas
Se revierte la separacion del documento: el reporte de trabajo en equipo vuelve
a ir dentro del mismo archivo, como lo dejo el equipo en la Entrega 2. Para que
entre sin pasar del limite calificable se recorto una pagina del cuerpo, sin
sacar ninguna cifra ni conclusion:

- Vinetas de la seccion 1.4 y de las tres vistas del tablero, redactadas mas
  corto.
- Seccion 4.1, condensada a los tres defectos y la deuda que dejan.
- Preambulo de la seccion 5 y seccion 6.3, sin repetir lo que ya dice la
  seccion 3.

El documento queda en 10 paginas: cuerpo en las nueve primeras y el reporte de
trabajo en equipo completo en la decima.
</commit_message>
<xml_diff>
--- a/docs/entregas/Entrega-2-reporte.docx
+++ b/docs/entregas/Entrega-2-reporte.docx
@@ -667,7 +667,7 @@
         <w:rPr>
           <w:lang w:val="es"/>
         </w:rPr>
-        <w:t xml:space="preserve">El codigo de modelos y API vive ahora en</w:t>
+        <w:t xml:space="preserve">Modelos y API en</w:t>
       </w:r>
       <w:r>
         <w:rPr>
@@ -686,19 +686,19 @@
         <w:rPr>
           <w:lang w:val="es"/>
         </w:rPr>
-        <w:t xml:space="preserve">; el tablero tiene su propio repositorio. En la</w:t>
-      </w:r>
-      <w:r>
-        <w:rPr>
-          <w:lang w:val="es"/>
-        </w:rPr>
-        <w:t xml:space="preserve"> </w:t>
-      </w:r>
-      <w:r>
-        <w:rPr>
-          <w:lang w:val="es"/>
-        </w:rPr>
-        <w:t xml:space="preserve">Entrega 1 todo estaba en</w:t>
+        <w:t xml:space="preserve">, tablero en el suyo; en la Entrega 1 todo estaba</w:t>
+      </w:r>
+      <w:r>
+        <w:rPr>
+          <w:lang w:val="es"/>
+        </w:rPr>
+        <w:t xml:space="preserve"> </w:t>
+      </w:r>
+      <w:r>
+        <w:rPr>
+          <w:lang w:val="es"/>
+        </w:rPr>
+        <w:t xml:space="preserve">en</w:t>
       </w:r>
       <w:r>
         <w:rPr>
@@ -746,31 +746,19 @@
         <w:rPr>
           <w:lang w:val="es"/>
         </w:rPr>
-        <w:t xml:space="preserve">como registro compartido</w:t>
-      </w:r>
-      <w:r>
-        <w:rPr>
-          <w:lang w:val="es"/>
-        </w:rPr>
-        <w:t xml:space="preserve"> </w:t>
-      </w:r>
-      <w:r>
-        <w:rPr>
-          <w:lang w:val="es"/>
-        </w:rPr>
-        <w:t xml:space="preserve">de experimentos, de modo que las versiones de modelo del equipo se comparan</w:t>
-      </w:r>
-      <w:r>
-        <w:rPr>
-          <w:lang w:val="es"/>
-        </w:rPr>
-        <w:t xml:space="preserve"> </w:t>
-      </w:r>
-      <w:r>
-        <w:rPr>
-          <w:lang w:val="es"/>
-        </w:rPr>
-        <w:t xml:space="preserve">en un mismo lugar.</w:t>
+        <w:t xml:space="preserve">como registro compartido,</w:t>
+      </w:r>
+      <w:r>
+        <w:rPr>
+          <w:lang w:val="es"/>
+        </w:rPr>
+        <w:t xml:space="preserve"> </w:t>
+      </w:r>
+      <w:r>
+        <w:rPr>
+          <w:lang w:val="es"/>
+        </w:rPr>
+        <w:t xml:space="preserve">de modo que las versiones de modelo del equipo se comparan en un mismo lugar.</w:t>
       </w:r>
     </w:p>
     <w:p>
@@ -785,19 +773,19 @@
         <w:rPr>
           <w:lang w:val="es"/>
         </w:rPr>
-        <w:t xml:space="preserve">El trabajo paso de la caracterizacion y exploracion de los datos a la</w:t>
-      </w:r>
-      <w:r>
-        <w:rPr>
-          <w:lang w:val="es"/>
-        </w:rPr>
-        <w:t xml:space="preserve"> </w:t>
-      </w:r>
-      <w:r>
-        <w:rPr>
-          <w:lang w:val="es"/>
-        </w:rPr>
-        <w:t xml:space="preserve">preparacion, entrenamiento y evaluacion del modelo predictivo.</w:t>
+        <w:t xml:space="preserve">El trabajo paso de la exploracion de los datos a la preparacion, entrenamiento</w:t>
+      </w:r>
+      <w:r>
+        <w:rPr>
+          <w:lang w:val="es"/>
+        </w:rPr>
+        <w:t xml:space="preserve"> </w:t>
+      </w:r>
+      <w:r>
+        <w:rPr>
+          <w:lang w:val="es"/>
+        </w:rPr>
+        <w:t xml:space="preserve">y evaluacion del modelo predictivo.</w:t>
       </w:r>
     </w:p>
     <w:p>
@@ -838,19 +826,7 @@
         <w:rPr>
           <w:lang w:val="es"/>
         </w:rPr>
-        <w:t xml:space="preserve">las bandas de riesgo ancladas en la tasa general observada. El tablero se</w:t>
-      </w:r>
-      <w:r>
-        <w:rPr>
-          <w:lang w:val="es"/>
-        </w:rPr>
-        <w:t xml:space="preserve"> </w:t>
-      </w:r>
-      <w:r>
-        <w:rPr>
-          <w:lang w:val="es"/>
-        </w:rPr>
-        <w:t xml:space="preserve">desarrolla de acuerdo con ella.</w:t>
+        <w:t xml:space="preserve">las bandas de riesgo ancladas en la tasa general observada.</w:t>
       </w:r>
     </w:p>
     <w:p>
@@ -3641,7 +3617,7 @@
         <w:rPr>
           <w:lang w:val="es"/>
         </w:rPr>
-        <w:t xml:space="preserve">componentes, configuración y servicio, y una paleta de colores que define el</w:t>
+        <w:t xml:space="preserve">componentes, configuración y servicio, y una paleta que define el</w:t>
       </w:r>
       <w:r>
         <w:rPr>
@@ -3667,55 +3643,19 @@
         <w:rPr>
           <w:lang w:val="es"/>
         </w:rPr>
-        <w:t xml:space="preserve">del producto. La capa API se mantiene como servicio</w:t>
-      </w:r>
-      <w:r>
-        <w:rPr>
-          <w:lang w:val="es"/>
-        </w:rPr>
-        <w:t xml:space="preserve"> </w:t>
-      </w:r>
-      <w:r>
-        <w:rPr>
-          <w:lang w:val="es"/>
-        </w:rPr>
-        <w:t xml:space="preserve">independiente, definida para integrar frontend y backend en la siguiente</w:t>
-      </w:r>
-      <w:r>
-        <w:rPr>
-          <w:lang w:val="es"/>
-        </w:rPr>
-        <w:t xml:space="preserve"> </w:t>
-      </w:r>
-      <w:r>
-        <w:rPr>
-          <w:lang w:val="es"/>
-        </w:rPr>
-        <w:t xml:space="preserve">iteración. Mantener los repositorios de front y back separados beneficia la</w:t>
-      </w:r>
-      <w:r>
-        <w:rPr>
-          <w:lang w:val="es"/>
-        </w:rPr>
-        <w:t xml:space="preserve"> </w:t>
-      </w:r>
-      <w:r>
-        <w:rPr>
-          <w:lang w:val="es"/>
-        </w:rPr>
-        <w:t xml:space="preserve">mantenibilidad y facilita la entrega y el despliegue continuo. El tablero cuenta</w:t>
-      </w:r>
-      <w:r>
-        <w:rPr>
-          <w:lang w:val="es"/>
-        </w:rPr>
-        <w:t xml:space="preserve"> </w:t>
-      </w:r>
-      <w:r>
-        <w:rPr>
-          <w:lang w:val="es"/>
-        </w:rPr>
-        <w:t xml:space="preserve">con tres menús:</w:t>
+        <w:t xml:space="preserve">del producto. La capa API se mantiene como servicio independiente, para integrar</w:t>
+      </w:r>
+      <w:r>
+        <w:rPr>
+          <w:lang w:val="es"/>
+        </w:rPr>
+        <w:t xml:space="preserve"> </w:t>
+      </w:r>
+      <w:r>
+        <w:rPr>
+          <w:lang w:val="es"/>
+        </w:rPr>
+        <w:t xml:space="preserve">frontend y backend en la siguiente iteración. El tablero cuenta con tres menús:</w:t>
       </w:r>
     </w:p>
     <w:p>
@@ -3738,55 +3678,43 @@
         <w:rPr>
           <w:lang w:val="es"/>
         </w:rPr>
-        <w:t xml:space="preserve">: Es un panel donde se van registrando los egresos programados, dicho</w:t>
-      </w:r>
-      <w:r>
-        <w:rPr>
-          <w:lang w:val="es"/>
-        </w:rPr>
-        <w:t xml:space="preserve"> </w:t>
-      </w:r>
-      <w:r>
-        <w:rPr>
-          <w:lang w:val="es"/>
-        </w:rPr>
-        <w:t xml:space="preserve">registro incluye 4 tarjetas que exhiben los egresos del día, la capacidad de seguimiento,</w:t>
-      </w:r>
-      <w:r>
-        <w:rPr>
-          <w:lang w:val="es"/>
-        </w:rPr>
-        <w:t xml:space="preserve"> </w:t>
-      </w:r>
-      <w:r>
-        <w:rPr>
-          <w:lang w:val="es"/>
-        </w:rPr>
-        <w:t xml:space="preserve">la cobertura de riesgo estimada, y el riesgo de no cobertura. Se apoya en filtro y tablas</w:t>
-      </w:r>
-      <w:r>
-        <w:rPr>
-          <w:lang w:val="es"/>
-        </w:rPr>
-        <w:t xml:space="preserve"> </w:t>
-      </w:r>
-      <w:r>
-        <w:rPr>
-          <w:lang w:val="es"/>
-        </w:rPr>
-        <w:t xml:space="preserve">para poder observar el detalle de esta información con filtros como la fecha de alta, servicio</w:t>
-      </w:r>
-      <w:r>
-        <w:rPr>
-          <w:lang w:val="es"/>
-        </w:rPr>
-        <w:t xml:space="preserve"> </w:t>
-      </w:r>
-      <w:r>
-        <w:rPr>
-          <w:lang w:val="es"/>
-        </w:rPr>
-        <w:t xml:space="preserve">hospitalario y capacidad de seguimiento de pacientes.</w:t>
+        <w:t xml:space="preserve">: panel de los egresos programados, con cuatro tarjetas —egresos</w:t>
+      </w:r>
+      <w:r>
+        <w:rPr>
+          <w:lang w:val="es"/>
+        </w:rPr>
+        <w:t xml:space="preserve"> </w:t>
+      </w:r>
+      <w:r>
+        <w:rPr>
+          <w:lang w:val="es"/>
+        </w:rPr>
+        <w:t xml:space="preserve">del día, capacidad de seguimiento, cobertura de riesgo estimada y riesgo de no</w:t>
+      </w:r>
+      <w:r>
+        <w:rPr>
+          <w:lang w:val="es"/>
+        </w:rPr>
+        <w:t xml:space="preserve"> </w:t>
+      </w:r>
+      <w:r>
+        <w:rPr>
+          <w:lang w:val="es"/>
+        </w:rPr>
+        <w:t xml:space="preserve">cobertura— y una tabla de detalle con filtros por fecha de alta, servicio</w:t>
+      </w:r>
+      <w:r>
+        <w:rPr>
+          <w:lang w:val="es"/>
+        </w:rPr>
+        <w:t xml:space="preserve"> </w:t>
+      </w:r>
+      <w:r>
+        <w:rPr>
+          <w:lang w:val="es"/>
+        </w:rPr>
+        <w:t xml:space="preserve">hospitalario y capacidad de seguimiento.</w:t>
       </w:r>
     </w:p>
     <w:p>
@@ -3905,67 +3833,55 @@
         <w:rPr>
           <w:lang w:val="es"/>
         </w:rPr>
-        <w:t xml:space="preserve">: Esta visual facilita el registro del paciente, y propone la captura</w:t>
-      </w:r>
-      <w:r>
-        <w:rPr>
-          <w:lang w:val="es"/>
-        </w:rPr>
-        <w:t xml:space="preserve"> </w:t>
-      </w:r>
-      <w:r>
-        <w:rPr>
-          <w:lang w:val="es"/>
-        </w:rPr>
-        <w:t xml:space="preserve">de los datos para la predicción del modelo de ML, los campos son el rango de edad, tipo</w:t>
-      </w:r>
-      <w:r>
-        <w:rPr>
-          <w:lang w:val="es"/>
-        </w:rPr>
-        <w:t xml:space="preserve"> </w:t>
-      </w:r>
-      <w:r>
-        <w:rPr>
-          <w:lang w:val="es"/>
-        </w:rPr>
-        <w:t xml:space="preserve">de admisión, servicio que da el alta, días de estancia, número de diagnósticos, número de</w:t>
-      </w:r>
-      <w:r>
-        <w:rPr>
-          <w:lang w:val="es"/>
-        </w:rPr>
-        <w:t xml:space="preserve"> </w:t>
-      </w:r>
-      <w:r>
-        <w:rPr>
-          <w:lang w:val="es"/>
-        </w:rPr>
-        <w:t xml:space="preserve">medicamentos, ingresos previos (1 año), urgencias previas (1 año), resultado de A1C y cambio</w:t>
-      </w:r>
-      <w:r>
-        <w:rPr>
-          <w:lang w:val="es"/>
-        </w:rPr>
-        <w:t xml:space="preserve"> </w:t>
-      </w:r>
-      <w:r>
-        <w:rPr>
-          <w:lang w:val="es"/>
-        </w:rPr>
-        <w:t xml:space="preserve">de medicación. Es en esta sección donde se debe invocar al api de predicciones en la</w:t>
-      </w:r>
-      <w:r>
-        <w:rPr>
-          <w:lang w:val="es"/>
-        </w:rPr>
-        <w:t xml:space="preserve"> </w:t>
-      </w:r>
-      <w:r>
-        <w:rPr>
-          <w:lang w:val="es"/>
-        </w:rPr>
-        <w:t xml:space="preserve">siguiente iteración.</w:t>
+        <w:t xml:space="preserve">: registra el encuentro y captura los datos que consume el modelo</w:t>
+      </w:r>
+      <w:r>
+        <w:rPr>
+          <w:lang w:val="es"/>
+        </w:rPr>
+        <w:t xml:space="preserve"> </w:t>
+      </w:r>
+      <w:r>
+        <w:rPr>
+          <w:lang w:val="es"/>
+        </w:rPr>
+        <w:t xml:space="preserve">—rango de edad, tipo de admisión, servicio que da el alta, días de estancia,</w:t>
+      </w:r>
+      <w:r>
+        <w:rPr>
+          <w:lang w:val="es"/>
+        </w:rPr>
+        <w:t xml:space="preserve"> </w:t>
+      </w:r>
+      <w:r>
+        <w:rPr>
+          <w:lang w:val="es"/>
+        </w:rPr>
+        <w:t xml:space="preserve">número de diagnósticos y de medicamentos, ingresos y urgencias previas (1 año),</w:t>
+      </w:r>
+      <w:r>
+        <w:rPr>
+          <w:lang w:val="es"/>
+        </w:rPr>
+        <w:t xml:space="preserve"> </w:t>
+      </w:r>
+      <w:r>
+        <w:rPr>
+          <w:lang w:val="es"/>
+        </w:rPr>
+        <w:t xml:space="preserve">resultado de A1C y cambio de medicación—. Es la vista que invoca la API de</w:t>
+      </w:r>
+      <w:r>
+        <w:rPr>
+          <w:lang w:val="es"/>
+        </w:rPr>
+        <w:t xml:space="preserve"> </w:t>
+      </w:r>
+      <w:r>
+        <w:rPr>
+          <w:lang w:val="es"/>
+        </w:rPr>
+        <w:t xml:space="preserve">predicciones.</w:t>
       </w:r>
     </w:p>
     <w:p>
@@ -4091,43 +4007,31 @@
         <w:rPr>
           <w:lang w:val="es"/>
         </w:rPr>
-        <w:t xml:space="preserve">: Es una visual analítica que muestra dónde se concentra el riesgo de reingreso,</w:t>
-      </w:r>
-      <w:r>
-        <w:rPr>
-          <w:lang w:val="es"/>
-        </w:rPr>
-        <w:t xml:space="preserve"> </w:t>
-      </w:r>
-      <w:r>
-        <w:rPr>
-          <w:lang w:val="es"/>
-        </w:rPr>
-        <w:t xml:space="preserve">teniendo en cuenta criterios como tasa de reingreso &lt; 30 días según ingresos previos, tasa de</w:t>
-      </w:r>
-      <w:r>
-        <w:rPr>
-          <w:lang w:val="es"/>
-        </w:rPr>
-        <w:t xml:space="preserve"> </w:t>
-      </w:r>
-      <w:r>
-        <w:rPr>
-          <w:lang w:val="es"/>
-        </w:rPr>
-        <w:t xml:space="preserve">especialidad que da el alta, tasa por rango de edad. Se plantean gráficas de barras horizontales</w:t>
-      </w:r>
-      <w:r>
-        <w:rPr>
-          <w:lang w:val="es"/>
-        </w:rPr>
-        <w:t xml:space="preserve"> </w:t>
-      </w:r>
-      <w:r>
-        <w:rPr>
-          <w:lang w:val="es"/>
-        </w:rPr>
-        <w:t xml:space="preserve">para visualizar este informe.</w:t>
+        <w:t xml:space="preserve">: visual analítica de dónde se concentra el riesgo, con barras</w:t>
+      </w:r>
+      <w:r>
+        <w:rPr>
+          <w:lang w:val="es"/>
+        </w:rPr>
+        <w:t xml:space="preserve"> </w:t>
+      </w:r>
+      <w:r>
+        <w:rPr>
+          <w:lang w:val="es"/>
+        </w:rPr>
+        <w:t xml:space="preserve">horizontales de la tasa de reingreso &lt; 30 días por ingresos previos, por</w:t>
+      </w:r>
+      <w:r>
+        <w:rPr>
+          <w:lang w:val="es"/>
+        </w:rPr>
+        <w:t xml:space="preserve"> </w:t>
+      </w:r>
+      <w:r>
+        <w:rPr>
+          <w:lang w:val="es"/>
+        </w:rPr>
+        <w:t xml:space="preserve">especialidad que da el alta y por rango de edad.</w:t>
       </w:r>
     </w:p>
     <w:p>
@@ -4366,43 +4270,19 @@
         <w:rPr>
           <w:lang w:val="es"/>
         </w:rPr>
-        <w:t xml:space="preserve">La validación del despliegue dejó a la vista tres defectos de tema que el</w:t>
-      </w:r>
-      <w:r>
-        <w:rPr>
-          <w:lang w:val="es"/>
-        </w:rPr>
-        <w:t xml:space="preserve"> </w:t>
-      </w:r>
-      <w:r>
-        <w:rPr>
-          <w:lang w:val="es"/>
-        </w:rPr>
-        <w:t xml:space="preserve">ambiente local no mostraba: Streamlit resolvía sus colores según la preferencia</w:t>
-      </w:r>
-      <w:r>
-        <w:rPr>
-          <w:lang w:val="es"/>
-        </w:rPr>
-        <w:t xml:space="preserve"> </w:t>
-      </w:r>
-      <w:r>
-        <w:rPr>
-          <w:lang w:val="es"/>
-        </w:rPr>
-        <w:t xml:space="preserve">del sistema de quien miraba, y en modo oscuro los títulos y las cifras de las</w:t>
-      </w:r>
-      <w:r>
-        <w:rPr>
-          <w:lang w:val="es"/>
-        </w:rPr>
-        <w:t xml:space="preserve"> </w:t>
-      </w:r>
-      <w:r>
-        <w:rPr>
-          <w:lang w:val="es"/>
-        </w:rPr>
-        <w:t xml:space="preserve">tarjetas quedaban blanco sobre blanco; el</w:t>
+        <w:t xml:space="preserve">El despliegue destapó tres defectos de tema que el ambiente local no mostraba:</w:t>
+      </w:r>
+      <w:r>
+        <w:rPr>
+          <w:lang w:val="es"/>
+        </w:rPr>
+        <w:t xml:space="preserve"> </w:t>
+      </w:r>
+      <w:r>
+        <w:rPr>
+          <w:lang w:val="es"/>
+        </w:rPr>
+        <w:t xml:space="preserve">texto blanco sobre blanco en modo oscuro,</w:t>
       </w:r>
       <w:r>
         <w:rPr>
@@ -4427,31 +4307,19 @@
         <w:rPr>
           <w:lang w:val="es"/>
         </w:rPr>
-        <w:t xml:space="preserve">no se podía reabrir una vez</w:t>
-      </w:r>
-      <w:r>
-        <w:rPr>
-          <w:lang w:val="es"/>
-        </w:rPr>
-        <w:t xml:space="preserve"> </w:t>
-      </w:r>
-      <w:r>
-        <w:rPr>
-          <w:lang w:val="es"/>
-        </w:rPr>
-        <w:t xml:space="preserve">colapsado; y el selector de unidad quedaba ilegible porque Streamlit 1.63 cambió</w:t>
-      </w:r>
-      <w:r>
-        <w:rPr>
-          <w:lang w:val="es"/>
-        </w:rPr>
-        <w:t xml:space="preserve"> </w:t>
-      </w:r>
-      <w:r>
-        <w:rPr>
-          <w:lang w:val="es"/>
-        </w:rPr>
-        <w:t xml:space="preserve">los</w:t>
+        <w:t xml:space="preserve">que no reabría una vez</w:t>
+      </w:r>
+      <w:r>
+        <w:rPr>
+          <w:lang w:val="es"/>
+        </w:rPr>
+        <w:t xml:space="preserve"> </w:t>
+      </w:r>
+      <w:r>
+        <w:rPr>
+          <w:lang w:val="es"/>
+        </w:rPr>
+        <w:t xml:space="preserve">colapsado y</w:t>
       </w:r>
       <w:r>
         <w:rPr>
@@ -4476,43 +4344,43 @@
         <w:rPr>
           <w:lang w:val="es"/>
         </w:rPr>
-        <w:t xml:space="preserve">de BaseWeb a react-aria. Los tres se corrigieron fijando el tema</w:t>
-      </w:r>
-      <w:r>
-        <w:rPr>
-          <w:lang w:val="es"/>
-        </w:rPr>
-        <w:t xml:space="preserve"> </w:t>
-      </w:r>
-      <w:r>
-        <w:rPr>
-          <w:lang w:val="es"/>
-        </w:rPr>
-        <w:t xml:space="preserve">del tablero. Que aparecieran solo en producción es el argumento a favor de la</w:t>
-      </w:r>
-      <w:r>
-        <w:rPr>
-          <w:lang w:val="es"/>
-        </w:rPr>
-        <w:t xml:space="preserve"> </w:t>
-      </w:r>
-      <w:r>
-        <w:rPr>
-          <w:lang w:val="es"/>
-        </w:rPr>
-        <w:t xml:space="preserve">deuda que sí queda pendiente: no hay pruebas de front que atrapen regresiones</w:t>
-      </w:r>
-      <w:r>
-        <w:rPr>
-          <w:lang w:val="es"/>
-        </w:rPr>
-        <w:t xml:space="preserve"> </w:t>
-      </w:r>
-      <w:r>
-        <w:rPr>
-          <w:lang w:val="es"/>
-        </w:rPr>
-        <w:t xml:space="preserve">visuales, y la integración con el API se aborda en la semana 6.</w:t>
+        <w:t xml:space="preserve">ilegible tras el cambio de BaseWeb a react-aria en</w:t>
+      </w:r>
+      <w:r>
+        <w:rPr>
+          <w:lang w:val="es"/>
+        </w:rPr>
+        <w:t xml:space="preserve"> </w:t>
+      </w:r>
+      <w:r>
+        <w:rPr>
+          <w:lang w:val="es"/>
+        </w:rPr>
+        <w:t xml:space="preserve">Streamlit 1.63. Los tres se corrigieron fijando el tema. Que solo aparecieran en</w:t>
+      </w:r>
+      <w:r>
+        <w:rPr>
+          <w:lang w:val="es"/>
+        </w:rPr>
+        <w:t xml:space="preserve"> </w:t>
+      </w:r>
+      <w:r>
+        <w:rPr>
+          <w:lang w:val="es"/>
+        </w:rPr>
+        <w:t xml:space="preserve">producción sustenta la deuda que queda: no hay pruebas de front que atrapen</w:t>
+      </w:r>
+      <w:r>
+        <w:rPr>
+          <w:lang w:val="es"/>
+        </w:rPr>
+        <w:t xml:space="preserve"> </w:t>
+      </w:r>
+      <w:r>
+        <w:rPr>
+          <w:lang w:val="es"/>
+        </w:rPr>
+        <w:t xml:space="preserve">regresiones visuales, y la integración con el API se aborda en la semana 6.</w:t>
       </w:r>
     </w:p>
     <w:p>
@@ -4568,31 +4436,19 @@
         <w:rPr>
           <w:lang w:val="es"/>
         </w:rPr>
-        <w:t xml:space="preserve">tiene forma de importar el modelo ni de cargar el artefacto serializado, solo</w:t>
-      </w:r>
-      <w:r>
-        <w:rPr>
-          <w:lang w:val="es"/>
-        </w:rPr>
-        <w:t xml:space="preserve"> </w:t>
-      </w:r>
-      <w:r>
-        <w:rPr>
-          <w:lang w:val="es"/>
-        </w:rPr>
-        <w:t xml:space="preserve">puede hablar con la API por HTTP. El historial de commits de cada integrante se</w:t>
-      </w:r>
-      <w:r>
-        <w:rPr>
-          <w:lang w:val="es"/>
-        </w:rPr>
-        <w:t xml:space="preserve"> </w:t>
-      </w:r>
-      <w:r>
-        <w:rPr>
-          <w:lang w:val="es"/>
-        </w:rPr>
-        <w:t xml:space="preserve">consulta en</w:t>
+        <w:t xml:space="preserve">puede importar el modelo ni cargar el artefacto serializado, solo hablar con la</w:t>
+      </w:r>
+      <w:r>
+        <w:rPr>
+          <w:lang w:val="es"/>
+        </w:rPr>
+        <w:t xml:space="preserve"> </w:t>
+      </w:r>
+      <w:r>
+        <w:rPr>
+          <w:lang w:val="es"/>
+        </w:rPr>
+        <w:t xml:space="preserve">API por HTTP. El historial de commits de cada integrante esta en</w:t>
       </w:r>
       <w:r>
         <w:rPr>
@@ -6107,6 +5963,1027 @@
     </w:p>
     <w:bookmarkEnd w:id="52"/>
     <w:bookmarkEnd w:id="53"/>
+    <w:bookmarkStart w:id="57" w:name="reporte-de-trabajo-en-equipo"/>
+    <w:p>
+      <w:pPr>
+        <w:pStyle w:val="Heading1"/>
+      </w:pPr>
+      <w:r>
+        <w:rPr>
+          <w:lang w:val="es"/>
+        </w:rPr>
+        <w:t xml:space="preserve">6. Reporte de trabajo en equipo</w:t>
+      </w:r>
+    </w:p>
+    <w:bookmarkStart w:id="54" w:name="como-nos-organizamos"/>
+    <w:p>
+      <w:pPr>
+        <w:pStyle w:val="Heading2"/>
+      </w:pPr>
+      <w:r>
+        <w:rPr>
+          <w:lang w:val="es"/>
+        </w:rPr>
+        <w:t xml:space="preserve">6.1 Como nos organizamos</w:t>
+      </w:r>
+    </w:p>
+    <w:p>
+      <w:pPr>
+        <w:pStyle w:val="FirstParagraph"/>
+      </w:pPr>
+      <w:r>
+        <w:rPr>
+          <w:lang w:val="es"/>
+        </w:rPr>
+        <w:t xml:space="preserve">El trabajo se reparte por</w:t>
+      </w:r>
+      <w:r>
+        <w:rPr>
+          <w:lang w:val="es"/>
+        </w:rPr>
+        <w:t xml:space="preserve"> </w:t>
+      </w:r>
+      <w:r>
+        <w:rPr>
+          <w:b/>
+          <w:bCs/>
+          <w:lang w:val="es"/>
+        </w:rPr>
+        <w:t xml:space="preserve">item de trabajo</w:t>
+      </w:r>
+      <w:r>
+        <w:rPr>
+          <w:lang w:val="es"/>
+        </w:rPr>
+        <w:t xml:space="preserve">, no por persona: cada item vive en</w:t>
+      </w:r>
+      <w:r>
+        <w:rPr>
+          <w:lang w:val="es"/>
+        </w:rPr>
+        <w:t xml:space="preserve"> </w:t>
+      </w:r>
+      <w:r>
+        <w:rPr>
+          <w:lang w:val="es"/>
+        </w:rPr>
+        <w:t xml:space="preserve">su propia rama</w:t>
+      </w:r>
+      <w:r>
+        <w:rPr>
+          <w:lang w:val="es"/>
+        </w:rPr>
+        <w:t xml:space="preserve"> </w:t>
+      </w:r>
+      <w:r>
+        <w:rPr>
+          <w:rStyle w:val="VerbatimChar"/>
+          <w:lang w:val="es"/>
+        </w:rPr>
+        <w:t xml:space="preserve">feature/*</w:t>
+      </w:r>
+      <w:r>
+        <w:rPr>
+          <w:lang w:val="es"/>
+        </w:rPr>
+        <w:t xml:space="preserve">, sale de</w:t>
+      </w:r>
+      <w:r>
+        <w:rPr>
+          <w:lang w:val="es"/>
+        </w:rPr>
+        <w:t xml:space="preserve"> </w:t>
+      </w:r>
+      <w:r>
+        <w:rPr>
+          <w:rStyle w:val="VerbatimChar"/>
+          <w:lang w:val="es"/>
+        </w:rPr>
+        <w:t xml:space="preserve">develop</w:t>
+      </w:r>
+      <w:r>
+        <w:rPr>
+          <w:lang w:val="es"/>
+        </w:rPr>
+        <w:t xml:space="preserve"> </w:t>
+      </w:r>
+      <w:r>
+        <w:rPr>
+          <w:lang w:val="es"/>
+        </w:rPr>
+        <w:t xml:space="preserve">y vuelve a</w:t>
+      </w:r>
+      <w:r>
+        <w:rPr>
+          <w:lang w:val="es"/>
+        </w:rPr>
+        <w:t xml:space="preserve"> </w:t>
+      </w:r>
+      <w:r>
+        <w:rPr>
+          <w:rStyle w:val="VerbatimChar"/>
+          <w:lang w:val="es"/>
+        </w:rPr>
+        <w:t xml:space="preserve">develop</w:t>
+      </w:r>
+      <w:r>
+        <w:rPr>
+          <w:lang w:val="es"/>
+        </w:rPr>
+        <w:t xml:space="preserve"> </w:t>
+      </w:r>
+      <w:r>
+        <w:rPr>
+          <w:lang w:val="es"/>
+        </w:rPr>
+        <w:t xml:space="preserve">mediante un</w:t>
+      </w:r>
+      <w:r>
+        <w:rPr>
+          <w:lang w:val="es"/>
+        </w:rPr>
+        <w:t xml:space="preserve"> </w:t>
+      </w:r>
+      <w:r>
+        <w:rPr>
+          <w:lang w:val="es"/>
+        </w:rPr>
+        <w:t xml:space="preserve">pull request con revision de al menos un companero. Los merges conservan el</w:t>
+      </w:r>
+      <w:r>
+        <w:rPr>
+          <w:lang w:val="es"/>
+        </w:rPr>
+        <w:t xml:space="preserve"> </w:t>
+      </w:r>
+      <w:r>
+        <w:rPr>
+          <w:lang w:val="es"/>
+        </w:rPr>
+        <w:t xml:space="preserve">historial completo, sin</w:t>
+      </w:r>
+      <w:r>
+        <w:rPr>
+          <w:lang w:val="es"/>
+        </w:rPr>
+        <w:t xml:space="preserve"> </w:t>
+      </w:r>
+      <w:r>
+        <w:rPr>
+          <w:i/>
+          <w:iCs/>
+          <w:lang w:val="es"/>
+        </w:rPr>
+        <w:t xml:space="preserve">squash</w:t>
+      </w:r>
+      <w:r>
+        <w:rPr>
+          <w:lang w:val="es"/>
+        </w:rPr>
+        <w:t xml:space="preserve"> </w:t>
+      </w:r>
+      <w:r>
+        <w:rPr>
+          <w:lang w:val="es"/>
+        </w:rPr>
+        <w:t xml:space="preserve">ni</w:t>
+      </w:r>
+      <w:r>
+        <w:rPr>
+          <w:lang w:val="es"/>
+        </w:rPr>
+        <w:t xml:space="preserve"> </w:t>
+      </w:r>
+      <w:r>
+        <w:rPr>
+          <w:i/>
+          <w:iCs/>
+          <w:lang w:val="es"/>
+        </w:rPr>
+        <w:t xml:space="preserve">rebase</w:t>
+      </w:r>
+      <w:r>
+        <w:rPr>
+          <w:lang w:val="es"/>
+        </w:rPr>
+        <w:t xml:space="preserve"> </w:t>
+      </w:r>
+      <w:r>
+        <w:rPr>
+          <w:lang w:val="es"/>
+        </w:rPr>
+        <w:t xml:space="preserve">que colapsen la autoria, de modo</w:t>
+      </w:r>
+      <w:r>
+        <w:rPr>
+          <w:lang w:val="es"/>
+        </w:rPr>
+        <w:t xml:space="preserve"> </w:t>
+      </w:r>
+      <w:r>
+        <w:rPr>
+          <w:lang w:val="es"/>
+        </w:rPr>
+        <w:t xml:space="preserve">que el aporte de cada integrante queda verificable en el repositorio.</w:t>
+      </w:r>
+      <w:r>
+        <w:rPr>
+          <w:lang w:val="es"/>
+        </w:rPr>
+        <w:t xml:space="preserve"> </w:t>
+      </w:r>
+      <w:r>
+        <w:rPr>
+          <w:rStyle w:val="VerbatimChar"/>
+          <w:lang w:val="es"/>
+        </w:rPr>
+        <w:t xml:space="preserve">main</w:t>
+      </w:r>
+      <w:r>
+        <w:rPr>
+          <w:lang w:val="es"/>
+        </w:rPr>
+        <w:t xml:space="preserve"> </w:t>
+      </w:r>
+      <w:r>
+        <w:rPr>
+          <w:lang w:val="es"/>
+        </w:rPr>
+        <w:t xml:space="preserve">conserva unicamente los estados integrados de la entrega. Entre el 14 de agosto</w:t>
+      </w:r>
+      <w:r>
+        <w:rPr>
+          <w:lang w:val="es"/>
+        </w:rPr>
+        <w:t xml:space="preserve"> </w:t>
+      </w:r>
+      <w:r>
+        <w:rPr>
+          <w:lang w:val="es"/>
+        </w:rPr>
+        <w:t xml:space="preserve">y el 6 de septiembre se abrieron 18 pull requests entre los dos repositorios, de</w:t>
+      </w:r>
+      <w:r>
+        <w:rPr>
+          <w:lang w:val="es"/>
+        </w:rPr>
+        <w:t xml:space="preserve"> </w:t>
+      </w:r>
+      <w:r>
+        <w:rPr>
+          <w:lang w:val="es"/>
+        </w:rPr>
+        <w:t xml:space="preserve">los cuales 17 se integraron.</w:t>
+      </w:r>
+    </w:p>
+    <w:p>
+      <w:pPr>
+        <w:pStyle w:val="BodyText"/>
+      </w:pPr>
+      <w:r>
+        <w:rPr>
+          <w:lang w:val="es"/>
+        </w:rPr>
+        <w:t xml:space="preserve">La revision interna se hace sobre el pull request antes de integrar: la del</w:t>
+      </w:r>
+      <w:r>
+        <w:rPr>
+          <w:lang w:val="es"/>
+        </w:rPr>
+        <w:t xml:space="preserve"> </w:t>
+      </w:r>
+      <w:r>
+        <w:rPr>
+          <w:lang w:val="es"/>
+        </w:rPr>
+        <w:t xml:space="preserve">modelo de regresion logistica identifico un archivo que no compilaba, un umbral</w:t>
+      </w:r>
+      <w:r>
+        <w:rPr>
+          <w:lang w:val="es"/>
+        </w:rPr>
+        <w:t xml:space="preserve"> </w:t>
+      </w:r>
+      <w:r>
+        <w:rPr>
+          <w:lang w:val="es"/>
+        </w:rPr>
+        <w:t xml:space="preserve">calibrado sobre un modelo distinto al final y una dependencia de orden de</w:t>
+      </w:r>
+      <w:r>
+        <w:rPr>
+          <w:lang w:val="es"/>
+        </w:rPr>
+        <w:t xml:space="preserve"> </w:t>
+      </w:r>
+      <w:r>
+        <w:rPr>
+          <w:lang w:val="es"/>
+        </w:rPr>
+        <w:t xml:space="preserve">ejecucion no documentada; los tres se corrigieron antes del merge.</w:t>
+      </w:r>
+    </w:p>
+    <w:bookmarkEnd w:id="54"/>
+    <w:bookmarkStart w:id="55" w:name="quien-hizo-que"/>
+    <w:p>
+      <w:pPr>
+        <w:pStyle w:val="Heading2"/>
+      </w:pPr>
+      <w:r>
+        <w:rPr>
+          <w:lang w:val="es"/>
+        </w:rPr>
+        <w:t xml:space="preserve">6.2 Quien hizo que</w:t>
+      </w:r>
+    </w:p>
+    <w:p>
+      <w:pPr>
+        <w:pStyle w:val="FirstParagraph"/>
+      </w:pPr>
+      <w:r>
+        <w:rPr>
+          <w:b/>
+          <w:bCs/>
+          <w:lang w:val="es"/>
+        </w:rPr>
+        <w:t xml:space="preserve">Camilo Rodriguez</w:t>
+      </w:r>
+      <w:r>
+        <w:rPr>
+          <w:lang w:val="es"/>
+        </w:rPr>
+        <w:t xml:space="preserve"> </w:t>
+      </w:r>
+      <w:r>
+        <w:rPr>
+          <w:lang w:val="es"/>
+        </w:rPr>
+        <w:t xml:space="preserve">— Modelo de regresion logistica. Preparacion de</w:t>
+      </w:r>
+      <w:r>
+        <w:rPr>
+          <w:lang w:val="es"/>
+        </w:rPr>
+        <w:t xml:space="preserve"> </w:t>
+      </w:r>
+      <w:r>
+        <w:rPr>
+          <w:lang w:val="es"/>
+        </w:rPr>
+        <w:t xml:space="preserve">caracteristicas, agrupacion de diagnosticos ICD-9, particion por paciente y las</w:t>
+      </w:r>
+      <w:r>
+        <w:rPr>
+          <w:lang w:val="es"/>
+        </w:rPr>
+        <w:t xml:space="preserve"> </w:t>
+      </w:r>
+      <w:r>
+        <w:rPr>
+          <w:lang w:val="es"/>
+        </w:rPr>
+        <w:t xml:space="preserve">seis versiones del modelo: base, balanceo de clases, regularizacion, peso de la</w:t>
+      </w:r>
+      <w:r>
+        <w:rPr>
+          <w:lang w:val="es"/>
+        </w:rPr>
+        <w:t xml:space="preserve"> </w:t>
+      </w:r>
+      <w:r>
+        <w:rPr>
+          <w:lang w:val="es"/>
+        </w:rPr>
+        <w:t xml:space="preserve">clase positiva, ajuste de umbral y Elastic Net. Evaluacion con ROC-AUC, PR-AUC,</w:t>
+      </w:r>
+      <w:r>
+        <w:rPr>
+          <w:lang w:val="es"/>
+        </w:rPr>
+        <w:t xml:space="preserve"> </w:t>
+      </w:r>
+      <w:r>
+        <w:rPr>
+          <w:lang w:val="es"/>
+        </w:rPr>
+        <w:t xml:space="preserve">recall, F1/F2 y matriz de confusion, mas el analisis de priorizacion por</w:t>
+      </w:r>
+      <w:r>
+        <w:rPr>
+          <w:lang w:val="es"/>
+        </w:rPr>
+        <w:t xml:space="preserve"> </w:t>
+      </w:r>
+      <w:r>
+        <w:rPr>
+          <w:lang w:val="es"/>
+        </w:rPr>
+        <w:t xml:space="preserve">capacidad. Redacto las secciones de modelos y de conclusiones del reporte.</w:t>
+      </w:r>
+      <w:r>
+        <w:rPr>
+          <w:lang w:val="es"/>
+        </w:rPr>
+        <w:t xml:space="preserve"> </w:t>
+      </w:r>
+      <w:r>
+        <w:rPr>
+          <w:i/>
+          <w:iCs/>
+          <w:lang w:val="es"/>
+        </w:rPr>
+        <w:t xml:space="preserve">Evidencia: ramas</w:t>
+      </w:r>
+      <w:r>
+        <w:rPr>
+          <w:i/>
+          <w:iCs/>
+          <w:lang w:val="es"/>
+        </w:rPr>
+        <w:t xml:space="preserve"> </w:t>
+      </w:r>
+      <w:r>
+        <w:rPr>
+          <w:rStyle w:val="VerbatimChar"/>
+          <w:i/>
+          <w:iCs/>
+          <w:lang w:val="es"/>
+        </w:rPr>
+        <w:t xml:space="preserve">feature/camilo-validacion-entrega1</w:t>
+      </w:r>
+      <w:r>
+        <w:rPr>
+          <w:i/>
+          <w:iCs/>
+          <w:lang w:val="es"/>
+        </w:rPr>
+        <w:t xml:space="preserve"> </w:t>
+      </w:r>
+      <w:r>
+        <w:rPr>
+          <w:i/>
+          <w:iCs/>
+          <w:lang w:val="es"/>
+        </w:rPr>
+        <w:t xml:space="preserve">y</w:t>
+      </w:r>
+      <w:r>
+        <w:rPr>
+          <w:i/>
+          <w:iCs/>
+          <w:lang w:val="es"/>
+        </w:rPr>
+        <w:t xml:space="preserve"> </w:t>
+      </w:r>
+      <w:r>
+        <w:rPr>
+          <w:rStyle w:val="VerbatimChar"/>
+          <w:i/>
+          <w:iCs/>
+          <w:lang w:val="es"/>
+        </w:rPr>
+        <w:t xml:space="preserve">feature/camilo-regresion-entrega2</w:t>
+      </w:r>
+      <w:r>
+        <w:rPr>
+          <w:i/>
+          <w:iCs/>
+          <w:lang w:val="es"/>
+        </w:rPr>
+        <w:t xml:space="preserve">, pull requests #1 y #4.</w:t>
+      </w:r>
+    </w:p>
+    <w:p>
+      <w:pPr>
+        <w:pStyle w:val="BodyText"/>
+      </w:pPr>
+      <w:r>
+        <w:rPr>
+          <w:b/>
+          <w:bCs/>
+          <w:lang w:val="es"/>
+        </w:rPr>
+        <w:t xml:space="preserve">Leonardo Almanza</w:t>
+      </w:r>
+      <w:r>
+        <w:rPr>
+          <w:lang w:val="es"/>
+        </w:rPr>
+        <w:t xml:space="preserve"> </w:t>
+      </w:r>
+      <w:r>
+        <w:rPr>
+          <w:lang w:val="es"/>
+        </w:rPr>
+        <w:t xml:space="preserve">— Modelo de bosque aleatorio. Conjunto de modelamiento a</w:t>
+      </w:r>
+      <w:r>
+        <w:rPr>
+          <w:lang w:val="es"/>
+        </w:rPr>
+        <w:t xml:space="preserve"> </w:t>
+      </w:r>
+      <w:r>
+        <w:rPr>
+          <w:lang w:val="es"/>
+        </w:rPr>
+        <w:t xml:space="preserve">partir de las decisiones del EDA, particion y validacion cruzada agrupadas por</w:t>
+      </w:r>
+      <w:r>
+        <w:rPr>
+          <w:lang w:val="es"/>
+        </w:rPr>
+        <w:t xml:space="preserve"> </w:t>
+      </w:r>
+      <w:r>
+        <w:rPr>
+          <w:lang w:val="es"/>
+        </w:rPr>
+        <w:t xml:space="preserve">paciente, comparacion de siete tecnicas de desbalance, cuatro escenarios de</w:t>
+      </w:r>
+      <w:r>
+        <w:rPr>
+          <w:lang w:val="es"/>
+        </w:rPr>
+        <w:t xml:space="preserve"> </w:t>
+      </w:r>
+      <w:r>
+        <w:rPr>
+          <w:lang w:val="es"/>
+        </w:rPr>
+        <w:t xml:space="preserve">hiperparametros del arbol, seleccion de caracteristicas por importancia de</w:t>
+      </w:r>
+      <w:r>
+        <w:rPr>
+          <w:lang w:val="es"/>
+        </w:rPr>
+        <w:t xml:space="preserve"> </w:t>
+      </w:r>
+      <w:r>
+        <w:rPr>
+          <w:lang w:val="es"/>
+        </w:rPr>
+        <w:t xml:space="preserve">permutacion y evaluacion con calibracion, en cuaderno ejecutado.</w:t>
+      </w:r>
+      <w:r>
+        <w:rPr>
+          <w:lang w:val="es"/>
+        </w:rPr>
+        <w:t xml:space="preserve"> </w:t>
+      </w:r>
+      <w:r>
+        <w:rPr>
+          <w:i/>
+          <w:iCs/>
+          <w:lang w:val="es"/>
+        </w:rPr>
+        <w:t xml:space="preserve">Evidencia: rama</w:t>
+      </w:r>
+      <w:r>
+        <w:rPr>
+          <w:i/>
+          <w:iCs/>
+          <w:lang w:val="es"/>
+        </w:rPr>
+        <w:t xml:space="preserve"> </w:t>
+      </w:r>
+      <w:r>
+        <w:rPr>
+          <w:rStyle w:val="VerbatimChar"/>
+          <w:i/>
+          <w:iCs/>
+          <w:lang w:val="es"/>
+        </w:rPr>
+        <w:t xml:space="preserve">features/trees-random-boost-la</w:t>
+      </w:r>
+      <w:r>
+        <w:rPr>
+          <w:i/>
+          <w:iCs/>
+          <w:lang w:val="es"/>
+        </w:rPr>
+        <w:t xml:space="preserve">, pull request #6.</w:t>
+      </w:r>
+    </w:p>
+    <w:p>
+      <w:pPr>
+        <w:pStyle w:val="BodyText"/>
+      </w:pPr>
+      <w:r>
+        <w:rPr>
+          <w:b/>
+          <w:bCs/>
+          <w:lang w:val="es"/>
+        </w:rPr>
+        <w:t xml:space="preserve">Rainer Solano</w:t>
+      </w:r>
+      <w:r>
+        <w:rPr>
+          <w:lang w:val="es"/>
+        </w:rPr>
+        <w:t xml:space="preserve"> </w:t>
+      </w:r>
+      <w:r>
+        <w:rPr>
+          <w:lang w:val="es"/>
+        </w:rPr>
+        <w:t xml:space="preserve">— Arquitectura de la solucion: documento</w:t>
+      </w:r>
+      <w:r>
+        <w:rPr>
+          <w:lang w:val="es"/>
+        </w:rPr>
+        <w:t xml:space="preserve"> </w:t>
+      </w:r>
+      <w:r>
+        <w:rPr>
+          <w:rStyle w:val="VerbatimChar"/>
+          <w:lang w:val="es"/>
+        </w:rPr>
+        <w:t xml:space="preserve">INFRA-V-0.0.1.md</w:t>
+      </w:r>
+      <w:r>
+        <w:rPr>
+          <w:lang w:val="es"/>
+        </w:rPr>
+        <w:t xml:space="preserve"> </w:t>
+      </w:r>
+      <w:r>
+        <w:rPr>
+          <w:lang w:val="es"/>
+        </w:rPr>
+        <w:t xml:space="preserve">con la propuesta de infraestructura y los diagramas de desarrollo y produccion.</w:t>
+      </w:r>
+      <w:r>
+        <w:rPr>
+          <w:lang w:val="es"/>
+        </w:rPr>
+        <w:t xml:space="preserve"> </w:t>
+      </w:r>
+      <w:r>
+        <w:rPr>
+          <w:lang w:val="es"/>
+        </w:rPr>
+        <w:t xml:space="preserve">Arquitectura de software del tablero: estructura modular de vistas, componentes</w:t>
+      </w:r>
+      <w:r>
+        <w:rPr>
+          <w:lang w:val="es"/>
+        </w:rPr>
+        <w:t xml:space="preserve"> </w:t>
+      </w:r>
+      <w:r>
+        <w:rPr>
+          <w:lang w:val="es"/>
+        </w:rPr>
+        <w:t xml:space="preserve">y servicios, diseno del CSS, traduccion de la maqueta HTML a Streamlit y</w:t>
+      </w:r>
+      <w:r>
+        <w:rPr>
+          <w:lang w:val="es"/>
+        </w:rPr>
+        <w:t xml:space="preserve"> </w:t>
+      </w:r>
+      <w:r>
+        <w:rPr>
+          <w:lang w:val="es"/>
+        </w:rPr>
+        <w:t xml:space="preserve">despliegue en Railway para validacion inicial. Redacto la seccion del tablero</w:t>
+      </w:r>
+      <w:r>
+        <w:rPr>
+          <w:lang w:val="es"/>
+        </w:rPr>
+        <w:t xml:space="preserve"> </w:t>
+      </w:r>
+      <w:r>
+        <w:rPr>
+          <w:lang w:val="es"/>
+        </w:rPr>
+        <w:t xml:space="preserve">del reporte.</w:t>
+      </w:r>
+      <w:r>
+        <w:rPr>
+          <w:lang w:val="es"/>
+        </w:rPr>
+        <w:t xml:space="preserve"> </w:t>
+      </w:r>
+      <w:r>
+        <w:rPr>
+          <w:i/>
+          <w:iCs/>
+          <w:lang w:val="es"/>
+        </w:rPr>
+        <w:t xml:space="preserve">Evidencia: rama</w:t>
+      </w:r>
+      <w:r>
+        <w:rPr>
+          <w:i/>
+          <w:iCs/>
+          <w:lang w:val="es"/>
+        </w:rPr>
+        <w:t xml:space="preserve"> </w:t>
+      </w:r>
+      <w:r>
+        <w:rPr>
+          <w:rStyle w:val="VerbatimChar"/>
+          <w:i/>
+          <w:iCs/>
+          <w:lang w:val="es"/>
+        </w:rPr>
+        <w:t xml:space="preserve">feature/infra-delivery-baseline-arq</w:t>
+      </w:r>
+      <w:r>
+        <w:rPr>
+          <w:i/>
+          <w:iCs/>
+          <w:lang w:val="es"/>
+        </w:rPr>
+        <w:t xml:space="preserve">, pull requests #3 y #10 en</w:t>
+      </w:r>
+      <w:r>
+        <w:rPr>
+          <w:i/>
+          <w:iCs/>
+          <w:lang w:val="es"/>
+        </w:rPr>
+        <w:t xml:space="preserve"> </w:t>
+      </w:r>
+      <w:r>
+        <w:rPr>
+          <w:rStyle w:val="VerbatimChar"/>
+          <w:i/>
+          <w:iCs/>
+          <w:lang w:val="es"/>
+        </w:rPr>
+        <w:t xml:space="preserve">-api</w:t>
+      </w:r>
+      <w:r>
+        <w:rPr>
+          <w:i/>
+          <w:iCs/>
+          <w:lang w:val="es"/>
+        </w:rPr>
+        <w:t xml:space="preserve"> </w:t>
+      </w:r>
+      <w:r>
+        <w:rPr>
+          <w:i/>
+          <w:iCs/>
+          <w:lang w:val="es"/>
+        </w:rPr>
+        <w:t xml:space="preserve">y pull request #1 en</w:t>
+      </w:r>
+      <w:r>
+        <w:rPr>
+          <w:i/>
+          <w:iCs/>
+          <w:lang w:val="es"/>
+        </w:rPr>
+        <w:t xml:space="preserve"> </w:t>
+      </w:r>
+      <w:r>
+        <w:rPr>
+          <w:rStyle w:val="VerbatimChar"/>
+          <w:i/>
+          <w:iCs/>
+          <w:lang w:val="es"/>
+        </w:rPr>
+        <w:t xml:space="preserve">-ui</w:t>
+      </w:r>
+      <w:r>
+        <w:rPr>
+          <w:i/>
+          <w:iCs/>
+          <w:lang w:val="es"/>
+        </w:rPr>
+        <w:t xml:space="preserve">.</w:t>
+      </w:r>
+    </w:p>
+    <w:p>
+      <w:pPr>
+        <w:pStyle w:val="BodyText"/>
+      </w:pPr>
+      <w:r>
+        <w:rPr>
+          <w:b/>
+          <w:bCs/>
+          <w:lang w:val="es"/>
+        </w:rPr>
+        <w:t xml:space="preserve">Katerine Arias</w:t>
+      </w:r>
+      <w:r>
+        <w:rPr>
+          <w:lang w:val="es"/>
+        </w:rPr>
+        <w:t xml:space="preserve"> </w:t>
+      </w:r>
+      <w:r>
+        <w:rPr>
+          <w:lang w:val="es"/>
+        </w:rPr>
+        <w:t xml:space="preserve">— Infraestructura de seguimiento de experimentos y coordinacion</w:t>
+      </w:r>
+      <w:r>
+        <w:rPr>
+          <w:lang w:val="es"/>
+        </w:rPr>
+        <w:t xml:space="preserve"> </w:t>
+      </w:r>
+      <w:r>
+        <w:rPr>
+          <w:lang w:val="es"/>
+        </w:rPr>
+        <w:t xml:space="preserve">de las entregas. Servidor de MLflow sobre AWS EC2 con autenticacion, apagado</w:t>
+      </w:r>
+      <w:r>
+        <w:rPr>
+          <w:lang w:val="es"/>
+        </w:rPr>
+        <w:t xml:space="preserve"> </w:t>
+      </w:r>
+      <w:r>
+        <w:rPr>
+          <w:lang w:val="es"/>
+        </w:rPr>
+        <w:t xml:space="preserve">automatico por inactividad y control de costo; usuarios de acceso para el equipo;</w:t>
+      </w:r>
+      <w:r>
+        <w:rPr>
+          <w:lang w:val="es"/>
+        </w:rPr>
+        <w:t xml:space="preserve"> </w:t>
+      </w:r>
+      <w:r>
+        <w:rPr>
+          <w:lang w:val="es"/>
+        </w:rPr>
+        <w:t xml:space="preserve">registro de los experimentos de regresion logistica; figuras del reporte desde</w:t>
+      </w:r>
+      <w:r>
+        <w:rPr>
+          <w:lang w:val="es"/>
+        </w:rPr>
+        <w:t xml:space="preserve"> </w:t>
+      </w:r>
+      <w:r>
+        <w:rPr>
+          <w:lang w:val="es"/>
+        </w:rPr>
+        <w:t xml:space="preserve">MLflow; separacion del repositorio en codigo y tablero. Consolidacion del reporte.</w:t>
+      </w:r>
+      <w:r>
+        <w:rPr>
+          <w:lang w:val="es"/>
+        </w:rPr>
+        <w:t xml:space="preserve"> </w:t>
+      </w:r>
+      <w:r>
+        <w:rPr>
+          <w:i/>
+          <w:iCs/>
+          <w:lang w:val="es"/>
+        </w:rPr>
+        <w:t xml:space="preserve">Evidencia: ramas</w:t>
+      </w:r>
+      <w:r>
+        <w:rPr>
+          <w:i/>
+          <w:iCs/>
+          <w:lang w:val="es"/>
+        </w:rPr>
+        <w:t xml:space="preserve"> </w:t>
+      </w:r>
+      <w:r>
+        <w:rPr>
+          <w:rStyle w:val="VerbatimChar"/>
+          <w:i/>
+          <w:iCs/>
+          <w:lang w:val="es"/>
+        </w:rPr>
+        <w:t xml:space="preserve">feature/infra-mlflow-ec2</w:t>
+      </w:r>
+      <w:r>
+        <w:rPr>
+          <w:i/>
+          <w:iCs/>
+          <w:lang w:val="es"/>
+        </w:rPr>
+        <w:t xml:space="preserve">,</w:t>
+      </w:r>
+      <w:r>
+        <w:rPr>
+          <w:i/>
+          <w:iCs/>
+          <w:lang w:val="es"/>
+        </w:rPr>
+        <w:t xml:space="preserve"> </w:t>
+      </w:r>
+      <w:r>
+        <w:rPr>
+          <w:rStyle w:val="VerbatimChar"/>
+          <w:i/>
+          <w:iCs/>
+          <w:lang w:val="es"/>
+        </w:rPr>
+        <w:t xml:space="preserve">feature/mlflow-experimentos</w:t>
+      </w:r>
+      <w:r>
+        <w:rPr>
+          <w:i/>
+          <w:iCs/>
+          <w:lang w:val="es"/>
+        </w:rPr>
+        <w:t xml:space="preserve">,</w:t>
+      </w:r>
+      <w:r>
+        <w:rPr>
+          <w:i/>
+          <w:iCs/>
+          <w:lang w:val="es"/>
+        </w:rPr>
+        <w:t xml:space="preserve"> </w:t>
+      </w:r>
+      <w:r>
+        <w:rPr>
+          <w:rStyle w:val="VerbatimChar"/>
+          <w:i/>
+          <w:iCs/>
+          <w:lang w:val="es"/>
+        </w:rPr>
+        <w:t xml:space="preserve">feature/reporte-entrega-2</w:t>
+      </w:r>
+      <w:r>
+        <w:rPr>
+          <w:i/>
+          <w:iCs/>
+          <w:lang w:val="es"/>
+        </w:rPr>
+        <w:t xml:space="preserve">, pull requests #5, #7 y #8.</w:t>
+      </w:r>
+    </w:p>
+    <w:bookmarkEnd w:id="55"/>
+    <w:bookmarkStart w:id="56" w:name="como-discutimos-los-resultados"/>
+    <w:p>
+      <w:pPr>
+        <w:pStyle w:val="Heading2"/>
+      </w:pPr>
+      <w:r>
+        <w:rPr>
+          <w:lang w:val="es"/>
+        </w:rPr>
+        <w:t xml:space="preserve">6.3 Como discutimos los resultados</w:t>
+      </w:r>
+    </w:p>
+    <w:p>
+      <w:pPr>
+        <w:pStyle w:val="FirstParagraph"/>
+      </w:pPr>
+      <w:r>
+        <w:rPr>
+          <w:lang w:val="es"/>
+        </w:rPr>
+        <w:t xml:space="preserve">Las dos familias se desarrollaron en paralelo y por separado, y llegaron de forma</w:t>
+      </w:r>
+      <w:r>
+        <w:rPr>
+          <w:lang w:val="es"/>
+        </w:rPr>
+        <w:t xml:space="preserve"> </w:t>
+      </w:r>
+      <w:r>
+        <w:rPr>
+          <w:lang w:val="es"/>
+        </w:rPr>
+        <w:t xml:space="preserve">independiente a la misma conclusion sobre el techo del ordenamiento (seccion 3).</w:t>
+      </w:r>
+      <w:r>
+        <w:rPr>
+          <w:lang w:val="es"/>
+        </w:rPr>
+        <w:t xml:space="preserve"> </w:t>
+      </w:r>
+      <w:r>
+        <w:rPr>
+          <w:lang w:val="es"/>
+        </w:rPr>
+        <w:t xml:space="preserve">Que dos personas lo encontraran por caminos distintos le da mas peso al hallazgo</w:t>
+      </w:r>
+      <w:r>
+        <w:rPr>
+          <w:lang w:val="es"/>
+        </w:rPr>
+        <w:t xml:space="preserve"> </w:t>
+      </w:r>
+      <w:r>
+        <w:rPr>
+          <w:lang w:val="es"/>
+        </w:rPr>
+        <w:t xml:space="preserve">que si fuera resultado de un solo experimento.</w:t>
+      </w:r>
+    </w:p>
+    <w:bookmarkEnd w:id="56"/>
+    <w:bookmarkEnd w:id="57"/>
     <w:sectPr>
       <w:footnotePr>
         <w:numRestart w:val="eachSect"/>

</xml_diff>

<commit_message>
docs: achica el encabezado del reporte de la Entrega 2
El titulo ocupaba un tercio de la primera pagina y las URL completas de los dos
repositorios se partian en dos lineas estiradas.

- Titulo de 26 a 18 puntos, con menos aire debajo, y autores de 12 a 10.
- Titulo y autores alineados a la izquierda; justificados abrian huecos entre
  palabras.
- Se quita "Universidad de los Andes" del subtitulo, que asi cabe en una linea.
- Las URL de los repositorios quedan como katterine2558/<repo>; los enlaces
  completos siguen en la seccion 5.

El documento sigue en 10 paginas.
</commit_message>
<xml_diff>
--- a/docs/entregas/Entrega-2-reporte.docx
+++ b/docs/entregas/Entrega-2-reporte.docx
@@ -21,7 +21,7 @@
         <w:rPr>
           <w:lang w:val="es"/>
         </w:rPr>
-        <w:t xml:space="preserve">Entrega 2 · Micro-proyecto · Desarrollo de Soluciones · MAIA, Universidad de los Andes</w:t>
+        <w:t xml:space="preserve">Entrega 2 · Micro-proyecto · Desarrollo de Soluciones · MAIA</w:t>
       </w:r>
     </w:p>
     <w:p>
@@ -43,7 +43,7 @@
         <w:rPr>
           <w:lang w:val="es"/>
         </w:rPr>
-        <w:t xml:space="preserve">Repositorios: github.com/katterine2558/maia-pds-microproyecto-api · github.com/katterine2558/maia-pds-microproyecto-ui</w:t>
+        <w:t xml:space="preserve">Repositorios: katterine2558/maia-pds-microproyecto-api · katterine2558/maia-pds-microproyecto-ui</w:t>
       </w:r>
     </w:p>
     <w:bookmarkStart w:id="13" w:name="resumen-del-problema"/>
@@ -7284,7 +7284,8 @@
       <w:pBdr>
         <w:bottom w:color="4F81BD" w:space="4" w:sz="8" w:themeColor="accent1" w:val="single"/>
       </w:pBdr>
-      <w:spacing w:after="300" w:line="240" w:lineRule="auto"/>
+      <w:spacing w:after="160" w:line="240" w:lineRule="auto"/>
+      <w:jc w:val="left"/>
       <w:contextualSpacing/>
     </w:pPr>
     <w:rPr>
@@ -7292,8 +7293,8 @@
       <w:color w:themeColor="text2" w:themeShade="BF" w:val="17365D"/>
       <w:spacing w:val="5"/>
       <w:kern w:val="28"/>
-      <w:sz w:val="52"/>
-      <w:szCs w:val="52"/>
+      <w:sz w:val="36"/>
+      <w:szCs w:val="36"/>
     </w:rPr>
   </w:style>
   <w:style w:customStyle="1" w:styleId="TitleChar" w:type="character">
@@ -7353,10 +7354,11 @@
     <w:pPr>
       <w:keepNext/>
       <w:keepLines/>
+      <w:jc w:val="left"/>
     </w:pPr>
     <w:rPr>
-      <w:sz w:val="24"/>
-      <w:szCs w:val="24"/>
+      <w:sz w:val="20"/>
+      <w:szCs w:val="20"/>
     </w:rPr>
   </w:style>
   <w:style w:styleId="Date" w:type="paragraph">

</xml_diff>

<commit_message>
docs: ajusta el resumen del problema al limite de una pagina
El enunciado acota la seccion 1 a una pagina y se estaba pasando: las tres
ultimas vinetas de 1.4 caian en la pagina 2.

Se recorto redaccion en 1.1, 1.2, 1.3 y 1.4 sin sacar ninguna cifra: se
mantienen los 101.766 encuentros originales, las 2.423 exclusiones, la base de
99.343 encuentros de 69.990 pacientes y la tasa del 11,4%, igual que el usuario,
los dos usos del prototipo y las cuatro exclusiones de alcance. Se fusionaron
las dos ultimas vinetas de 1.4, que decian lo mismo por separado.

La seccion 1 cierra ahora en la primera pagina y el documento sigue en 10.
</commit_message>
<xml_diff>
--- a/docs/entregas/Entrega-2-reporte.docx
+++ b/docs/entregas/Entrega-2-reporte.docx
@@ -78,103 +78,79 @@
         <w:rPr>
           <w:lang w:val="es"/>
         </w:rPr>
-        <w:t xml:space="preserve">El reingreso hospitalario temprano, entendido como una nueva hospitalizacion</w:t>
-      </w:r>
-      <w:r>
-        <w:rPr>
-          <w:lang w:val="es"/>
-        </w:rPr>
-        <w:t xml:space="preserve"> </w:t>
-      </w:r>
-      <w:r>
-        <w:rPr>
-          <w:lang w:val="es"/>
-        </w:rPr>
-        <w:t xml:space="preserve">dentro de los 30 dias posteriores al alta, representa una utilizacion repetida</w:t>
-      </w:r>
-      <w:r>
-        <w:rPr>
-          <w:lang w:val="es"/>
-        </w:rPr>
-        <w:t xml:space="preserve"> </w:t>
-      </w:r>
-      <w:r>
-        <w:rPr>
-          <w:lang w:val="es"/>
-        </w:rPr>
-        <w:t xml:space="preserve">de servicios en un periodo corto y una oportunidad de fortalecer el seguimiento</w:t>
-      </w:r>
-      <w:r>
-        <w:rPr>
-          <w:lang w:val="es"/>
-        </w:rPr>
-        <w:t xml:space="preserve"> </w:t>
-      </w:r>
-      <w:r>
-        <w:rPr>
-          <w:lang w:val="es"/>
-        </w:rPr>
-        <w:t xml:space="preserve">tras el egreso. Cuando la institucion dispone de capacidad limitada para</w:t>
-      </w:r>
-      <w:r>
-        <w:rPr>
-          <w:lang w:val="es"/>
-        </w:rPr>
-        <w:t xml:space="preserve"> </w:t>
-      </w:r>
-      <w:r>
-        <w:rPr>
-          <w:lang w:val="es"/>
-        </w:rPr>
-        <w:t xml:space="preserve">llamadas o controles posteriores, la priorizacion suele depender del criterio</w:t>
-      </w:r>
-      <w:r>
-        <w:rPr>
-          <w:lang w:val="es"/>
-        </w:rPr>
-        <w:t xml:space="preserve"> </w:t>
-      </w:r>
-      <w:r>
-        <w:rPr>
-          <w:lang w:val="es"/>
-        </w:rPr>
-        <w:t xml:space="preserve">clinico individual y de las condiciones operativas del alta, sin que la</w:t>
-      </w:r>
-      <w:r>
-        <w:rPr>
-          <w:lang w:val="es"/>
-        </w:rPr>
-        <w:t xml:space="preserve"> </w:t>
-      </w:r>
-      <w:r>
-        <w:rPr>
-          <w:lang w:val="es"/>
-        </w:rPr>
-        <w:t xml:space="preserve">capacidad se asigne necesariamente primero a los pacientes de mayor riesgo. El</w:t>
-      </w:r>
-      <w:r>
-        <w:rPr>
-          <w:lang w:val="es"/>
-        </w:rPr>
-        <w:t xml:space="preserve"> </w:t>
-      </w:r>
-      <w:r>
-        <w:rPr>
-          <w:lang w:val="es"/>
-        </w:rPr>
-        <w:t xml:space="preserve">prototipo aborda ese vacio: no reemplaza el criterio clinico, sino que ordena</w:t>
-      </w:r>
-      <w:r>
-        <w:rPr>
-          <w:lang w:val="es"/>
-        </w:rPr>
-        <w:t xml:space="preserve"> </w:t>
-      </w:r>
-      <w:r>
-        <w:rPr>
-          <w:lang w:val="es"/>
-        </w:rPr>
-        <w:t xml:space="preserve">la lista de egresos del dia segun una estimacion comparable de riesgo.</w:t>
+        <w:t xml:space="preserve">El reingreso hospitalario temprano, una nueva hospitalizacion dentro de los 30</w:t>
+      </w:r>
+      <w:r>
+        <w:rPr>
+          <w:lang w:val="es"/>
+        </w:rPr>
+        <w:t xml:space="preserve"> </w:t>
+      </w:r>
+      <w:r>
+        <w:rPr>
+          <w:lang w:val="es"/>
+        </w:rPr>
+        <w:t xml:space="preserve">dias posteriores al alta, marca una oportunidad de fortalecer el seguimiento tras</w:t>
+      </w:r>
+      <w:r>
+        <w:rPr>
+          <w:lang w:val="es"/>
+        </w:rPr>
+        <w:t xml:space="preserve"> </w:t>
+      </w:r>
+      <w:r>
+        <w:rPr>
+          <w:lang w:val="es"/>
+        </w:rPr>
+        <w:t xml:space="preserve">el egreso. Con capacidad limitada para llamadas o controles posteriores, la</w:t>
+      </w:r>
+      <w:r>
+        <w:rPr>
+          <w:lang w:val="es"/>
+        </w:rPr>
+        <w:t xml:space="preserve"> </w:t>
+      </w:r>
+      <w:r>
+        <w:rPr>
+          <w:lang w:val="es"/>
+        </w:rPr>
+        <w:t xml:space="preserve">priorizacion depende del criterio clinico individual y de las condiciones</w:t>
+      </w:r>
+      <w:r>
+        <w:rPr>
+          <w:lang w:val="es"/>
+        </w:rPr>
+        <w:t xml:space="preserve"> </w:t>
+      </w:r>
+      <w:r>
+        <w:rPr>
+          <w:lang w:val="es"/>
+        </w:rPr>
+        <w:t xml:space="preserve">operativas del alta, sin que se asigne primero a los pacientes de mayor riesgo.</w:t>
+      </w:r>
+      <w:r>
+        <w:rPr>
+          <w:lang w:val="es"/>
+        </w:rPr>
+        <w:t xml:space="preserve"> </w:t>
+      </w:r>
+      <w:r>
+        <w:rPr>
+          <w:lang w:val="es"/>
+        </w:rPr>
+        <w:t xml:space="preserve">El prototipo aborda ese vacio: no reemplaza el criterio clinico, ordena la lista</w:t>
+      </w:r>
+      <w:r>
+        <w:rPr>
+          <w:lang w:val="es"/>
+        </w:rPr>
+        <w:t xml:space="preserve"> </w:t>
+      </w:r>
+      <w:r>
+        <w:rPr>
+          <w:lang w:val="es"/>
+        </w:rPr>
+        <w:t xml:space="preserve">de egresos del dia segun una estimacion comparable de riesgo.</w:t>
       </w:r>
     </w:p>
     <w:bookmarkEnd w:id="9"/>
@@ -227,67 +203,43 @@
         <w:rPr>
           <w:lang w:val="es"/>
         </w:rPr>
-        <w:t xml:space="preserve">La pregunta se responde el dia del alta, antes de que el paciente salga, y</w:t>
-      </w:r>
-      <w:r>
-        <w:rPr>
-          <w:lang w:val="es"/>
-        </w:rPr>
-        <w:t xml:space="preserve"> </w:t>
-      </w:r>
-      <w:r>
-        <w:rPr>
-          <w:lang w:val="es"/>
-        </w:rPr>
-        <w:t xml:space="preserve">alimenta una decision concreta: a que pacientes se les programa control tras el</w:t>
-      </w:r>
-      <w:r>
-        <w:rPr>
-          <w:lang w:val="es"/>
-        </w:rPr>
-        <w:t xml:space="preserve"> </w:t>
-      </w:r>
-      <w:r>
-        <w:rPr>
-          <w:lang w:val="es"/>
-        </w:rPr>
-        <w:t xml:space="preserve">egreso. El usuario es el personal de enfermeria de la unidad de gestion</w:t>
-      </w:r>
-      <w:r>
-        <w:rPr>
-          <w:lang w:val="es"/>
-        </w:rPr>
-        <w:t xml:space="preserve"> </w:t>
-      </w:r>
-      <w:r>
-        <w:rPr>
-          <w:lang w:val="es"/>
-        </w:rPr>
-        <w:t xml:space="preserve">hospitalaria. El prototipo contempla dos usos complementarios: ordenar el</w:t>
-      </w:r>
-      <w:r>
-        <w:rPr>
-          <w:lang w:val="es"/>
-        </w:rPr>
-        <w:t xml:space="preserve"> </w:t>
-      </w:r>
-      <w:r>
-        <w:rPr>
-          <w:lang w:val="es"/>
-        </w:rPr>
-        <w:t xml:space="preserve">listado completo de egresos del dia segun probabilidad estimada, y consultar</w:t>
-      </w:r>
-      <w:r>
-        <w:rPr>
-          <w:lang w:val="es"/>
-        </w:rPr>
-        <w:t xml:space="preserve"> </w:t>
-      </w:r>
-      <w:r>
-        <w:rPr>
-          <w:lang w:val="es"/>
-        </w:rPr>
-        <w:t xml:space="preserve">individualmente a un paciente.</w:t>
+        <w:t xml:space="preserve">Se responde el dia del alta y alimenta una decision concreta: a que pacientes se</w:t>
+      </w:r>
+      <w:r>
+        <w:rPr>
+          <w:lang w:val="es"/>
+        </w:rPr>
+        <w:t xml:space="preserve"> </w:t>
+      </w:r>
+      <w:r>
+        <w:rPr>
+          <w:lang w:val="es"/>
+        </w:rPr>
+        <w:t xml:space="preserve">les programa control tras el egreso. El usuario es el personal de enfermeria de</w:t>
+      </w:r>
+      <w:r>
+        <w:rPr>
+          <w:lang w:val="es"/>
+        </w:rPr>
+        <w:t xml:space="preserve"> </w:t>
+      </w:r>
+      <w:r>
+        <w:rPr>
+          <w:lang w:val="es"/>
+        </w:rPr>
+        <w:t xml:space="preserve">la unidad de gestion hospitalaria. Hay dos usos: ordenar el listado de egresos</w:t>
+      </w:r>
+      <w:r>
+        <w:rPr>
+          <w:lang w:val="es"/>
+        </w:rPr>
+        <w:t xml:space="preserve"> </w:t>
+      </w:r>
+      <w:r>
+        <w:rPr>
+          <w:lang w:val="es"/>
+        </w:rPr>
+        <w:t xml:space="preserve">del dia segun probabilidad estimada, y consultar individualmente a un paciente.</w:t>
       </w:r>
     </w:p>
     <w:p>
@@ -310,31 +262,19 @@
         <w:rPr>
           <w:lang w:val="es"/>
         </w:rPr>
-        <w:t xml:space="preserve">reemplazar el criterio clinico. Tampoco hay conexion directa a un sistema de</w:t>
-      </w:r>
-      <w:r>
-        <w:rPr>
-          <w:lang w:val="es"/>
-        </w:rPr>
-        <w:t xml:space="preserve"> </w:t>
-      </w:r>
-      <w:r>
-        <w:rPr>
-          <w:lang w:val="es"/>
-        </w:rPr>
-        <w:t xml:space="preserve">informacion hospitalario: el listado de egresos se carga como archivo. La</w:t>
-      </w:r>
-      <w:r>
-        <w:rPr>
-          <w:lang w:val="es"/>
-        </w:rPr>
-        <w:t xml:space="preserve"> </w:t>
-      </w:r>
-      <w:r>
-        <w:rPr>
-          <w:lang w:val="es"/>
-        </w:rPr>
-        <w:t xml:space="preserve">variable</w:t>
+        <w:t xml:space="preserve">reemplazar el criterio clinico; tampoco hay conexion a un sistema de informacion</w:t>
+      </w:r>
+      <w:r>
+        <w:rPr>
+          <w:lang w:val="es"/>
+        </w:rPr>
+        <w:t xml:space="preserve"> </w:t>
+      </w:r>
+      <w:r>
+        <w:rPr>
+          <w:lang w:val="es"/>
+        </w:rPr>
+        <w:t xml:space="preserve">hospitalario, el listado de egresos se carga como archivo. La variable</w:t>
       </w:r>
       <w:r>
         <w:rPr>
@@ -359,55 +299,55 @@
         <w:rPr>
           <w:lang w:val="es"/>
         </w:rPr>
-        <w:t xml:space="preserve">se reserva para evaluar el desempeno entre grupos y no se usa</w:t>
-      </w:r>
-      <w:r>
-        <w:rPr>
-          <w:lang w:val="es"/>
-        </w:rPr>
-        <w:t xml:space="preserve"> </w:t>
-      </w:r>
-      <w:r>
-        <w:rPr>
-          <w:lang w:val="es"/>
-        </w:rPr>
-        <w:t xml:space="preserve">como predictora. Los registros corresponden a hospitales de Estados Unidos</w:t>
-      </w:r>
-      <w:r>
-        <w:rPr>
-          <w:lang w:val="es"/>
-        </w:rPr>
-        <w:t xml:space="preserve"> </w:t>
-      </w:r>
-      <w:r>
-        <w:rPr>
-          <w:lang w:val="es"/>
-        </w:rPr>
-        <w:t xml:space="preserve">entre 1999 y 2008, de modo que los patrones identificados no se generalizan</w:t>
-      </w:r>
-      <w:r>
-        <w:rPr>
-          <w:lang w:val="es"/>
-        </w:rPr>
-        <w:t xml:space="preserve"> </w:t>
-      </w:r>
-      <w:r>
-        <w:rPr>
-          <w:lang w:val="es"/>
-        </w:rPr>
-        <w:t xml:space="preserve">automaticamente a una poblacion hospitalaria actual: el resultado es un</w:t>
-      </w:r>
-      <w:r>
-        <w:rPr>
-          <w:lang w:val="es"/>
-        </w:rPr>
-        <w:t xml:space="preserve"> </w:t>
-      </w:r>
-      <w:r>
-        <w:rPr>
-          <w:lang w:val="es"/>
-        </w:rPr>
-        <w:t xml:space="preserve">prototipo metodologico.</w:t>
+        <w:t xml:space="preserve">se</w:t>
+      </w:r>
+      <w:r>
+        <w:rPr>
+          <w:lang w:val="es"/>
+        </w:rPr>
+        <w:t xml:space="preserve"> </w:t>
+      </w:r>
+      <w:r>
+        <w:rPr>
+          <w:lang w:val="es"/>
+        </w:rPr>
+        <w:t xml:space="preserve">reserva para evaluar el desempeno entre grupos y no se usa como predictora. Los</w:t>
+      </w:r>
+      <w:r>
+        <w:rPr>
+          <w:lang w:val="es"/>
+        </w:rPr>
+        <w:t xml:space="preserve"> </w:t>
+      </w:r>
+      <w:r>
+        <w:rPr>
+          <w:lang w:val="es"/>
+        </w:rPr>
+        <w:t xml:space="preserve">registros son de hospitales de Estados Unidos entre 1999 y 2008, de modo que los</w:t>
+      </w:r>
+      <w:r>
+        <w:rPr>
+          <w:lang w:val="es"/>
+        </w:rPr>
+        <w:t xml:space="preserve"> </w:t>
+      </w:r>
+      <w:r>
+        <w:rPr>
+          <w:lang w:val="es"/>
+        </w:rPr>
+        <w:t xml:space="preserve">patrones no se generalizan a una poblacion actual: el resultado es un prototipo</w:t>
+      </w:r>
+      <w:r>
+        <w:rPr>
+          <w:lang w:val="es"/>
+        </w:rPr>
+        <w:t xml:space="preserve"> </w:t>
+      </w:r>
+      <w:r>
+        <w:rPr>
+          <w:lang w:val="es"/>
+        </w:rPr>
+        <w:t xml:space="preserve">metodologico.</w:t>
       </w:r>
     </w:p>
     <w:bookmarkEnd w:id="10"/>
@@ -493,19 +433,7 @@
         <w:rPr>
           <w:lang w:val="es"/>
         </w:rPr>
-        <w:t xml:space="preserve">pueden reingresar, y 771 con egreso a hospicio, cuyo objetivo de cuidado es</w:t>
-      </w:r>
-      <w:r>
-        <w:rPr>
-          <w:lang w:val="es"/>
-        </w:rPr>
-        <w:t xml:space="preserve"> </w:t>
-      </w:r>
-      <w:r>
-        <w:rPr>
-          <w:lang w:val="es"/>
-        </w:rPr>
-        <w:t xml:space="preserve">distinto. La base analitica queda en</w:t>
+        <w:t xml:space="preserve">pueden reingresar, y 771 con egreso a hospicio. La base analitica queda en</w:t>
       </w:r>
       <w:r>
         <w:rPr>
@@ -557,19 +485,19 @@
         <w:rPr>
           <w:lang w:val="es"/>
         </w:rPr>
-        <w:t xml:space="preserve">. La variable objetivo es</w:t>
-      </w:r>
-      <w:r>
-        <w:rPr>
-          <w:lang w:val="es"/>
-        </w:rPr>
-        <w:t xml:space="preserve"> </w:t>
-      </w:r>
-      <w:r>
-        <w:rPr>
-          <w:lang w:val="es"/>
-        </w:rPr>
-        <w:t xml:space="preserve">binaria: positivo cuando</w:t>
+        <w:t xml:space="preserve">; la variable objetivo es positiva</w:t>
+      </w:r>
+      <w:r>
+        <w:rPr>
+          <w:lang w:val="es"/>
+        </w:rPr>
+        <w:t xml:space="preserve"> </w:t>
+      </w:r>
+      <w:r>
+        <w:rPr>
+          <w:lang w:val="es"/>
+        </w:rPr>
+        <w:t xml:space="preserve">cuando</w:t>
       </w:r>
       <w:r>
         <w:rPr>
@@ -613,19 +541,19 @@
         <w:rPr>
           <w:lang w:val="es"/>
         </w:rPr>
-        <w:t xml:space="preserve">. Los datos se versionan con DVC;</w:t>
-      </w:r>
-      <w:r>
-        <w:rPr>
-          <w:lang w:val="es"/>
-        </w:rPr>
-        <w:t xml:space="preserve"> </w:t>
-      </w:r>
-      <w:r>
-        <w:rPr>
-          <w:lang w:val="es"/>
-        </w:rPr>
-        <w:t xml:space="preserve">en Git viaja unicamente el puntero.</w:t>
+        <w:t xml:space="preserve">. Los datos se versionan con DVC, y en Git viaja</w:t>
+      </w:r>
+      <w:r>
+        <w:rPr>
+          <w:lang w:val="es"/>
+        </w:rPr>
+        <w:t xml:space="preserve"> </w:t>
+      </w:r>
+      <w:r>
+        <w:rPr>
+          <w:lang w:val="es"/>
+        </w:rPr>
+        <w:t xml:space="preserve">unicamente el puntero.</w:t>
       </w:r>
     </w:p>
     <w:bookmarkEnd w:id="11"/>
@@ -655,19 +583,13 @@
           <w:bCs/>
           <w:lang w:val="es"/>
         </w:rPr>
-        <w:t xml:space="preserve">Se separo el repositorio en dos.</w:t>
-      </w:r>
-      <w:r>
-        <w:rPr>
-          <w:lang w:val="es"/>
-        </w:rPr>
-        <w:t xml:space="preserve"> </w:t>
-      </w:r>
-      <w:r>
-        <w:rPr>
-          <w:lang w:val="es"/>
-        </w:rPr>
-        <w:t xml:space="preserve">Modelos y API en</w:t>
+        <w:t xml:space="preserve">Se separo el repositorio en dos</w:t>
+      </w:r>
+      <w:r>
+        <w:rPr>
+          <w:lang w:val="es"/>
+        </w:rPr>
+        <w:t xml:space="preserve">: modelos y API en</w:t>
       </w:r>
       <w:r>
         <w:rPr>
@@ -686,38 +608,7 @@
         <w:rPr>
           <w:lang w:val="es"/>
         </w:rPr>
-        <w:t xml:space="preserve">, tablero en el suyo; en la Entrega 1 todo estaba</w:t>
-      </w:r>
-      <w:r>
-        <w:rPr>
-          <w:lang w:val="es"/>
-        </w:rPr>
-        <w:t xml:space="preserve"> </w:t>
-      </w:r>
-      <w:r>
-        <w:rPr>
-          <w:lang w:val="es"/>
-        </w:rPr>
-        <w:t xml:space="preserve">en</w:t>
-      </w:r>
-      <w:r>
-        <w:rPr>
-          <w:lang w:val="es"/>
-        </w:rPr>
-        <w:t xml:space="preserve"> </w:t>
-      </w:r>
-      <w:r>
-        <w:rPr>
-          <w:rStyle w:val="VerbatimChar"/>
-          <w:lang w:val="es"/>
-        </w:rPr>
-        <w:t xml:space="preserve">microproyecto-desarrollo-soluciones</w:t>
-      </w:r>
-      <w:r>
-        <w:rPr>
-          <w:lang w:val="es"/>
-        </w:rPr>
-        <w:t xml:space="preserve">.</w:t>
+        <w:t xml:space="preserve">, tablero en el suyo.</w:t>
       </w:r>
     </w:p>
     <w:p>
@@ -771,89 +662,29 @@
       </w:pPr>
       <w:r>
         <w:rPr>
-          <w:lang w:val="es"/>
-        </w:rPr>
-        <w:t xml:space="preserve">El trabajo paso de la exploracion de los datos a la preparacion, entrenamiento</w:t>
-      </w:r>
-      <w:r>
-        <w:rPr>
-          <w:lang w:val="es"/>
-        </w:rPr>
-        <w:t xml:space="preserve"> </w:t>
-      </w:r>
-      <w:r>
-        <w:rPr>
-          <w:lang w:val="es"/>
-        </w:rPr>
-        <w:t xml:space="preserve">y evaluacion del modelo predictivo.</w:t>
-      </w:r>
-    </w:p>
-    <w:p>
-      <w:pPr>
-        <w:pStyle w:val="Compact"/>
-        <w:numPr>
-          <w:ilvl w:val="0"/>
-          <w:numId w:val="1001"/>
-        </w:numPr>
-      </w:pPr>
-      <w:r>
-        <w:rPr>
           <w:b/>
           <w:bCs/>
           <w:lang w:val="es"/>
         </w:rPr>
-        <w:t xml:space="preserve">La maqueta no cambio.</w:t>
-      </w:r>
-      <w:r>
-        <w:rPr>
-          <w:lang w:val="es"/>
-        </w:rPr>
-        <w:t xml:space="preserve"> </w:t>
-      </w:r>
-      <w:r>
-        <w:rPr>
-          <w:lang w:val="es"/>
-        </w:rPr>
-        <w:t xml:space="preserve">Se mantiene la version iterada en la semana 3, con</w:t>
-      </w:r>
-      <w:r>
-        <w:rPr>
-          <w:lang w:val="es"/>
-        </w:rPr>
-        <w:t xml:space="preserve"> </w:t>
-      </w:r>
-      <w:r>
-        <w:rPr>
-          <w:lang w:val="es"/>
-        </w:rPr>
-        <w:t xml:space="preserve">las bandas de riesgo ancladas en la tasa general observada.</w:t>
-      </w:r>
-    </w:p>
-    <w:p>
-      <w:pPr>
-        <w:pStyle w:val="Compact"/>
-        <w:numPr>
-          <w:ilvl w:val="0"/>
-          <w:numId w:val="1001"/>
-        </w:numPr>
-      </w:pPr>
-      <w:r>
-        <w:rPr>
-          <w:lang w:val="es"/>
-        </w:rPr>
-        <w:t xml:space="preserve">El alcance, la pregunta de negocio y los conjuntos de datos se mantienen sin</w:t>
-      </w:r>
-      <w:r>
-        <w:rPr>
-          <w:lang w:val="es"/>
-        </w:rPr>
-        <w:t xml:space="preserve"> </w:t>
-      </w:r>
-      <w:r>
-        <w:rPr>
-          <w:lang w:val="es"/>
-        </w:rPr>
-        <w:t xml:space="preserve">cambios respecto a la Entrega 1.</w:t>
+        <w:t xml:space="preserve">La maqueta no cambio</w:t>
+      </w:r>
+      <w:r>
+        <w:rPr>
+          <w:lang w:val="es"/>
+        </w:rPr>
+        <w:t xml:space="preserve">, ni el alcance, la pregunta de negocio o los conjuntos</w:t>
+      </w:r>
+      <w:r>
+        <w:rPr>
+          <w:lang w:val="es"/>
+        </w:rPr>
+        <w:t xml:space="preserve"> </w:t>
+      </w:r>
+      <w:r>
+        <w:rPr>
+          <w:lang w:val="es"/>
+        </w:rPr>
+        <w:t xml:space="preserve">de datos: el tablero se desarrolla sobre la version iterada en la semana 3.</w:t>
       </w:r>
     </w:p>
     <w:bookmarkEnd w:id="12"/>

</xml_diff>